<commit_message>
Worked on part 3 initial use cases, section 3.4
</commit_message>
<xml_diff>
--- a/P1_Template_Draft.docx
+++ b/P1_Template_Draft.docx
@@ -258,19 +258,28 @@
           </w:tcPr>
           <w:p>
             <w:r>
+              <w:rPr/>
               <w:t>Andrew Artiaga (axa220205)</w:t>
             </w:r>
             <w:r>
+              <w:rPr/>
               <w:t>, Artyom Gevorgyan (axg200155)</w:t>
             </w:r>
             <w:r>
+              <w:rPr/>
               <w:t>, Arjun Sharma (axs220320)</w:t>
             </w:r>
             <w:r>
+              <w:rPr/>
               <w:t>, Matthew Low (mjl230002)</w:t>
             </w:r>
             <w:r>
+              <w:rPr/>
               <w:t>, Ernie Hsiao (exh230014)</w:t>
+            </w:r>
+            <w:r>
+              <w:rPr/>
+              <w:t>, Param Kathiravan (pxk230069)</w:t>
             </w:r>
           </w:p>
         </w:tc>
@@ -1541,10 +1550,28 @@
           </w:tcPr>
           <w:p>
             <w:r>
-              <w:t xml:space="preserve">Worked on part 1 introduction, section 3.1, </w:t>
-            </w:r>
-            <w:r>
-              <w:t>section 4.1, section 5</w:t>
+              <w:rPr/>
+              <w:t xml:space="preserve">Worked on part 1 introduction, </w:t>
+            </w:r>
+            <w:r>
+              <w:rPr/>
+              <w:t xml:space="preserve">section 2.6, </w:t>
+            </w:r>
+            <w:r>
+              <w:rPr/>
+              <w:t xml:space="preserve">section 3.1, </w:t>
+            </w:r>
+            <w:r>
+              <w:rPr/>
+              <w:t>section 4.1</w:t>
+            </w:r>
+            <w:r>
+              <w:rPr/>
+              <w:t>, section 4.2</w:t>
+            </w:r>
+            <w:r>
+              <w:rPr/>
+              <w:t>, section 5</w:t>
             </w:r>
           </w:p>
         </w:tc>
@@ -1558,6 +1585,34 @@
               <w:right w:w="100" w:type="dxa"/>
             </w:tcMar>
           </w:tcPr>
+          <w:p>
+            <w:hyperlink r:id="Rfbd16b72d65d458d">
+              <w:r>
+                <w:rPr>
+                  <w:rStyle w:val="Hyperlink"/>
+                </w:rPr>
+                <w:t>Part 1 Intro, Section 3.1, Section 4.1</w:t>
+              </w:r>
+              <w:r>
+                <w:rPr>
+                  <w:rStyle w:val="Hyperlink"/>
+                </w:rPr>
+                <w:t>, Section 4.2</w:t>
+              </w:r>
+              <w:r>
+                <w:rPr>
+                  <w:rStyle w:val="Hyperlink"/>
+                </w:rPr>
+                <w:t>, Section 2.6</w:t>
+              </w:r>
+              <w:r>
+                <w:rPr>
+                  <w:rStyle w:val="Hyperlink"/>
+                </w:rPr>
+                <w:t>, Section 5,</w:t>
+              </w:r>
+            </w:hyperlink>
+          </w:p>
           <w:p/>
         </w:tc>
       </w:tr>
@@ -1749,60 +1804,95 @@
           </w:tcPr>
           <w:p>
             <w:r>
+              <w:rPr>
+                <w:lang w:val="en-US"/>
+              </w:rPr>
+              <w:t xml:space="preserve">Worked on part 3 quality requirements, section </w:t>
+            </w:r>
+            <w:r>
+              <w:rPr>
+                <w:lang w:val="en-US"/>
+              </w:rPr>
+              <w:t>3.3</w:t>
+            </w:r>
+            <w:r>
+              <w:rPr>
+                <w:lang w:val="en-US"/>
+              </w:rPr>
+              <w:t xml:space="preserve"> and part 4 risks, section 4.3</w:t>
+            </w:r>
+          </w:p>
+        </w:tc>
+        <w:tc>
+          <w:tcPr>
+            <w:tcW w:w="3658" w:type="dxa"/>
+            <w:tcMar>
+              <w:top w:w="70" w:type="dxa"/>
+              <w:left w:w="100" w:type="dxa"/>
+              <w:bottom w:w="70" w:type="dxa"/>
+              <w:right w:w="100" w:type="dxa"/>
+            </w:tcMar>
+          </w:tcPr>
+          <w:p>
+            <w:pPr>
+              <w:pStyle w:val="Normal"/>
+              <w:rPr>
+                <w:rFonts w:ascii="Calibri" w:hAnsi="Calibri" w:eastAsia="Calibri" w:cs="Calibri"/>
+                <w:noProof w:val="0"/>
+                <w:sz w:val="21"/>
+                <w:szCs w:val="21"/>
+                <w:lang w:val="en-US"/>
+              </w:rPr>
+            </w:pPr>
+            <w:hyperlink r:id="Rf9660196393247cf">
+              <w:r>
+                <w:rPr>
+                  <w:rStyle w:val="Hyperlink"/>
+                  <w:rFonts w:ascii="Calibri" w:hAnsi="Calibri" w:eastAsia="Calibri" w:cs="Calibri"/>
+                  <w:noProof w:val="0"/>
+                  <w:sz w:val="21"/>
+                  <w:szCs w:val="21"/>
+                  <w:lang w:val="en-US"/>
+                </w:rPr>
+                <w:t>Section 3.3, Section 4.3</w:t>
+              </w:r>
+            </w:hyperlink>
+          </w:p>
+        </w:tc>
+      </w:tr>
+      <w:tr>
+        <w:tc>
+          <w:tcPr>
+            <w:tcW w:w="2800" w:type="dxa"/>
+            <w:tcMar>
+              <w:top w:w="70" w:type="dxa"/>
+              <w:left w:w="100" w:type="dxa"/>
+              <w:bottom w:w="70" w:type="dxa"/>
+              <w:right w:w="100" w:type="dxa"/>
+            </w:tcMar>
+          </w:tcPr>
+          <w:p>
+            <w:r>
+              <w:t>Ernie Hsiao</w:t>
+            </w:r>
+          </w:p>
+        </w:tc>
+        <w:tc>
+          <w:tcPr>
+            <w:tcW w:w="4400" w:type="dxa"/>
+            <w:tcMar>
+              <w:top w:w="70" w:type="dxa"/>
+              <w:left w:w="100" w:type="dxa"/>
+              <w:bottom w:w="70" w:type="dxa"/>
+              <w:right w:w="100" w:type="dxa"/>
+            </w:tcMar>
+          </w:tcPr>
+          <w:p>
+            <w:r>
               <w:rPr/>
-              <w:t xml:space="preserve">Worked on part 3 quality requirements, section </w:t>
-            </w:r>
-            <w:r>
-              <w:rPr/>
-              <w:t>3.3</w:t>
-            </w:r>
-            <w:r>
-              <w:rPr/>
-              <w:t xml:space="preserve"> and part 4 risks, section 4.3</w:t>
-            </w:r>
-          </w:p>
-        </w:tc>
-        <w:tc>
-          <w:tcPr>
-            <w:tcW w:w="3658" w:type="dxa"/>
-            <w:tcMar>
-              <w:top w:w="70" w:type="dxa"/>
-              <w:left w:w="100" w:type="dxa"/>
-              <w:bottom w:w="70" w:type="dxa"/>
-              <w:right w:w="100" w:type="dxa"/>
-            </w:tcMar>
-          </w:tcPr>
-          <w:p/>
-        </w:tc>
-      </w:tr>
-      <w:tr>
-        <w:tc>
-          <w:tcPr>
-            <w:tcW w:w="2800" w:type="dxa"/>
-            <w:tcMar>
-              <w:top w:w="70" w:type="dxa"/>
-              <w:left w:w="100" w:type="dxa"/>
-              <w:bottom w:w="70" w:type="dxa"/>
-              <w:right w:w="100" w:type="dxa"/>
-            </w:tcMar>
-          </w:tcPr>
-          <w:p>
-            <w:r>
-              <w:t>Ernie Hsiao</w:t>
-            </w:r>
-          </w:p>
-        </w:tc>
-        <w:tc>
-          <w:tcPr>
-            <w:tcW w:w="4400" w:type="dxa"/>
-            <w:tcMar>
-              <w:top w:w="70" w:type="dxa"/>
-              <w:left w:w="100" w:type="dxa"/>
-              <w:bottom w:w="70" w:type="dxa"/>
-              <w:right w:w="100" w:type="dxa"/>
-            </w:tcMar>
-          </w:tcPr>
-          <w:p/>
+              <w:t>Worked on part 2.2 - 2.5</w:t>
+            </w:r>
+          </w:p>
         </w:tc>
         <w:tc>
           <w:tcPr>
@@ -1862,20 +1952,24 @@
             </w:pPr>
             <w:r>
               <w:rPr>
-                <w:b/>
+                <w:b w:val="1"/>
+                <w:bCs w:val="1"/>
                 <w:color w:val="2F5D8A"/>
                 <w:sz w:val="19"/>
                 <w:szCs w:val="19"/>
+                <w:lang w:val="en-US"/>
               </w:rPr>
               <w:t xml:space="preserve">▸  </w:t>
             </w:r>
             <w:r>
               <w:rPr>
-                <w:b/>
-                <w:caps/>
+                <w:b w:val="1"/>
+                <w:bCs w:val="1"/>
+                <w:caps w:val="1"/>
                 <w:color w:val="2F5D8A"/>
                 <w:sz w:val="17"/>
                 <w:szCs w:val="17"/>
+                <w:lang w:val="en-US"/>
               </w:rPr>
               <w:t>WHAT GOES HERE</w:t>
             </w:r>
@@ -2795,24 +2889,28 @@
     </w:p>
     <w:p>
       <w:pPr>
-        <w:keepNext/>
+        <w:keepNext w:val="1"/>
         <w:spacing w:before="200" w:after="70" w:line="260" w:lineRule="auto"/>
       </w:pPr>
       <w:r>
         <w:rPr>
-          <w:b/>
+          <w:b w:val="1"/>
+          <w:bCs w:val="1"/>
           <w:color w:val="2F5D8A"/>
           <w:sz w:val="22"/>
           <w:szCs w:val="22"/>
+          <w:lang w:val="en-US"/>
         </w:rPr>
         <w:t xml:space="preserve">1.3   </w:t>
       </w:r>
       <w:r>
         <w:rPr>
-          <w:b/>
+          <w:b w:val="1"/>
+          <w:bCs w:val="1"/>
           <w:color w:val="16324F"/>
           <w:sz w:val="22"/>
           <w:szCs w:val="22"/>
+          <w:lang w:val="en-US"/>
         </w:rPr>
         <w:t>Definitions, acronyms and abbreviations</w:t>
       </w:r>
@@ -2856,20 +2954,24 @@
             </w:pPr>
             <w:r>
               <w:rPr>
-                <w:b/>
+                <w:b w:val="1"/>
+                <w:bCs w:val="1"/>
                 <w:color w:val="2F5D8A"/>
                 <w:sz w:val="19"/>
                 <w:szCs w:val="19"/>
+                <w:lang w:val="en-US"/>
               </w:rPr>
               <w:t xml:space="preserve">▸  </w:t>
             </w:r>
             <w:r>
               <w:rPr>
-                <w:b/>
-                <w:caps/>
+                <w:b w:val="1"/>
+                <w:bCs w:val="1"/>
+                <w:caps w:val="1"/>
                 <w:color w:val="2F5D8A"/>
                 <w:sz w:val="17"/>
                 <w:szCs w:val="17"/>
+                <w:lang w:val="en-US"/>
               </w:rPr>
               <w:t>WHAT GOES HERE</w:t>
             </w:r>
@@ -3328,12 +3430,14 @@
               <w:spacing w:after="60" w:line="260" w:lineRule="auto"/>
             </w:pPr>
             <w:r>
+              <w:rPr/>
               <w:t xml:space="preserve">[R2] </w:t>
             </w:r>
             <w:r>
+              <w:rPr/>
               <w:t xml:space="preserve">UTD library policies; </w:t>
             </w:r>
-            <w:hyperlink r:id="rId12">
+            <w:hyperlink r:id="Rb2eb2f7a119f4ae9">
               <w:r>
                 <w:rPr>
                   <w:rStyle w:val="Hyperlink"/>
@@ -3342,6 +3446,7 @@
               </w:r>
             </w:hyperlink>
             <w:r>
+              <w:rPr/>
               <w:t xml:space="preserve"> </w:t>
             </w:r>
           </w:p>
@@ -3350,12 +3455,14 @@
               <w:spacing w:after="60" w:line="260" w:lineRule="auto"/>
             </w:pPr>
             <w:r>
+              <w:rPr/>
               <w:t>[R3] UTD policies on information security or privacy</w:t>
             </w:r>
             <w:r>
+              <w:rPr/>
               <w:t xml:space="preserve">; </w:t>
             </w:r>
-            <w:hyperlink r:id="rId13">
+            <w:hyperlink r:id="R8567806dee544f90">
               <w:r>
                 <w:rPr>
                   <w:rStyle w:val="Hyperlink"/>
@@ -3364,6 +3471,7 @@
               </w:r>
             </w:hyperlink>
             <w:r>
+              <w:rPr/>
               <w:t xml:space="preserve"> </w:t>
             </w:r>
           </w:p>
@@ -3587,46 +3695,19 @@
               <w:right w:w="140" w:type="dxa"/>
             </w:tcMar>
           </w:tcPr>
-          <w:p>
+          <w:p w14:noSpellErr="1">
             <w:pPr>
               <w:spacing w:after="60" w:line="260" w:lineRule="auto"/>
             </w:pPr>
             <w:r>
               <w:rPr>
-                <w:i/>
-                <w:iCs/>
+                <w:i w:val="1"/>
+                <w:iCs w:val="1"/>
                 <w:color w:val="9AA3AE"/>
                 <w:sz w:val="19"/>
                 <w:szCs w:val="19"/>
               </w:rPr>
               <w:t>Paste the context diagram here, then explain in one paragraph why the boundary sits where it does.</w:t>
-            </w:r>
-          </w:p>
-          <w:p>
-            <w:pPr>
-              <w:spacing w:after="60" w:line="260" w:lineRule="auto"/>
-            </w:pPr>
-            <w:r>
-              <w:t>System: UTD Study Room Reservation Scheduler</w:t>
-            </w:r>
-          </w:p>
-          <w:p>
-            <w:pPr>
-              <w:spacing w:after="60" w:line="260" w:lineRule="auto"/>
-            </w:pPr>
-            <w:r>
-              <w:t>External Systems:</w:t>
-            </w:r>
-            <w:r>
-              <w:t xml:space="preserve"> UTD</w:t>
-            </w:r>
-          </w:p>
-          <w:p>
-            <w:pPr>
-              <w:spacing w:after="60" w:line="260" w:lineRule="auto"/>
-            </w:pPr>
-            <w:r>
-              <w:t>External Actors: Students, UTD staff</w:t>
             </w:r>
           </w:p>
           <w:p>
@@ -7272,20 +7353,24 @@
             </w:pPr>
             <w:r>
               <w:rPr>
-                <w:b/>
+                <w:b w:val="1"/>
+                <w:bCs w:val="1"/>
                 <w:color w:val="2F5D8A"/>
                 <w:sz w:val="19"/>
                 <w:szCs w:val="19"/>
+                <w:lang w:val="en-US"/>
               </w:rPr>
               <w:t xml:space="preserve">▸  </w:t>
             </w:r>
             <w:r>
               <w:rPr>
-                <w:b/>
-                <w:caps/>
+                <w:b w:val="1"/>
+                <w:bCs w:val="1"/>
+                <w:caps w:val="1"/>
                 <w:color w:val="2F5D8A"/>
                 <w:sz w:val="17"/>
                 <w:szCs w:val="17"/>
+                <w:lang w:val="en-US"/>
               </w:rPr>
               <w:t>WHAT GOES HERE</w:t>
             </w:r>
@@ -7296,10 +7381,12 @@
             </w:pPr>
             <w:r>
               <w:rPr>
-                <w:b/>
+                <w:b w:val="1"/>
+                <w:bCs w:val="1"/>
                 <w:color w:val="39424E"/>
                 <w:sz w:val="19"/>
                 <w:szCs w:val="19"/>
+                <w:lang w:val="en-US"/>
               </w:rPr>
               <w:t xml:space="preserve">A quality requirement says how well, not what. </w:t>
             </w:r>
@@ -7308,6 +7395,7 @@
                 <w:color w:val="39424E"/>
                 <w:sz w:val="19"/>
                 <w:szCs w:val="19"/>
+                <w:lang w:val="en-US"/>
               </w:rPr>
               <w:t>Performance, availability, usability, accessibility, security, maintainability.</w:t>
             </w:r>
@@ -7341,20 +7429,25 @@
             </w:pPr>
             <w:r>
               <w:rPr>
-                <w:b/>
-                <w:i/>
+                <w:b w:val="1"/>
+                <w:bCs w:val="1"/>
+                <w:i w:val="1"/>
+                <w:iCs w:val="1"/>
                 <w:color w:val="39424E"/>
                 <w:sz w:val="19"/>
                 <w:szCs w:val="19"/>
+                <w:lang w:val="en-US"/>
               </w:rPr>
               <w:t xml:space="preserve">Worked example: </w:t>
             </w:r>
             <w:r>
               <w:rPr>
-                <w:i/>
+                <w:i w:val="1"/>
+                <w:iCs w:val="1"/>
                 <w:color w:val="39424E"/>
                 <w:sz w:val="19"/>
                 <w:szCs w:val="19"/>
+                <w:lang w:val="en-US"/>
               </w:rPr>
               <w:t>“QR-01  Ninety-five percent of searches shall return results within 2 seconds, measured over one working week under normal load of up to 50 concurrent users.”</w:t>
             </w:r>
@@ -7440,10 +7533,12 @@
             </w:pPr>
             <w:r>
               <w:rPr>
-                <w:b/>
+                <w:b w:val="1"/>
+                <w:bCs w:val="1"/>
                 <w:color w:val="16324F"/>
                 <w:sz w:val="18"/>
                 <w:szCs w:val="18"/>
+                <w:lang w:val="en-US"/>
               </w:rPr>
               <w:t>Requirement — with threshold, condition and method</w:t>
             </w:r>
@@ -8510,16 +8605,64 @@
             <w:pPr>
               <w:spacing w:after="60" w:line="260" w:lineRule="auto"/>
             </w:pPr>
+            <w:r>
+              <w:rPr/>
+              <w:t>Actors: Student and Library staff (administrator); supporting actor: UTD email service. System boundary as in 2.1.</w:t>
+            </w:r>
           </w:p>
           <w:p>
             <w:pPr>
               <w:spacing w:after="60" w:line="260" w:lineRule="auto"/>
             </w:pPr>
+            <w:r>
+              <w:rPr/>
+              <w:t>UC-01 Search for Available Rooms</w:t>
+            </w:r>
           </w:p>
           <w:p>
             <w:pPr>
               <w:spacing w:after="60" w:line="260" w:lineRule="auto"/>
             </w:pPr>
+            <w:r>
+              <w:rPr/>
+              <w:t>UC-02 Reserve a Study Room</w:t>
+            </w:r>
+          </w:p>
+          <w:p>
+            <w:pPr>
+              <w:spacing w:after="60" w:line="260" w:lineRule="auto"/>
+            </w:pPr>
+            <w:r>
+              <w:rPr/>
+              <w:t>UC-03 Cancel a Reservation</w:t>
+            </w:r>
+          </w:p>
+          <w:p>
+            <w:pPr>
+              <w:spacing w:after="60" w:line="260" w:lineRule="auto"/>
+            </w:pPr>
+            <w:r>
+              <w:rPr/>
+              <w:t>UC-04 View My Reservations</w:t>
+            </w:r>
+          </w:p>
+          <w:p>
+            <w:pPr>
+              <w:spacing w:after="60" w:line="260" w:lineRule="auto"/>
+            </w:pPr>
+            <w:r>
+              <w:rPr/>
+              <w:t>UC-05 Manage Room Listings</w:t>
+            </w:r>
+          </w:p>
+          <w:p>
+            <w:pPr>
+              <w:spacing w:after="60" w:line="260" w:lineRule="auto"/>
+            </w:pPr>
+            <w:r>
+              <w:rPr/>
+              <w:t>Signing in is a precondition of UC-02 to UC-05, not a use case on its own: it is a step toward a goal, not a goal.</w:t>
+            </w:r>
           </w:p>
         </w:tc>
       </w:tr>
@@ -8663,7 +8806,23 @@
                 <w:sz w:val="18"/>
                 <w:szCs w:val="18"/>
               </w:rPr>
-              <w:t xml:space="preserve">UC-01  </w:t>
+              <w:t>UC-0</w:t>
+            </w:r>
+            <w:r>
+              <w:rPr>
+                <w:color w:val="1A1A1A"/>
+                <w:sz w:val="18"/>
+                <w:szCs w:val="18"/>
+              </w:rPr>
+              <w:t>2</w:t>
+            </w:r>
+            <w:r>
+              <w:rPr>
+                <w:color w:val="1A1A1A"/>
+                <w:sz w:val="18"/>
+                <w:szCs w:val="18"/>
+              </w:rPr>
+              <w:t xml:space="preserve"> </w:t>
             </w:r>
           </w:p>
         </w:tc>
@@ -10251,7 +10410,12 @@
               <w:right w:w="100" w:type="dxa"/>
             </w:tcMar>
           </w:tcPr>
-          <w:p/>
+          <w:p>
+            <w:r>
+              <w:rPr/>
+              <w:t>Matthew Low</w:t>
+            </w:r>
+          </w:p>
         </w:tc>
       </w:tr>
       <w:tr>
@@ -13254,6 +13418,7 @@
                 <w:color w:val="1A1A1A"/>
                 <w:sz w:val="18"/>
                 <w:szCs w:val="18"/>
+                <w:lang w:val="en-US"/>
               </w:rPr>
               <w:t>Every requirement is one testable “shall” sentence with an identifier, a priority, a source and an acceptance criterion. Quality requirements carry a threshold, a condition and a method. Constraints are distinguished from quality requirements.</w:t>
             </w:r>

</xml_diff>

<commit_message>
Worked on part 2.2 - 2.5
</commit_message>
<xml_diff>
--- a/P1_Template_Draft.docx
+++ b/P1_Template_Draft.docx
@@ -8,13 +8,62 @@
       </w:pPr>
       <w:r>
         <w:rPr>
-          <w:b/>
-          <w:caps/>
+          <w:b w:val="1"/>
+          <w:bCs w:val="1"/>
+          <w:caps w:val="1"/>
           <w:color w:val="2F5D8A"/>
           <w:sz w:val="18"/>
           <w:szCs w:val="18"/>
         </w:rPr>
-        <w:t>CE / CS / SE 3354  ·  SOFTWARE ENGINEERING  ·  FALL 2026</w:t>
+        <w:t xml:space="preserve">CE / CS / SE </w:t>
+      </w:r>
+      <w:bookmarkStart w:name="_Int_Axartesy" w:id="1702168406"/>
+      <w:r>
+        <w:rPr>
+          <w:b w:val="1"/>
+          <w:bCs w:val="1"/>
+          <w:caps w:val="1"/>
+          <w:color w:val="2F5D8A"/>
+          <w:sz w:val="18"/>
+          <w:szCs w:val="18"/>
+        </w:rPr>
+        <w:t>3354  ·</w:t>
+      </w:r>
+      <w:bookmarkEnd w:id="1702168406"/>
+      <w:r>
+        <w:rPr>
+          <w:b w:val="1"/>
+          <w:bCs w:val="1"/>
+          <w:caps w:val="1"/>
+          <w:color w:val="2F5D8A"/>
+          <w:sz w:val="18"/>
+          <w:szCs w:val="18"/>
+        </w:rPr>
+        <w:t xml:space="preserve">  SOFTWARE </w:t>
+      </w:r>
+      <w:bookmarkStart w:name="_Int_T76e7iOF" w:id="2111217246"/>
+      <w:r>
+        <w:rPr>
+          <w:b w:val="1"/>
+          <w:bCs w:val="1"/>
+          <w:caps w:val="1"/>
+          <w:color w:val="2F5D8A"/>
+          <w:sz w:val="18"/>
+          <w:szCs w:val="18"/>
+        </w:rPr>
+        <w:t>ENGINEERING  ·</w:t>
+      </w:r>
+      <w:bookmarkEnd w:id="2111217246"/>
+      <w:r>
+        <w:rPr>
+          <w:b w:val="1"/>
+          <w:bCs w:val="1"/>
+          <w:caps w:val="1"/>
+          <w:color w:val="2F5D8A"/>
+          <w:sz w:val="18"/>
+          <w:szCs w:val="18"/>
+        </w:rPr>
+        <w:t xml:space="preserve">  FALL 2026</w:t>
       </w:r>
     </w:p>
     <w:p>
@@ -59,7 +108,43 @@
           <w:sz w:val="19"/>
           <w:szCs w:val="19"/>
         </w:rPr>
-        <w:t>Weight 4%  ·  Due Sunday 18 October 2026, 11:59 PM Central  ·  Submit one PDF per team on Canvas</w:t>
+        <w:t>Weight 4</w:t>
+      </w:r>
+      <w:bookmarkStart w:name="_Int_c6I3QWNn" w:id="1329859779"/>
+      <w:r>
+        <w:rPr>
+          <w:color w:val="5A6472"/>
+          <w:sz w:val="19"/>
+          <w:szCs w:val="19"/>
+        </w:rPr>
+        <w:t>%  ·</w:t>
+      </w:r>
+      <w:bookmarkEnd w:id="1329859779"/>
+      <w:r>
+        <w:rPr>
+          <w:color w:val="5A6472"/>
+          <w:sz w:val="19"/>
+          <w:szCs w:val="19"/>
+        </w:rPr>
+        <w:t xml:space="preserve">  Due Sunday 18 October 2026, 11:59 PM </w:t>
+      </w:r>
+      <w:bookmarkStart w:name="_Int_2UYOr9VY" w:id="1463184918"/>
+      <w:r>
+        <w:rPr>
+          <w:color w:val="5A6472"/>
+          <w:sz w:val="19"/>
+          <w:szCs w:val="19"/>
+        </w:rPr>
+        <w:t>Central  ·</w:t>
+      </w:r>
+      <w:bookmarkEnd w:id="1463184918"/>
+      <w:r>
+        <w:rPr>
+          <w:color w:val="5A6472"/>
+          <w:sz w:val="19"/>
+          <w:szCs w:val="19"/>
+        </w:rPr>
+        <w:t xml:space="preserve">  Submit one PDF per team on Canvas</w:t>
       </w:r>
     </w:p>
     <w:tbl>
@@ -1586,7 +1671,7 @@
             </w:tcMar>
           </w:tcPr>
           <w:p>
-            <w:hyperlink r:id="R1d6960a15c2b4c0b">
+            <w:hyperlink r:id="Rbfbf750776fc4abb">
               <w:r>
                 <w:rPr>
                   <w:rStyle w:val="Hyperlink"/>
@@ -1869,14 +1954,22 @@
               <w:rPr>
                 <w:lang w:val="en-US"/>
               </w:rPr>
-              <w:t xml:space="preserve"> and part 4 risks</w:t>
-            </w:r>
+              <w:t xml:space="preserve"> and part 4 </w:t>
+            </w:r>
+            <w:bookmarkStart w:name="_Int_RBbyUlMr" w:id="793199219"/>
             <w:r>
               <w:rPr>
                 <w:lang w:val="en-US"/>
               </w:rPr>
+              <w:t>risks</w:t>
+            </w:r>
+            <w:r>
+              <w:rPr>
+                <w:lang w:val="en-US"/>
+              </w:rPr>
               <w:t>(</w:t>
             </w:r>
+            <w:bookmarkEnd w:id="793199219"/>
             <w:r>
               <w:rPr>
                 <w:lang w:val="en-US"/>
@@ -1904,8 +1997,15 @@
           <w:p>
             <w:pPr>
               <w:pStyle w:val="Normal"/>
-            </w:pPr>
-            <w:hyperlink r:id="R339aed38e0d3449a">
+              <w:rPr>
+                <w:rFonts w:ascii="Calibri" w:hAnsi="Calibri" w:eastAsia="Calibri" w:cs="Calibri"/>
+                <w:noProof w:val="0"/>
+                <w:sz w:val="21"/>
+                <w:szCs w:val="21"/>
+                <w:lang w:val="en-US"/>
+              </w:rPr>
+            </w:pPr>
+            <w:hyperlink r:id="Rd7fdc764b5e742f5">
               <w:r>
                 <w:rPr>
                   <w:rStyle w:val="Hyperlink"/>
@@ -1928,6 +2028,19 @@
               </w:rPr>
               <w:t xml:space="preserve"> </w:t>
             </w:r>
+            <w:hyperlink r:id="R84c2f11578cc4ac7">
+              <w:r>
+                <w:rPr>
+                  <w:rStyle w:val="Hyperlink"/>
+                  <w:rFonts w:ascii="Calibri" w:hAnsi="Calibri" w:eastAsia="Calibri" w:cs="Calibri"/>
+                  <w:noProof w:val="0"/>
+                  <w:sz w:val="21"/>
+                  <w:szCs w:val="21"/>
+                  <w:lang w:val="en-US"/>
+                </w:rPr>
+                <w:t>Section 3.4</w:t>
+              </w:r>
+            </w:hyperlink>
           </w:p>
         </w:tc>
       </w:tr>
@@ -3508,7 +3621,7 @@
               <w:rPr/>
               <w:t xml:space="preserve">UTD library policies; </w:t>
             </w:r>
-            <w:hyperlink r:id="R99dba004f5534c3b">
+            <w:hyperlink r:id="R4f19ecb6f0bb47c1">
               <w:r>
                 <w:rPr>
                   <w:rStyle w:val="Hyperlink"/>
@@ -3533,7 +3646,7 @@
               <w:rPr/>
               <w:t xml:space="preserve">; </w:t>
             </w:r>
-            <w:hyperlink r:id="Reafb96844f6a483b">
+            <w:hyperlink r:id="Rc7888aa67072487d">
               <w:r>
                 <w:rPr>
                   <w:rStyle w:val="Hyperlink"/>
@@ -5589,30 +5702,49 @@
               <w:spacing w:line="259" w:lineRule="auto"/>
             </w:pPr>
             <w:r>
+              <w:rPr/>
               <w:t>The functions that the project needs involve room listings, time-slot searches, reservation records, and conflict checks.</w:t>
             </w:r>
             <w:r>
+              <w:rPr/>
               <w:t xml:space="preserve"> </w:t>
             </w:r>
             <w:r>
+              <w:rPr/>
               <w:t>To</w:t>
             </w:r>
             <w:r>
+              <w:rPr/>
               <w:t xml:space="preserve"> </w:t>
             </w:r>
             <w:r>
+              <w:rPr/>
               <w:t>tell</w:t>
             </w:r>
             <w:r>
-              <w:t xml:space="preserve"> if this is technically feasible we will need to include a working proof of concept, repository code, and tes</w:t>
-            </w:r>
-            <w:r>
+              <w:rPr/>
+              <w:t xml:space="preserve"> if this is technically </w:t>
+            </w:r>
+            <w:bookmarkStart w:name="_Int_lHgOSgfR" w:id="1935690893"/>
+            <w:r>
+              <w:rPr/>
+              <w:t>feasible</w:t>
+            </w:r>
+            <w:bookmarkEnd w:id="1935690893"/>
+            <w:r>
+              <w:rPr/>
+              <w:t xml:space="preserve"> we will need to include a working proof of concept, repository code, and tes</w:t>
+            </w:r>
+            <w:r>
+              <w:rPr/>
               <w:t xml:space="preserve">ts to check if the </w:t>
             </w:r>
             <w:r>
+              <w:rPr/>
               <w:t>requirements</w:t>
             </w:r>
             <w:r>
+              <w:rPr/>
               <w:t xml:space="preserve"> can be met. Until then this will remain potentially feasible</w:t>
             </w:r>
           </w:p>
@@ -5671,24 +5803,41 @@
               <w:spacing w:line="259" w:lineRule="auto"/>
             </w:pPr>
             <w:r>
+              <w:rPr/>
               <w:t>Students can</w:t>
             </w:r>
             <w:r>
+              <w:rPr/>
               <w:t xml:space="preserve"> make reservations </w:t>
             </w:r>
             <w:r>
-              <w:t xml:space="preserve">for available study rooms and the system will deal with conflicting reservations and if </w:t>
-            </w:r>
-            <w:r>
+              <w:rPr/>
+              <w:t xml:space="preserve">for available study </w:t>
+            </w:r>
+            <w:bookmarkStart w:name="_Int_DEpH0W8Z" w:id="207297882"/>
+            <w:r>
+              <w:rPr/>
+              <w:t>rooms</w:t>
+            </w:r>
+            <w:bookmarkEnd w:id="207297882"/>
+            <w:r>
+              <w:rPr/>
+              <w:t xml:space="preserve"> and the system will deal with conflicting reservations and if </w:t>
+            </w:r>
+            <w:r>
+              <w:rPr/>
               <w:t>needed,</w:t>
             </w:r>
             <w:r>
+              <w:rPr/>
               <w:t xml:space="preserve"> the staff can manage the </w:t>
             </w:r>
             <w:r>
+              <w:rPr/>
               <w:t>reservations as well.</w:t>
             </w:r>
             <w:r>
+              <w:rPr/>
               <w:t xml:space="preserve"> The team still needs to test the workflow with students and staff in the library</w:t>
             </w:r>
           </w:p>
@@ -8750,12 +8899,27 @@
           </w:p>
           <w:p>
             <w:pPr>
+              <w:pStyle w:val="Normal"/>
               <w:spacing w:after="60" w:line="260" w:lineRule="auto"/>
             </w:pPr>
             <w:r>
               <w:rPr/>
               <w:t>UC-04 View My Reservations</w:t>
             </w:r>
+            <w:r>
+              <w:rPr>
+                <w:rFonts w:ascii="Calibri" w:hAnsi="Calibri" w:eastAsia="Calibri" w:cs="Calibri"/>
+                <w:b w:val="0"/>
+                <w:bCs w:val="0"/>
+                <w:i w:val="0"/>
+                <w:iCs w:val="0"/>
+                <w:noProof w:val="0"/>
+                <w:sz w:val="21"/>
+                <w:szCs w:val="21"/>
+                <w:lang w:val="en-US"/>
+              </w:rPr>
+              <w:t xml:space="preserve"> and Status</w:t>
+            </w:r>
           </w:p>
           <w:p>
             <w:pPr>
@@ -8765,6 +8929,11 @@
               <w:rPr/>
               <w:t>UC-05 Manage Room Listings</w:t>
             </w:r>
+          </w:p>
+          <w:p>
+            <w:pPr>
+              <w:spacing w:after="60" w:line="260" w:lineRule="auto"/>
+            </w:pPr>
           </w:p>
           <w:p>
             <w:pPr>
@@ -9439,12 +9608,33 @@
             </w:pPr>
             <w:r>
               <w:rPr>
-                <w:b/>
+                <w:b w:val="1"/>
+                <w:bCs w:val="1"/>
                 <w:color w:val="16324F"/>
                 <w:sz w:val="18"/>
                 <w:szCs w:val="18"/>
               </w:rPr>
-              <w:t>Use case(s) that realise it</w:t>
+              <w:t xml:space="preserve">Use case(s) that </w:t>
+            </w:r>
+            <w:r>
+              <w:rPr>
+                <w:b w:val="1"/>
+                <w:bCs w:val="1"/>
+                <w:color w:val="16324F"/>
+                <w:sz w:val="18"/>
+                <w:szCs w:val="18"/>
+              </w:rPr>
+              <w:t>realize</w:t>
+            </w:r>
+            <w:r>
+              <w:rPr>
+                <w:b w:val="1"/>
+                <w:bCs w:val="1"/>
+                <w:color w:val="16324F"/>
+                <w:sz w:val="18"/>
+                <w:szCs w:val="18"/>
+              </w:rPr>
+              <w:t xml:space="preserve"> it</w:t>
             </w:r>
           </w:p>
         </w:tc>
@@ -11564,10 +11754,12 @@
               <w:rPr/>
               <w:t xml:space="preserve">A member is unavailable during exam </w:t>
             </w:r>
+            <w:bookmarkStart w:name="_Int_6wcKwB9n" w:id="2049609441"/>
             <w:r>
               <w:rPr/>
               <w:t>season</w:t>
             </w:r>
+            <w:bookmarkEnd w:id="2049609441"/>
             <w:r>
               <w:rPr/>
               <w:t xml:space="preserve"> and their work is delayed or missing.</w:t>
@@ -11739,10 +11931,12 @@
               <w:rPr/>
               <w:t xml:space="preserve">Scope grows to include excluded items such as SMS, </w:t>
             </w:r>
+            <w:bookmarkStart w:name="_Int_IjSKfcTJ" w:id="772740530"/>
             <w:r>
               <w:rPr/>
               <w:t>Duo</w:t>
             </w:r>
+            <w:bookmarkEnd w:id="772740530"/>
             <w:r>
               <w:rPr/>
               <w:t xml:space="preserve"> or door locks.</w:t>
@@ -14571,7 +14765,43 @@
         <w:sz w:val="16"/>
         <w:szCs w:val="16"/>
       </w:rPr>
-      <w:t>CE / CS / SE 3354  ·  Fall 2026  ·  Project Deliverable P1 — Proposal and Requirements</w:t>
+      <w:t xml:space="preserve">CE / CS / SE </w:t>
+    </w:r>
+    <w:bookmarkStart w:name="_Int_Mh0BCdyv" w:id="278898261"/>
+    <w:r>
+      <w:rPr>
+        <w:color w:val="5A6472"/>
+        <w:sz w:val="16"/>
+        <w:szCs w:val="16"/>
+      </w:rPr>
+      <w:t>3354  ·</w:t>
+    </w:r>
+    <w:bookmarkEnd w:id="278898261"/>
+    <w:r>
+      <w:rPr>
+        <w:color w:val="5A6472"/>
+        <w:sz w:val="16"/>
+        <w:szCs w:val="16"/>
+      </w:rPr>
+      <w:t xml:space="preserve">  Fall </w:t>
+    </w:r>
+    <w:bookmarkStart w:name="_Int_q7wk8xFw" w:id="1781888143"/>
+    <w:r>
+      <w:rPr>
+        <w:color w:val="5A6472"/>
+        <w:sz w:val="16"/>
+        <w:szCs w:val="16"/>
+      </w:rPr>
+      <w:t>2026  ·</w:t>
+    </w:r>
+    <w:bookmarkEnd w:id="1781888143"/>
+    <w:r>
+      <w:rPr>
+        <w:color w:val="5A6472"/>
+        <w:sz w:val="16"/>
+        <w:szCs w:val="16"/>
+      </w:rPr>
+      <w:t xml:space="preserve">  Project Deliverable P1 — Proposal and Requirements</w:t>
     </w:r>
   </w:p>
 </w:hdr>
@@ -14580,6 +14810,39 @@
 <file path=word/intelligence2.xml><?xml version="1.0" encoding="utf-8"?>
 <int2:intelligence xmlns:int2="http://schemas.microsoft.com/office/intelligence/2020/intelligence" xmlns:oel="http://schemas.microsoft.com/office/2019/extlst">
   <int2:observations>
+    <int2:bookmark int2:bookmarkName="_Int_IjSKfcTJ" int2:invalidationBookmarkName="" int2:hashCode="PF2c0DOH+0GoVu" int2:id="slVINFGy">
+      <int2:state int2:type="gram" int2:value="Rejected"/>
+    </int2:bookmark>
+    <int2:bookmark int2:bookmarkName="_Int_6wcKwB9n" int2:invalidationBookmarkName="" int2:hashCode="dvXkA5EGRycqM4" int2:id="AHtrwwAD">
+      <int2:state int2:type="gram" int2:value="Rejected"/>
+    </int2:bookmark>
+    <int2:bookmark int2:bookmarkName="_Int_DEpH0W8Z" int2:invalidationBookmarkName="" int2:hashCode="/58tXJ7aDOgbFa" int2:id="MArdkAlG">
+      <int2:state int2:type="gram" int2:value="Rejected"/>
+    </int2:bookmark>
+    <int2:bookmark int2:bookmarkName="_Int_lHgOSgfR" int2:invalidationBookmarkName="" int2:hashCode="VzWlPJsi4HLGbj" int2:id="QvQVGlPT">
+      <int2:state int2:type="gram" int2:value="Rejected"/>
+    </int2:bookmark>
+    <int2:bookmark int2:bookmarkName="_Int_q7wk8xFw" int2:invalidationBookmarkName="" int2:hashCode="XFIAPA6h2JA3jX" int2:id="31Y9PT6I">
+      <int2:state int2:type="gram" int2:value="Rejected"/>
+    </int2:bookmark>
+    <int2:bookmark int2:bookmarkName="_Int_Mh0BCdyv" int2:invalidationBookmarkName="" int2:hashCode="CMYbHMdhOMii3l" int2:id="H8dAnPKZ">
+      <int2:state int2:type="gram" int2:value="Rejected"/>
+    </int2:bookmark>
+    <int2:bookmark int2:bookmarkName="_Int_c6I3QWNn" int2:invalidationBookmarkName="" int2:hashCode="c/RcsLsrmq0KSY" int2:id="g4qhHGdU">
+      <int2:state int2:type="gram" int2:value="Rejected"/>
+    </int2:bookmark>
+    <int2:bookmark int2:bookmarkName="_Int_2UYOr9VY" int2:invalidationBookmarkName="" int2:hashCode="ysHAOnj5Z4rbmw" int2:id="a16tBXX1">
+      <int2:state int2:type="gram" int2:value="Rejected"/>
+    </int2:bookmark>
+    <int2:bookmark int2:bookmarkName="_Int_T76e7iOF" int2:invalidationBookmarkName="" int2:hashCode="Z8difb7eiMcysn" int2:id="nuRpeBEV">
+      <int2:state int2:type="gram" int2:value="Rejected"/>
+    </int2:bookmark>
+    <int2:bookmark int2:bookmarkName="_Int_Axartesy" int2:invalidationBookmarkName="" int2:hashCode="CMYbHMdhOMii3l" int2:id="nxYSAcxb">
+      <int2:state int2:type="gram" int2:value="Rejected"/>
+    </int2:bookmark>
+    <int2:bookmark int2:bookmarkName="_Int_RBbyUlMr" int2:invalidationBookmarkName="" int2:hashCode="QaS0FM9ulw5r+f" int2:id="w0J9meiP">
+      <int2:state int2:type="gram" int2:value="Rejected"/>
+    </int2:bookmark>
     <int2:bookmark int2:bookmarkName="_Int_h2163ntS" int2:invalidationBookmarkName="" int2:hashCode="IcaQH7yadN2I7+" int2:id="wQnAZUaa">
       <int2:state int2:type="gram" int2:value="Rejected"/>
     </int2:bookmark>

</xml_diff>

<commit_message>
Worked on part 3 constraint requirements, section 3.2
</commit_message>
<xml_diff>
--- a/P1_Template_Draft.docx
+++ b/P1_Template_Draft.docx
@@ -1671,7 +1671,7 @@
             </w:tcMar>
           </w:tcPr>
           <w:p>
-            <w:hyperlink r:id="Rbfbf750776fc4abb">
+            <w:hyperlink r:id="Rb907f3c6228549fc">
               <w:r>
                 <w:rPr>
                   <w:rStyle w:val="Hyperlink"/>
@@ -1766,25 +1766,24 @@
             </w:tcMar>
           </w:tcPr>
           <w:p>
-            <w:hyperlink w:history="1" r:id="rId8">
+            <w:hyperlink r:id="R9f1456d7cb1c40eb">
               <w:r>
+                <w:rPr/>
                 <w:t xml:space="preserve"> </w:t>
               </w:r>
-              <w:hyperlink r:id="rId9">
+              <w:hyperlink r:id="Re5f7334037f84105">
                 <w:r>
                   <w:rPr>
                     <w:rStyle w:val="Hyperlink"/>
                   </w:rPr>
                   <w:t>Initi</w:t>
                 </w:r>
-                <w:bookmarkStart w:name="_Hlt243242268" w:id="0"/>
                 <w:r>
                   <w:rPr>
                     <w:rStyle w:val="Hyperlink"/>
                   </w:rPr>
                   <w:t>a</w:t>
                 </w:r>
-                <w:bookmarkEnd w:id="0"/>
                 <w:r>
                   <w:rPr>
                     <w:rStyle w:val="Hyperlink"/>
@@ -1793,9 +1792,10 @@
                 </w:r>
               </w:hyperlink>
               <w:r>
+                <w:rPr/>
                 <w:t xml:space="preserve"> · </w:t>
               </w:r>
-              <w:hyperlink r:id="rId10">
+              <w:hyperlink r:id="Rf21a081420064a70">
                 <w:r>
                   <w:rPr>
                     <w:rStyle w:val="Hyperlink"/>
@@ -1804,9 +1804,10 @@
                 </w:r>
               </w:hyperlink>
               <w:r>
+                <w:rPr/>
                 <w:t xml:space="preserve"> · </w:t>
               </w:r>
-              <w:hyperlink r:id="rId11">
+              <w:hyperlink r:id="R8fb8ad65816a4171">
                 <w:r>
                   <w:rPr>
                     <w:rStyle w:val="Hyperlink"/>
@@ -1892,13 +1893,37 @@
               <w:rPr>
                 <w:lang w:val="en-US"/>
               </w:rPr>
-              <w:t>Worked on part 3 quality requirements</w:t>
+              <w:t>Worked on part 3 quality</w:t>
             </w:r>
             <w:r>
               <w:rPr>
                 <w:lang w:val="en-US"/>
               </w:rPr>
-              <w:t xml:space="preserve"> and initial use </w:t>
+              <w:t>/constraint</w:t>
+            </w:r>
+            <w:r>
+              <w:rPr>
+                <w:lang w:val="en-US"/>
+              </w:rPr>
+              <w:t xml:space="preserve"> requirements</w:t>
+            </w:r>
+            <w:r>
+              <w:rPr>
+                <w:lang w:val="en-US"/>
+              </w:rPr>
+              <w:t xml:space="preserve"> and initial us</w:t>
+            </w:r>
+            <w:r>
+              <w:rPr>
+                <w:lang w:val="en-US"/>
+              </w:rPr>
+              <w:t>e</w:t>
+            </w:r>
+            <w:r>
+              <w:rPr>
+                <w:lang w:val="en-US"/>
+              </w:rPr>
+              <w:t xml:space="preserve"> </w:t>
             </w:r>
             <w:bookmarkStart w:name="_Int_h2163ntS" w:id="1512707569"/>
             <w:r>
@@ -1911,7 +1936,13 @@
               <w:rPr>
                 <w:lang w:val="en-US"/>
               </w:rPr>
-              <w:t>s(</w:t>
+              <w:t>s</w:t>
+            </w:r>
+            <w:r>
+              <w:rPr>
+                <w:lang w:val="en-US"/>
+              </w:rPr>
+              <w:t>(</w:t>
             </w:r>
             <w:bookmarkEnd w:id="1512707569"/>
             <w:r>
@@ -1936,12 +1967,18 @@
               <w:rPr>
                 <w:lang w:val="en-US"/>
               </w:rPr>
-              <w:t>3.3</w:t>
+              <w:t>3.</w:t>
             </w:r>
             <w:r>
               <w:rPr>
                 <w:lang w:val="en-US"/>
               </w:rPr>
+              <w:t>2, 3.3</w:t>
+            </w:r>
+            <w:r>
+              <w:rPr>
+                <w:lang w:val="en-US"/>
+              </w:rPr>
               <w:t xml:space="preserve"> and 3.4</w:t>
             </w:r>
             <w:r>
@@ -1954,14 +1991,44 @@
               <w:rPr>
                 <w:lang w:val="en-US"/>
               </w:rPr>
-              <w:t xml:space="preserve"> and part 4 </w:t>
+              <w:t xml:space="preserve"> and part</w:t>
+            </w:r>
+            <w:r>
+              <w:rPr>
+                <w:lang w:val="en-US"/>
+              </w:rPr>
+              <w:t xml:space="preserve"> </w:t>
+            </w:r>
+            <w:r>
+              <w:rPr>
+                <w:lang w:val="en-US"/>
+              </w:rPr>
+              <w:t>4</w:t>
+            </w:r>
+            <w:r>
+              <w:rPr>
+                <w:lang w:val="en-US"/>
+              </w:rPr>
+              <w:t xml:space="preserve"> </w:t>
             </w:r>
             <w:bookmarkStart w:name="_Int_RBbyUlMr" w:id="793199219"/>
             <w:r>
               <w:rPr>
                 <w:lang w:val="en-US"/>
               </w:rPr>
-              <w:t>risks</w:t>
+              <w:t>ris</w:t>
+            </w:r>
+            <w:r>
+              <w:rPr>
+                <w:lang w:val="en-US"/>
+              </w:rPr>
+              <w:t>k</w:t>
+            </w:r>
+            <w:r>
+              <w:rPr>
+                <w:lang w:val="en-US"/>
+              </w:rPr>
+              <w:t>s</w:t>
             </w:r>
             <w:r>
               <w:rPr>
@@ -2005,7 +2072,7 @@
                 <w:lang w:val="en-US"/>
               </w:rPr>
             </w:pPr>
-            <w:hyperlink r:id="Rd7fdc764b5e742f5">
+            <w:hyperlink r:id="R105022971f2a4cbf">
               <w:r>
                 <w:rPr>
                   <w:rStyle w:val="Hyperlink"/>
@@ -2028,7 +2095,7 @@
               </w:rPr>
               <w:t xml:space="preserve"> </w:t>
             </w:r>
-            <w:hyperlink r:id="R84c2f11578cc4ac7">
+            <w:hyperlink r:id="Rff3f71d8a2fe497b">
               <w:r>
                 <w:rPr>
                   <w:rStyle w:val="Hyperlink"/>
@@ -2088,7 +2155,23 @@
               <w:right w:w="100" w:type="dxa"/>
             </w:tcMar>
           </w:tcPr>
-          <w:p/>
+          <w:p>
+            <w:pPr>
+              <w:pStyle w:val="Normal"/>
+            </w:pPr>
+            <w:hyperlink r:id="R8ebe88a3fd3740da">
+              <w:r>
+                <w:rPr>
+                  <w:rStyle w:val="Hyperlink"/>
+                </w:rPr>
+                <w:t>Sections 2.2-2.5</w:t>
+              </w:r>
+            </w:hyperlink>
+            <w:r>
+              <w:rPr/>
+              <w:t xml:space="preserve"> · </w:t>
+            </w:r>
+          </w:p>
         </w:tc>
       </w:tr>
     </w:tbl>
@@ -3621,7 +3704,7 @@
               <w:rPr/>
               <w:t xml:space="preserve">UTD library policies; </w:t>
             </w:r>
-            <w:hyperlink r:id="R4f19ecb6f0bb47c1">
+            <w:hyperlink r:id="Rf4a069ae15df4a21">
               <w:r>
                 <w:rPr>
                   <w:rStyle w:val="Hyperlink"/>
@@ -3646,7 +3729,7 @@
               <w:rPr/>
               <w:t xml:space="preserve">; </w:t>
             </w:r>
-            <w:hyperlink r:id="Rc7888aa67072487d">
+            <w:hyperlink r:id="R2dde58a68d01435e">
               <w:r>
                 <w:rPr>
                   <w:rStyle w:val="Hyperlink"/>
@@ -8307,9 +8390,11 @@
             <w:pPr>
               <w:spacing w:after="60" w:line="260" w:lineRule="auto"/>
             </w:pPr>
-            <w:r>
-              <w:rPr>
-                <w:b/>
+            <w:bookmarkStart w:name="_Int_UHgjFSCU" w:id="1742897843"/>
+            <w:r>
+              <w:rPr>
+                <w:b w:val="1"/>
+                <w:bCs w:val="1"/>
                 <w:color w:val="2F5D8A"/>
                 <w:sz w:val="19"/>
                 <w:szCs w:val="19"/>
@@ -8318,13 +8403,26 @@
             </w:r>
             <w:r>
               <w:rPr>
-                <w:b/>
-                <w:caps/>
+                <w:b w:val="1"/>
+                <w:bCs w:val="1"/>
+                <w:caps w:val="1"/>
                 <w:color w:val="2F5D8A"/>
                 <w:sz w:val="17"/>
                 <w:szCs w:val="17"/>
               </w:rPr>
-              <w:t>WHAT GOES HERE</w:t>
+              <w:t>WHAT</w:t>
+            </w:r>
+            <w:bookmarkEnd w:id="1742897843"/>
+            <w:r>
+              <w:rPr>
+                <w:b w:val="1"/>
+                <w:bCs w:val="1"/>
+                <w:caps w:val="1"/>
+                <w:color w:val="2F5D8A"/>
+                <w:sz w:val="17"/>
+                <w:szCs w:val="17"/>
+              </w:rPr>
+              <w:t xml:space="preserve"> GOES HERE</w:t>
             </w:r>
           </w:p>
           <w:p>
@@ -8522,10 +8620,12 @@
               <w:rPr/>
               <w:t xml:space="preserve">The system shall be hosted on UTD-operated servers, and </w:t>
             </w:r>
+            <w:bookmarkStart w:name="_Int_dZVBnArn" w:id="100120178"/>
             <w:r>
               <w:rPr/>
               <w:t>student</w:t>
             </w:r>
+            <w:bookmarkEnd w:id="100120178"/>
             <w:r>
               <w:rPr/>
               <w:t xml:space="preserve"> personal data shall not be stored anywhere else.</w:t>
@@ -11714,7 +11814,14 @@
               <w:right w:w="100" w:type="dxa"/>
             </w:tcMar>
           </w:tcPr>
-          <w:p/>
+          <w:p>
+            <w:r>
+              <w:rPr>
+                <w:lang w:val="en-US"/>
+              </w:rPr>
+              <w:t>Matthew Low – Record the requirement changes in the repository and assess the impact on scope and deadlines. Also make sure the team agrees to any changes proposed for the baseline</w:t>
+            </w:r>
+          </w:p>
         </w:tc>
       </w:tr>
       <w:tr>
@@ -11808,7 +11915,19 @@
               <w:right w:w="100" w:type="dxa"/>
             </w:tcMar>
           </w:tcPr>
-          <w:p/>
+          <w:p>
+            <w:pPr>
+              <w:pStyle w:val="Normal"/>
+              <w:ind w:left="0"/>
+            </w:pPr>
+            <w:r>
+              <w:rPr>
+                <w:sz w:val="21"/>
+                <w:szCs w:val="21"/>
+              </w:rPr>
+              <w:t xml:space="preserve">Have each member document their progress and upload their </w:t>
+            </w:r>
+          </w:p>
         </w:tc>
       </w:tr>
       <w:tr>
@@ -13757,6 +13876,78 @@
           </w:tcPr>
           <w:p>
             <w:r>
+              <w:t>10/18/2026</w:t>
+            </w:r>
+          </w:p>
+        </w:tc>
+      </w:tr>
+      <w:tr>
+        <w:trPr>
+          <w:trHeight w:val="300"/>
+        </w:trPr>
+        <w:tc>
+          <w:tcPr>
+            <w:tcW w:w="4000" w:type="dxa"/>
+            <w:tcMar>
+              <w:top w:w="70" w:type="dxa"/>
+              <w:left w:w="100" w:type="dxa"/>
+              <w:bottom w:w="70" w:type="dxa"/>
+              <w:right w:w="100" w:type="dxa"/>
+            </w:tcMar>
+          </w:tcPr>
+          <w:p>
+            <w:pPr>
+              <w:pStyle w:val="Normal"/>
+              <w:suppressLineNumbers w:val="0"/>
+              <w:bidi w:val="0"/>
+              <w:spacing w:before="0" w:beforeAutospacing="off" w:after="0" w:afterAutospacing="off" w:line="259" w:lineRule="auto"/>
+              <w:ind w:left="0" w:right="0"/>
+              <w:jc w:val="left"/>
+            </w:pPr>
+            <w:r>
+              <w:rPr/>
+              <w:t>Param Kathiravan</w:t>
+            </w:r>
+          </w:p>
+        </w:tc>
+        <w:tc>
+          <w:tcPr>
+            <w:tcW w:w="4200" w:type="dxa"/>
+            <w:tcMar>
+              <w:top w:w="70" w:type="dxa"/>
+              <w:left w:w="100" w:type="dxa"/>
+              <w:bottom w:w="70" w:type="dxa"/>
+              <w:right w:w="100" w:type="dxa"/>
+            </w:tcMar>
+          </w:tcPr>
+          <w:p>
+            <w:pPr>
+              <w:pStyle w:val="Normal"/>
+              <w:suppressLineNumbers w:val="0"/>
+              <w:bidi w:val="0"/>
+              <w:spacing w:before="0" w:beforeAutospacing="off" w:after="0" w:afterAutospacing="off" w:line="259" w:lineRule="auto"/>
+              <w:ind w:left="0" w:right="0"/>
+              <w:jc w:val="left"/>
+            </w:pPr>
+            <w:r>
+              <w:rPr/>
+              <w:t>Param Kathiravan</w:t>
+            </w:r>
+          </w:p>
+        </w:tc>
+        <w:tc>
+          <w:tcPr>
+            <w:tcW w:w="2658" w:type="dxa"/>
+            <w:tcMar>
+              <w:top w:w="70" w:type="dxa"/>
+              <w:left w:w="100" w:type="dxa"/>
+              <w:bottom w:w="70" w:type="dxa"/>
+              <w:right w:w="100" w:type="dxa"/>
+            </w:tcMar>
+          </w:tcPr>
+          <w:p>
+            <w:r>
+              <w:rPr/>
               <w:t>10/18/2026</w:t>
             </w:r>
           </w:p>
@@ -14810,6 +15001,12 @@
 <file path=word/intelligence2.xml><?xml version="1.0" encoding="utf-8"?>
 <int2:intelligence xmlns:int2="http://schemas.microsoft.com/office/intelligence/2020/intelligence" xmlns:oel="http://schemas.microsoft.com/office/2019/extlst">
   <int2:observations>
+    <int2:bookmark int2:bookmarkName="_Int_dZVBnArn" int2:invalidationBookmarkName="" int2:hashCode="IEA2oe9uc2DlNj" int2:id="aRJcfDjs">
+      <int2:state int2:type="gram" int2:value="Rejected"/>
+    </int2:bookmark>
+    <int2:bookmark int2:bookmarkName="_Int_UHgjFSCU" int2:invalidationBookmarkName="" int2:hashCode="lXd6zlTQYJRgfU" int2:id="k9bAawdk">
+      <int2:state int2:type="gram" int2:value="Rejected"/>
+    </int2:bookmark>
     <int2:bookmark int2:bookmarkName="_Int_IjSKfcTJ" int2:invalidationBookmarkName="" int2:hashCode="PF2c0DOH+0GoVu" int2:id="slVINFGy">
       <int2:state int2:type="gram" int2:value="Rejected"/>
     </int2:bookmark>
@@ -14854,6 +15051,118 @@
 
 <file path=word/numbering.xml><?xml version="1.0" encoding="utf-8"?>
 <w:numbering xmlns:wpc="http://schemas.microsoft.com/office/word/2010/wordprocessingCanvas" xmlns:cx="http://schemas.microsoft.com/office/drawing/2014/chartex" xmlns:cx1="http://schemas.microsoft.com/office/drawing/2015/9/8/chartex" xmlns:cx2="http://schemas.microsoft.com/office/drawing/2015/10/21/chartex" xmlns:cx3="http://schemas.microsoft.com/office/drawing/2016/5/9/chartex" xmlns:cx4="http://schemas.microsoft.com/office/drawing/2016/5/10/chartex" xmlns:cx5="http://schemas.microsoft.com/office/drawing/2016/5/11/chartex" xmlns:cx6="http://schemas.microsoft.com/office/drawing/2016/5/12/chartex" xmlns:cx7="http://schemas.microsoft.com/office/drawing/2016/5/13/chartex" xmlns:cx8="http://schemas.microsoft.com/office/drawing/2016/5/14/chartex" xmlns:mc="http://schemas.openxmlformats.org/markup-compatibility/2006" xmlns:aink="http://schemas.microsoft.com/office/drawing/2016/ink" xmlns:am3d="http://schemas.microsoft.com/office/drawing/2017/model3d" xmlns:o="urn:schemas-microsoft-com:office:office" xmlns:oel="http://schemas.microsoft.com/office/2019/extlst" xmlns:r="http://schemas.openxmlformats.org/officeDocument/2006/relationships" xmlns:m="http://schemas.openxmlformats.org/officeDocument/2006/math" xmlns:v="urn:schemas-microsoft-com:vml" xmlns:wp14="http://schemas.microsoft.com/office/word/2010/wordprocessingDrawing" xmlns:wp="http://schemas.openxmlformats.org/drawingml/2006/wordprocessingDrawing" xmlns:w10="urn:schemas-microsoft-com:office:word" xmlns:w="http://schemas.openxmlformats.org/wordprocessingml/2006/main" xmlns:w14="http://schemas.microsoft.com/office/word/2010/wordml" xmlns:w15="http://schemas.microsoft.com/office/word/2012/wordml" xmlns:w16cex="http://schemas.microsoft.com/office/word/2018/wordml/cex" xmlns:w16cid="http://schemas.microsoft.com/office/word/2016/wordml/cid" xmlns:w16="http://schemas.microsoft.com/office/word/2018/wordml" xmlns:w16du="http://schemas.microsoft.com/office/word/2023/wordml/word16du" xmlns:w16sdtdh="http://schemas.microsoft.com/office/word/2020/wordml/sdtdatahash" xmlns:w16sdtfl="http://schemas.microsoft.com/office/word/2024/wordml/sdtformatlock" xmlns:w16se="http://schemas.microsoft.com/office/word/2015/wordml/symex" xmlns:wpg="http://schemas.microsoft.com/office/word/2010/wordprocessingGroup" xmlns:wpi="http://schemas.microsoft.com/office/word/2010/wordprocessingInk" xmlns:wne="http://schemas.microsoft.com/office/word/2006/wordml" xmlns:wps="http://schemas.microsoft.com/office/word/2010/wordprocessingShape" mc:Ignorable="w14 w15 w16se w16cid w16 w16cex w16sdtdh w16sdtfl w16du wp14">
+  <w:abstractNum xmlns:w="http://schemas.openxmlformats.org/wordprocessingml/2006/main" w:abstractNumId="2">
+    <w:nsid w:val="5bbeae38"/>
+    <w:multiLevelType xmlns:w="http://schemas.openxmlformats.org/wordprocessingml/2006/main" w:val="hybridMultilevel"/>
+    <w:lvl xmlns:w="http://schemas.openxmlformats.org/wordprocessingml/2006/main" w:ilvl="0">
+      <w:start w:val="1"/>
+      <w:numFmt w:val="bullet"/>
+      <w:lvlText w:val="-"/>
+      <w:lvlJc w:val="left"/>
+      <w:pPr>
+        <w:ind w:left="720" w:hanging="360"/>
+      </w:pPr>
+      <w:rPr>
+        <w:rFonts w:hint="default" w:ascii="Aptos" w:hAnsi="Aptos"/>
+      </w:rPr>
+    </w:lvl>
+    <w:lvl xmlns:w="http://schemas.openxmlformats.org/wordprocessingml/2006/main" w:ilvl="1">
+      <w:start w:val="1"/>
+      <w:numFmt w:val="bullet"/>
+      <w:lvlText w:val="o"/>
+      <w:lvlJc w:val="left"/>
+      <w:pPr>
+        <w:ind w:left="1440" w:hanging="360"/>
+      </w:pPr>
+      <w:rPr>
+        <w:rFonts w:hint="default" w:ascii="Courier New" w:hAnsi="Courier New"/>
+      </w:rPr>
+    </w:lvl>
+    <w:lvl xmlns:w="http://schemas.openxmlformats.org/wordprocessingml/2006/main" w:ilvl="2">
+      <w:start w:val="1"/>
+      <w:numFmt w:val="bullet"/>
+      <w:lvlText w:val=""/>
+      <w:lvlJc w:val="left"/>
+      <w:pPr>
+        <w:ind w:left="2160" w:hanging="360"/>
+      </w:pPr>
+      <w:rPr>
+        <w:rFonts w:hint="default" w:ascii="Wingdings" w:hAnsi="Wingdings"/>
+      </w:rPr>
+    </w:lvl>
+    <w:lvl xmlns:w="http://schemas.openxmlformats.org/wordprocessingml/2006/main" w:ilvl="3">
+      <w:start w:val="1"/>
+      <w:numFmt w:val="bullet"/>
+      <w:lvlText w:val=""/>
+      <w:lvlJc w:val="left"/>
+      <w:pPr>
+        <w:ind w:left="2880" w:hanging="360"/>
+      </w:pPr>
+      <w:rPr>
+        <w:rFonts w:hint="default" w:ascii="Symbol" w:hAnsi="Symbol"/>
+      </w:rPr>
+    </w:lvl>
+    <w:lvl xmlns:w="http://schemas.openxmlformats.org/wordprocessingml/2006/main" w:ilvl="4">
+      <w:start w:val="1"/>
+      <w:numFmt w:val="bullet"/>
+      <w:lvlText w:val="o"/>
+      <w:lvlJc w:val="left"/>
+      <w:pPr>
+        <w:ind w:left="3600" w:hanging="360"/>
+      </w:pPr>
+      <w:rPr>
+        <w:rFonts w:hint="default" w:ascii="Courier New" w:hAnsi="Courier New"/>
+      </w:rPr>
+    </w:lvl>
+    <w:lvl xmlns:w="http://schemas.openxmlformats.org/wordprocessingml/2006/main" w:ilvl="5">
+      <w:start w:val="1"/>
+      <w:numFmt w:val="bullet"/>
+      <w:lvlText w:val=""/>
+      <w:lvlJc w:val="left"/>
+      <w:pPr>
+        <w:ind w:left="4320" w:hanging="360"/>
+      </w:pPr>
+      <w:rPr>
+        <w:rFonts w:hint="default" w:ascii="Wingdings" w:hAnsi="Wingdings"/>
+      </w:rPr>
+    </w:lvl>
+    <w:lvl xmlns:w="http://schemas.openxmlformats.org/wordprocessingml/2006/main" w:ilvl="6">
+      <w:start w:val="1"/>
+      <w:numFmt w:val="bullet"/>
+      <w:lvlText w:val=""/>
+      <w:lvlJc w:val="left"/>
+      <w:pPr>
+        <w:ind w:left="5040" w:hanging="360"/>
+      </w:pPr>
+      <w:rPr>
+        <w:rFonts w:hint="default" w:ascii="Symbol" w:hAnsi="Symbol"/>
+      </w:rPr>
+    </w:lvl>
+    <w:lvl xmlns:w="http://schemas.openxmlformats.org/wordprocessingml/2006/main" w:ilvl="7">
+      <w:start w:val="1"/>
+      <w:numFmt w:val="bullet"/>
+      <w:lvlText w:val="o"/>
+      <w:lvlJc w:val="left"/>
+      <w:pPr>
+        <w:ind w:left="5760" w:hanging="360"/>
+      </w:pPr>
+      <w:rPr>
+        <w:rFonts w:hint="default" w:ascii="Courier New" w:hAnsi="Courier New"/>
+      </w:rPr>
+    </w:lvl>
+    <w:lvl xmlns:w="http://schemas.openxmlformats.org/wordprocessingml/2006/main" w:ilvl="8">
+      <w:start w:val="1"/>
+      <w:numFmt w:val="bullet"/>
+      <w:lvlText w:val=""/>
+      <w:lvlJc w:val="left"/>
+      <w:pPr>
+        <w:ind w:left="6480" w:hanging="360"/>
+      </w:pPr>
+      <w:rPr>
+        <w:rFonts w:hint="default" w:ascii="Wingdings" w:hAnsi="Wingdings"/>
+      </w:rPr>
+    </w:lvl>
+  </w:abstractNum>
   <w:abstractNum w:abstractNumId="0" w15:restartNumberingAfterBreak="0">
     <w:nsid w:val="0E464751"/>
     <w:multiLevelType w:val="hybridMultilevel"/>
@@ -15053,6 +15362,9 @@
       </w:rPr>
     </w:lvl>
   </w:abstractNum>
+  <w:num w:numId="3">
+    <w:abstractNumId w:val="2"/>
+  </w:num>
   <w:num w:numId="1" w16cid:durableId="512384001">
     <w:abstractNumId w:val="1"/>
   </w:num>

</xml_diff>

<commit_message>
Worked on part 2 product perspective, section 2.1
</commit_message>
<xml_diff>
--- a/P1_Template_Draft.docx
+++ b/P1_Template_Draft.docx
@@ -1671,7 +1671,7 @@
             </w:tcMar>
           </w:tcPr>
           <w:p>
-            <w:hyperlink r:id="Rb907f3c6228549fc">
+            <w:hyperlink r:id="Rb051b7aae4c14011">
               <w:r>
                 <w:rPr>
                   <w:rStyle w:val="Hyperlink"/>
@@ -1766,12 +1766,12 @@
             </w:tcMar>
           </w:tcPr>
           <w:p>
-            <w:hyperlink r:id="R9f1456d7cb1c40eb">
+            <w:hyperlink r:id="Re3071faaf6ed4d1e">
               <w:r>
                 <w:rPr/>
                 <w:t xml:space="preserve"> </w:t>
               </w:r>
-              <w:hyperlink r:id="Re5f7334037f84105">
+              <w:hyperlink r:id="Rb59fb94ba32b4910">
                 <w:r>
                   <w:rPr>
                     <w:rStyle w:val="Hyperlink"/>
@@ -1795,7 +1795,7 @@
                 <w:rPr/>
                 <w:t xml:space="preserve"> · </w:t>
               </w:r>
-              <w:hyperlink r:id="Rf21a081420064a70">
+              <w:hyperlink r:id="Rbe763b590fb44423">
                 <w:r>
                   <w:rPr>
                     <w:rStyle w:val="Hyperlink"/>
@@ -1807,7 +1807,7 @@
                 <w:rPr/>
                 <w:t xml:space="preserve"> · </w:t>
               </w:r>
-              <w:hyperlink r:id="R8fb8ad65816a4171">
+              <w:hyperlink r:id="R957ce648e2ff4edb">
                 <w:r>
                   <w:rPr>
                     <w:rStyle w:val="Hyperlink"/>
@@ -1893,7 +1893,45 @@
               <w:rPr>
                 <w:lang w:val="en-US"/>
               </w:rPr>
-              <w:t>Worked on part 3 quality</w:t>
+              <w:t xml:space="preserve">Worked on </w:t>
+            </w:r>
+            <w:r>
+              <w:rPr>
+                <w:lang w:val="en-US"/>
+              </w:rPr>
+              <w:t xml:space="preserve">part </w:t>
+            </w:r>
+            <w:r>
+              <w:rPr>
+                <w:lang w:val="en-US"/>
+              </w:rPr>
+              <w:t xml:space="preserve">2 product </w:t>
+            </w:r>
+            <w:bookmarkStart w:name="_Int_k8o3kjre" w:id="269897560"/>
+            <w:r>
+              <w:rPr>
+                <w:lang w:val="en-US"/>
+              </w:rPr>
+              <w:t>perspective(</w:t>
+            </w:r>
+            <w:bookmarkEnd w:id="269897560"/>
+            <w:r>
+              <w:rPr>
+                <w:lang w:val="en-US"/>
+              </w:rPr>
+              <w:t xml:space="preserve">section 2.1) </w:t>
+            </w:r>
+            <w:r>
+              <w:rPr>
+                <w:lang w:val="en-US"/>
+              </w:rPr>
+              <w:t>part</w:t>
+            </w:r>
+            <w:r>
+              <w:rPr>
+                <w:lang w:val="en-US"/>
+              </w:rPr>
+              <w:t xml:space="preserve"> 3 quality</w:t>
             </w:r>
             <w:r>
               <w:rPr>
@@ -2072,7 +2110,7 @@
                 <w:lang w:val="en-US"/>
               </w:rPr>
             </w:pPr>
-            <w:hyperlink r:id="R105022971f2a4cbf">
+            <w:hyperlink r:id="R609b943eeab84660">
               <w:r>
                 <w:rPr>
                   <w:rStyle w:val="Hyperlink"/>
@@ -2095,7 +2133,7 @@
               </w:rPr>
               <w:t xml:space="preserve"> </w:t>
             </w:r>
-            <w:hyperlink r:id="Rff3f71d8a2fe497b">
+            <w:hyperlink r:id="R8767c3542bbf48b0">
               <w:r>
                 <w:rPr>
                   <w:rStyle w:val="Hyperlink"/>
@@ -2108,6 +2146,29 @@
                 <w:t>Section 3.4</w:t>
               </w:r>
             </w:hyperlink>
+            <w:r>
+              <w:rPr>
+                <w:rFonts w:ascii="Calibri" w:hAnsi="Calibri" w:eastAsia="Calibri" w:cs="Calibri"/>
+                <w:noProof w:val="0"/>
+                <w:sz w:val="21"/>
+                <w:szCs w:val="21"/>
+                <w:lang w:val="en-US"/>
+              </w:rPr>
+              <w:t xml:space="preserve"> </w:t>
+            </w:r>
+            <w:hyperlink r:id="R8b85cbfcf9084d74">
+              <w:r>
+                <w:rPr>
+                  <w:rStyle w:val="Hyperlink"/>
+                  <w:rFonts w:ascii="Calibri" w:hAnsi="Calibri" w:eastAsia="Calibri" w:cs="Calibri"/>
+                  <w:noProof w:val="0"/>
+                  <w:sz w:val="21"/>
+                  <w:szCs w:val="21"/>
+                  <w:lang w:val="en-US"/>
+                </w:rPr>
+                <w:t>Section 3.2</w:t>
+              </w:r>
+            </w:hyperlink>
           </w:p>
         </w:tc>
       </w:tr>
@@ -2159,7 +2220,7 @@
             <w:pPr>
               <w:pStyle w:val="Normal"/>
             </w:pPr>
-            <w:hyperlink r:id="R8ebe88a3fd3740da">
+            <w:hyperlink r:id="Rc6a46bde0c754e18">
               <w:r>
                 <w:rPr>
                   <w:rStyle w:val="Hyperlink"/>
@@ -3704,7 +3765,7 @@
               <w:rPr/>
               <w:t xml:space="preserve">UTD library policies; </w:t>
             </w:r>
-            <w:hyperlink r:id="Rf4a069ae15df4a21">
+            <w:hyperlink r:id="Rcdf39fa7aa684e72">
               <w:r>
                 <w:rPr>
                   <w:rStyle w:val="Hyperlink"/>
@@ -3729,7 +3790,7 @@
               <w:rPr/>
               <w:t xml:space="preserve">; </w:t>
             </w:r>
-            <w:hyperlink r:id="R2dde58a68d01435e">
+            <w:hyperlink r:id="R21fd523754d94f59">
               <w:r>
                 <w:rPr>
                   <w:rStyle w:val="Hyperlink"/>
@@ -3994,11 +4055,26 @@
             <w:pPr>
               <w:spacing w:after="60" w:line="260" w:lineRule="auto"/>
             </w:pPr>
-          </w:p>
-          <w:p>
-            <w:pPr>
-              <w:spacing w:after="60" w:line="260" w:lineRule="auto"/>
-            </w:pPr>
+            <w:r>
+              <w:rPr/>
+              <w:t xml:space="preserve">Why the boundary sits here: Inside the box is everything we build: the room catalogue, availability search, reservation rules, admin tools for room listings, and the logic that triggers emails. Outside is everything we depend on but </w:t>
+            </w:r>
+            <w:r>
+              <w:rPr/>
+              <w:t>don’t</w:t>
+            </w:r>
+            <w:r>
+              <w:rPr/>
+              <w:t xml:space="preserve"> control: UTD’s identity records, its email service, and the physical doors, </w:t>
+            </w:r>
+            <w:r>
+              <w:rPr/>
+              <w:t>locks</w:t>
+            </w:r>
+            <w:r>
+              <w:rPr/>
+              <w:t xml:space="preserve"> and Comet Card readers. Only students and library staff use the system directly.</w:t>
+            </w:r>
           </w:p>
         </w:tc>
       </w:tr>
@@ -9034,6 +9110,15 @@
             <w:pPr>
               <w:spacing w:after="60" w:line="260" w:lineRule="auto"/>
             </w:pPr>
+            <w:r>
+              <w:rPr/>
+              <w:t>UC-06 View study room usage data</w:t>
+            </w:r>
+          </w:p>
+          <w:p>
+            <w:pPr>
+              <w:spacing w:after="60" w:line="260" w:lineRule="auto"/>
+            </w:pPr>
           </w:p>
           <w:p>
             <w:pPr>
@@ -9798,7 +9883,12 @@
               <w:right w:w="100" w:type="dxa"/>
             </w:tcMar>
           </w:tcPr>
-          <w:p/>
+          <w:p>
+            <w:r>
+              <w:rPr/>
+              <w:t>UC-01, UC-02, UC-05</w:t>
+            </w:r>
+          </w:p>
         </w:tc>
         <w:tc>
           <w:tcPr>
@@ -9845,7 +9935,12 @@
               <w:right w:w="100" w:type="dxa"/>
             </w:tcMar>
           </w:tcPr>
-          <w:p/>
+          <w:p>
+            <w:r>
+              <w:rPr/>
+              <w:t>UC-01, UC-02, UC-04, UC-05, UC-06</w:t>
+            </w:r>
+          </w:p>
         </w:tc>
         <w:tc>
           <w:tcPr>
@@ -11731,7 +11826,12 @@
               <w:right w:w="100" w:type="dxa"/>
             </w:tcMar>
           </w:tcPr>
-          <w:p/>
+          <w:p>
+            <w:r>
+              <w:rPr/>
+              <w:t>Define a simple identification method that does not require UTD identity integration.</w:t>
+            </w:r>
+          </w:p>
         </w:tc>
       </w:tr>
       <w:tr>
@@ -11817,9 +11917,16 @@
           <w:p>
             <w:r>
               <w:rPr>
+                <w:u w:val="single"/>
                 <w:lang w:val="en-US"/>
               </w:rPr>
-              <w:t>Matthew Low – Record the requirement changes in the repository and assess the impact on scope and deadlines. Also make sure the team agrees to any changes proposed for the baseline</w:t>
+              <w:t>Matthew Low</w:t>
+            </w:r>
+            <w:r>
+              <w:rPr>
+                <w:lang w:val="en-US"/>
+              </w:rPr>
+              <w:t xml:space="preserve"> – Record the requirement changes in the repository and assess the impact on scope and deadlines. Also make sure the team agrees to any changes proposed for the baseline</w:t>
             </w:r>
           </w:p>
         </w:tc>
@@ -11925,7 +12032,7 @@
                 <w:sz w:val="21"/>
                 <w:szCs w:val="21"/>
               </w:rPr>
-              <w:t xml:space="preserve">Have each member document their progress and upload their </w:t>
+              <w:t>Have each member document their progress and upload their work to GitHub regularly. Share status on tasks with the team and reassign unfinished tasks if necessary</w:t>
             </w:r>
           </w:p>
         </w:tc>
@@ -12010,7 +12117,38 @@
               <w:right w:w="100" w:type="dxa"/>
             </w:tcMar>
           </w:tcPr>
-          <w:p/>
+          <w:p>
+            <w:r>
+              <w:rPr>
+                <w:lang w:val="en-US"/>
+              </w:rPr>
+              <w:t xml:space="preserve">Design a reservation conflict check that will recheck </w:t>
+            </w:r>
+            <w:r>
+              <w:rPr>
+                <w:lang w:val="en-US"/>
+              </w:rPr>
+              <w:t>availability</w:t>
+            </w:r>
+            <w:r>
+              <w:rPr>
+                <w:lang w:val="en-US"/>
+              </w:rPr>
+              <w:t xml:space="preserve"> on reservations when </w:t>
+            </w:r>
+            <w:r>
+              <w:rPr>
+                <w:lang w:val="en-US"/>
+              </w:rPr>
+              <w:t>submitted</w:t>
+            </w:r>
+            <w:r>
+              <w:rPr>
+                <w:lang w:val="en-US"/>
+              </w:rPr>
+              <w:t>.</w:t>
+            </w:r>
+          </w:p>
         </w:tc>
       </w:tr>
       <w:tr>
@@ -12104,7 +12242,49 @@
               <w:right w:w="100" w:type="dxa"/>
             </w:tcMar>
           </w:tcPr>
-          <w:p/>
+          <w:p>
+            <w:pPr>
+              <w:rPr>
+                <w:lang w:val="en-US"/>
+              </w:rPr>
+            </w:pPr>
+            <w:r>
+              <w:rPr>
+                <w:lang w:val="en-US"/>
+              </w:rPr>
+              <w:t xml:space="preserve">Keep a list of extra </w:t>
+            </w:r>
+            <w:r>
+              <w:rPr>
+                <w:lang w:val="en-US"/>
+              </w:rPr>
+              <w:t>features</w:t>
+            </w:r>
+            <w:r>
+              <w:rPr>
+                <w:lang w:val="en-US"/>
+              </w:rPr>
+              <w:t xml:space="preserve"> whether they are used or not and </w:t>
+            </w:r>
+            <w:r>
+              <w:rPr>
+                <w:lang w:val="en-US"/>
+              </w:rPr>
+              <w:t>dec</w:t>
+            </w:r>
+            <w:r>
+              <w:rPr>
+                <w:lang w:val="en-US"/>
+              </w:rPr>
+              <w:t>ide with the team whether these features fit in the scope</w:t>
+            </w:r>
+            <w:r>
+              <w:rPr>
+                <w:lang w:val="en-US"/>
+              </w:rPr>
+              <w:t xml:space="preserve"> of the project or not.</w:t>
+            </w:r>
+          </w:p>
         </w:tc>
       </w:tr>
     </w:tbl>
@@ -13274,15 +13454,39 @@
           </w:tcPr>
           <w:p>
             <w:r>
-              <w:t xml:space="preserve">The initial version will use a simple project-level identification method and will not </w:t>
-            </w:r>
-            <w:r>
+              <w:rPr>
+                <w:lang w:val="en-US"/>
+              </w:rPr>
+              <w:t xml:space="preserve">The </w:t>
+            </w:r>
+            <w:r>
+              <w:rPr>
+                <w:lang w:val="en-US"/>
+              </w:rPr>
+              <w:t>initial</w:t>
+            </w:r>
+            <w:r>
+              <w:rPr>
+                <w:lang w:val="en-US"/>
+              </w:rPr>
+              <w:t xml:space="preserve"> version will use a simple project-level identification method and will not </w:t>
+            </w:r>
+            <w:r>
+              <w:rPr>
+                <w:lang w:val="en-US"/>
+              </w:rPr>
               <w:t>integrate</w:t>
             </w:r>
             <w:r>
-              <w:t xml:space="preserve"> with UTD Duo</w:t>
-            </w:r>
-            <w:r>
+              <w:rPr>
+                <w:lang w:val="en-US"/>
+              </w:rPr>
+              <w:t>with UTD Duo</w:t>
+            </w:r>
+            <w:r>
+              <w:rPr>
+                <w:lang w:val="en-US"/>
+              </w:rPr>
               <w:t>.</w:t>
             </w:r>
           </w:p>
@@ -15001,6 +15205,9 @@
 <file path=word/intelligence2.xml><?xml version="1.0" encoding="utf-8"?>
 <int2:intelligence xmlns:int2="http://schemas.microsoft.com/office/intelligence/2020/intelligence" xmlns:oel="http://schemas.microsoft.com/office/2019/extlst">
   <int2:observations>
+    <int2:bookmark int2:bookmarkName="_Int_k8o3kjre" int2:invalidationBookmarkName="" int2:hashCode="rc+HNmMwrN/tnO" int2:id="x1Egzkvz">
+      <int2:state int2:type="gram" int2:value="Rejected"/>
+    </int2:bookmark>
     <int2:bookmark int2:bookmarkName="_Int_dZVBnArn" int2:invalidationBookmarkName="" int2:hashCode="IEA2oe9uc2DlNj" int2:id="aRJcfDjs">
       <int2:state int2:type="gram" int2:value="Rejected"/>
     </int2:bookmark>

</xml_diff>

<commit_message>
section 2.1, section 3.4
Worked on section 2.1 Context Diagram and section 3.4 Use Case Diagram
</commit_message>
<xml_diff>
--- a/P1_Template_Draft.docx
+++ b/P1_Template_Draft.docx
@@ -1,6 +1,6 @@
 
 <file path=word/document.xml><?xml version="1.0" encoding="utf-8"?>
-<w:document xmlns:wpc="http://schemas.microsoft.com/office/word/2010/wordprocessingCanvas" xmlns:cx="http://schemas.microsoft.com/office/drawing/2014/chartex" xmlns:cx1="http://schemas.microsoft.com/office/drawing/2015/9/8/chartex" xmlns:cx2="http://schemas.microsoft.com/office/drawing/2015/10/21/chartex" xmlns:cx3="http://schemas.microsoft.com/office/drawing/2016/5/9/chartex" xmlns:cx4="http://schemas.microsoft.com/office/drawing/2016/5/10/chartex" xmlns:cx5="http://schemas.microsoft.com/office/drawing/2016/5/11/chartex" xmlns:cx6="http://schemas.microsoft.com/office/drawing/2016/5/12/chartex" xmlns:cx7="http://schemas.microsoft.com/office/drawing/2016/5/13/chartex" xmlns:cx8="http://schemas.microsoft.com/office/drawing/2016/5/14/chartex" xmlns:mc="http://schemas.openxmlformats.org/markup-compatibility/2006" xmlns:aink="http://schemas.microsoft.com/office/drawing/2016/ink" xmlns:am3d="http://schemas.microsoft.com/office/drawing/2017/model3d" xmlns:o="urn:schemas-microsoft-com:office:office" xmlns:oel="http://schemas.microsoft.com/office/2019/extlst" xmlns:r="http://schemas.openxmlformats.org/officeDocument/2006/relationships" xmlns:m="http://schemas.openxmlformats.org/officeDocument/2006/math" xmlns:v="urn:schemas-microsoft-com:vml" xmlns:wp14="http://schemas.microsoft.com/office/word/2010/wordprocessingDrawing" xmlns:wp="http://schemas.openxmlformats.org/drawingml/2006/wordprocessingDrawing" xmlns:w10="urn:schemas-microsoft-com:office:word" xmlns:w="http://schemas.openxmlformats.org/wordprocessingml/2006/main" xmlns:w14="http://schemas.microsoft.com/office/word/2010/wordml" xmlns:w15="http://schemas.microsoft.com/office/word/2012/wordml" xmlns:w16cex="http://schemas.microsoft.com/office/word/2018/wordml/cex" xmlns:w16cid="http://schemas.microsoft.com/office/word/2016/wordml/cid" xmlns:w16="http://schemas.microsoft.com/office/word/2018/wordml" xmlns:w16du="http://schemas.microsoft.com/office/word/2023/wordml/word16du" xmlns:w16sdtdh="http://schemas.microsoft.com/office/word/2020/wordml/sdtdatahash" xmlns:w16sdtfl="http://schemas.microsoft.com/office/word/2024/wordml/sdtformatlock" xmlns:w16se="http://schemas.microsoft.com/office/word/2015/wordml/symex" xmlns:wpg="http://schemas.microsoft.com/office/word/2010/wordprocessingGroup" xmlns:wpi="http://schemas.microsoft.com/office/word/2010/wordprocessingInk" xmlns:wne="http://schemas.microsoft.com/office/word/2006/wordml" xmlns:wps="http://schemas.microsoft.com/office/word/2010/wordprocessingShape" mc:Ignorable="w14 w15 w16se w16cid w16 w16cex w16sdtdh w16sdtfl w16du wp14">
+<w:document xmlns:wpc="http://schemas.microsoft.com/office/word/2010/wordprocessingCanvas" xmlns:cx="http://schemas.microsoft.com/office/drawing/2014/chartex" xmlns:cx1="http://schemas.microsoft.com/office/drawing/2015/9/8/chartex" xmlns:cx2="http://schemas.microsoft.com/office/drawing/2015/10/21/chartex" xmlns:cx3="http://schemas.microsoft.com/office/drawing/2016/5/9/chartex" xmlns:cx4="http://schemas.microsoft.com/office/drawing/2016/5/10/chartex" xmlns:cx5="http://schemas.microsoft.com/office/drawing/2016/5/11/chartex" xmlns:cx6="http://schemas.microsoft.com/office/drawing/2016/5/12/chartex" xmlns:cx7="http://schemas.microsoft.com/office/drawing/2016/5/13/chartex" xmlns:cx8="http://schemas.microsoft.com/office/drawing/2016/5/14/chartex" xmlns:mc="http://schemas.openxmlformats.org/markup-compatibility/2006" xmlns:aink="http://schemas.microsoft.com/office/drawing/2016/ink" xmlns:am3d="http://schemas.microsoft.com/office/drawing/2017/model3d" xmlns:o="urn:schemas-microsoft-com:office:office" xmlns:oel="http://schemas.microsoft.com/office/2019/extlst" xmlns:r="http://schemas.openxmlformats.org/officeDocument/2006/relationships" xmlns:m="http://schemas.openxmlformats.org/officeDocument/2006/math" xmlns:v="urn:schemas-microsoft-com:vml" xmlns:wp14="http://schemas.microsoft.com/office/word/2010/wordprocessingDrawing" xmlns:wp="http://schemas.openxmlformats.org/drawingml/2006/wordprocessingDrawing" xmlns:w10="urn:schemas-microsoft-com:office:word" xmlns:w="http://schemas.openxmlformats.org/wordprocessingml/2006/main" xmlns:w14="http://schemas.microsoft.com/office/word/2010/wordml" xmlns:w15="http://schemas.microsoft.com/office/word/2012/wordml" xmlns:w16cex="http://schemas.microsoft.com/office/word/2018/wordml/cex" xmlns:w16cid="http://schemas.microsoft.com/office/word/2016/wordml/cid" xmlns:w16="http://schemas.microsoft.com/office/word/2018/wordml" xmlns:w16du="http://schemas.microsoft.com/office/word/2023/wordml/word16du" xmlns:w16sdtdh="http://schemas.microsoft.com/office/word/2020/wordml/sdtdatahash" xmlns:w16sdtfl="http://schemas.microsoft.com/office/word/2024/wordml/sdtformatlock" xmlns:w16se="http://schemas.microsoft.com/office/word/2015/wordml/symex" xmlns:wpg="http://schemas.microsoft.com/office/word/2010/wordprocessingGroup" xmlns:wpi="http://schemas.microsoft.com/office/word/2010/wordprocessingInk" xmlns:wne="http://schemas.microsoft.com/office/word/2006/wordml" xmlns:wps="http://schemas.microsoft.com/office/word/2010/wordprocessingShape" xmlns:a="http://schemas.openxmlformats.org/drawingml/2006/main" xmlns:pic="http://schemas.openxmlformats.org/drawingml/2006/picture" xmlns:a14="http://schemas.microsoft.com/office/drawing/2010/main" mc:Ignorable="w14 w15 w16se w16cid w16 w16cex w16sdtdh w16sdtfl w16du wp14">
   <w:body>
     <w:p>
       <w:pPr>
@@ -17,7 +17,7 @@
         </w:rPr>
         <w:t xml:space="preserve">CE / CS / SE </w:t>
       </w:r>
-      <w:bookmarkStart w:id="0" w:name="_Int_Axartesy"/>
+      <w:bookmarkStart w:name="_Int_Axartesy" w:id="0"/>
       <w:r>
         <w:rPr>
           <w:b/>
@@ -41,7 +41,7 @@
         </w:rPr>
         <w:t xml:space="preserve">  SOFTWARE </w:t>
       </w:r>
-      <w:bookmarkStart w:id="1" w:name="_Int_T76e7iOF"/>
+      <w:bookmarkStart w:name="_Int_T76e7iOF" w:id="1"/>
       <w:r>
         <w:rPr>
           <w:b/>
@@ -72,7 +72,7 @@
       </w:pPr>
       <w:r>
         <w:rPr>
-          <w:rFonts w:ascii="Cambria" w:eastAsia="Cambria" w:hAnsi="Cambria" w:cs="Cambria"/>
+          <w:rFonts w:ascii="Cambria" w:hAnsi="Cambria" w:eastAsia="Cambria" w:cs="Cambria"/>
           <w:b/>
           <w:bCs/>
           <w:color w:val="16324F"/>
@@ -88,7 +88,7 @@
       </w:pPr>
       <w:r>
         <w:rPr>
-          <w:rFonts w:ascii="Cambria" w:eastAsia="Cambria" w:hAnsi="Cambria" w:cs="Cambria"/>
+          <w:rFonts w:ascii="Cambria" w:hAnsi="Cambria" w:eastAsia="Cambria" w:cs="Cambria"/>
           <w:b/>
           <w:bCs/>
           <w:color w:val="16324F"/>
@@ -110,7 +110,7 @@
         </w:rPr>
         <w:t>Weight 4</w:t>
       </w:r>
-      <w:bookmarkStart w:id="2" w:name="_Int_c6I3QWNn"/>
+      <w:bookmarkStart w:name="_Int_c6I3QWNn" w:id="2"/>
       <w:r>
         <w:rPr>
           <w:color w:val="5A6472"/>
@@ -128,7 +128,7 @@
         </w:rPr>
         <w:t xml:space="preserve">  Due Sunday 18 October 2026, 11:59 PM </w:t>
       </w:r>
-      <w:bookmarkStart w:id="3" w:name="_Int_2UYOr9VY"/>
+      <w:bookmarkStart w:name="_Int_2UYOr9VY" w:id="3"/>
       <w:r>
         <w:rPr>
           <w:color w:val="5A6472"/>
@@ -151,12 +151,12 @@
       <w:tblPr>
         <w:tblW w:w="10858" w:type="dxa"/>
         <w:tblBorders>
-          <w:top w:val="single" w:sz="3" w:space="0" w:color="C6CDD8"/>
-          <w:left w:val="single" w:sz="3" w:space="0" w:color="C6CDD8"/>
-          <w:bottom w:val="single" w:sz="3" w:space="0" w:color="C6CDD8"/>
-          <w:right w:val="single" w:sz="3" w:space="0" w:color="C6CDD8"/>
-          <w:insideH w:val="single" w:sz="3" w:space="0" w:color="C6CDD8"/>
-          <w:insideV w:val="single" w:sz="3" w:space="0" w:color="C6CDD8"/>
+          <w:top w:val="single" w:color="C6CDD8" w:sz="3" w:space="0"/>
+          <w:left w:val="single" w:color="C6CDD8" w:sz="3" w:space="0"/>
+          <w:bottom w:val="single" w:color="C6CDD8" w:sz="3" w:space="0"/>
+          <w:right w:val="single" w:color="C6CDD8" w:sz="3" w:space="0"/>
+          <w:insideH w:val="single" w:color="C6CDD8" w:sz="3" w:space="0"/>
+          <w:insideV w:val="single" w:color="C6CDD8" w:sz="3" w:space="0"/>
         </w:tblBorders>
         <w:tblLayout w:type="fixed"/>
         <w:tblCellMar>
@@ -456,7 +456,7 @@
                 <w:sz w:val="18"/>
                 <w:szCs w:val="18"/>
               </w:rPr>
-              <w:t>0.1</w:t>
+              <w:t>1.0</w:t>
             </w:r>
           </w:p>
         </w:tc>
@@ -503,314 +503,17 @@
     </w:tbl>
     <w:p>
       <w:pPr>
-        <w:spacing w:line="260" w:lineRule="auto"/>
-      </w:pPr>
-    </w:p>
-    <w:tbl>
-      <w:tblPr>
-        <w:tblW w:w="10858" w:type="dxa"/>
-        <w:tblBorders>
-          <w:top w:val="single" w:sz="3" w:space="0" w:color="C3D2E4"/>
-          <w:left w:val="single" w:sz="3" w:space="0" w:color="C3D2E4"/>
-          <w:bottom w:val="single" w:sz="3" w:space="0" w:color="C3D2E4"/>
-          <w:right w:val="single" w:sz="3" w:space="0" w:color="C3D2E4"/>
-          <w:insideH w:val="single" w:sz="3" w:space="0" w:color="C3D2E4"/>
-          <w:insideV w:val="single" w:sz="3" w:space="0" w:color="C3D2E4"/>
-        </w:tblBorders>
-        <w:tblLayout w:type="fixed"/>
-        <w:tblCellMar>
-          <w:left w:w="10" w:type="dxa"/>
-          <w:right w:w="10" w:type="dxa"/>
-        </w:tblCellMar>
-        <w:tblLook w:val="0000" w:firstRow="0" w:lastRow="0" w:firstColumn="0" w:lastColumn="0" w:noHBand="0" w:noVBand="0"/>
-      </w:tblPr>
-      <w:tblGrid>
-        <w:gridCol w:w="10858"/>
-      </w:tblGrid>
-      <w:tr>
-        <w:tc>
-          <w:tcPr>
-            <w:tcW w:w="10858" w:type="dxa"/>
-            <w:shd w:val="clear" w:color="auto" w:fill="EAF0F8"/>
-            <w:tcMar>
-              <w:top w:w="120" w:type="dxa"/>
-              <w:left w:w="160" w:type="dxa"/>
-              <w:bottom w:w="120" w:type="dxa"/>
-              <w:right w:w="160" w:type="dxa"/>
-            </w:tcMar>
-          </w:tcPr>
-          <w:p>
-            <w:pPr>
-              <w:spacing w:after="60" w:line="260" w:lineRule="auto"/>
-            </w:pPr>
-            <w:r>
-              <w:rPr>
-                <w:b/>
-                <w:color w:val="2F5D8A"/>
-                <w:sz w:val="19"/>
-                <w:szCs w:val="19"/>
-              </w:rPr>
-              <w:t xml:space="preserve">▸  </w:t>
-            </w:r>
-            <w:r>
-              <w:rPr>
-                <w:b/>
-                <w:caps/>
-                <w:color w:val="2F5D8A"/>
-                <w:sz w:val="17"/>
-                <w:szCs w:val="17"/>
-              </w:rPr>
-              <w:t>How to use this template</w:t>
-            </w:r>
-          </w:p>
-          <w:p>
-            <w:pPr>
-              <w:spacing w:after="50" w:line="250" w:lineRule="auto"/>
-            </w:pPr>
-            <w:r>
-              <w:rPr>
-                <w:color w:val="39424E"/>
-                <w:sz w:val="19"/>
-                <w:szCs w:val="19"/>
-              </w:rPr>
-              <w:t>This template is the structure we expect, not a form to pad out. It follows the section ordering of ISO/IEC/IEEE 29148, the current international standard for requirements engineering, so that the document you start now grows into a full requirements specification by P2 rather than being thrown away and rewritten.</w:t>
-            </w:r>
-          </w:p>
-          <w:p>
-            <w:pPr>
-              <w:spacing w:after="50" w:line="250" w:lineRule="auto"/>
-            </w:pPr>
-            <w:r>
-              <w:rPr>
-                <w:b/>
-                <w:color w:val="39424E"/>
-                <w:sz w:val="19"/>
-                <w:szCs w:val="19"/>
-              </w:rPr>
-              <w:t xml:space="preserve">Delete every blue box like this one before you submit. </w:t>
-            </w:r>
-            <w:r>
-              <w:rPr>
-                <w:color w:val="39424E"/>
-                <w:sz w:val="19"/>
-                <w:szCs w:val="19"/>
-              </w:rPr>
-              <w:t>They are instructions, not content, and a document that still contains them has not been read by its own authors.</w:t>
-            </w:r>
-          </w:p>
-          <w:p>
-            <w:pPr>
-              <w:spacing w:after="50" w:line="250" w:lineRule="auto"/>
-            </w:pPr>
-            <w:r>
-              <w:rPr>
-                <w:b/>
-                <w:color w:val="39424E"/>
-                <w:sz w:val="19"/>
-                <w:szCs w:val="19"/>
-              </w:rPr>
-              <w:t xml:space="preserve">Length: aim for 10 to 14 pages of your own content. </w:t>
-            </w:r>
-            <w:r>
-              <w:rPr>
-                <w:color w:val="39424E"/>
-                <w:sz w:val="19"/>
-                <w:szCs w:val="19"/>
-              </w:rPr>
-              <w:t>A longer document is not a better one. Every section below carries a budget; a section that runs to twice its budget is usually padded, and padding is visible.</w:t>
-            </w:r>
-          </w:p>
-        </w:tc>
-      </w:tr>
-    </w:tbl>
-    <w:p>
-      <w:pPr>
-        <w:spacing w:line="260" w:lineRule="auto"/>
-      </w:pPr>
-    </w:p>
-    <w:tbl>
-      <w:tblPr>
-        <w:tblW w:w="10858" w:type="dxa"/>
-        <w:tblBorders>
-          <w:top w:val="single" w:sz="3" w:space="0" w:color="E8C4C0"/>
-          <w:left w:val="single" w:sz="3" w:space="0" w:color="E8C4C0"/>
-          <w:bottom w:val="single" w:sz="3" w:space="0" w:color="E8C4C0"/>
-          <w:right w:val="single" w:sz="3" w:space="0" w:color="E8C4C0"/>
-          <w:insideH w:val="single" w:sz="3" w:space="0" w:color="E8C4C0"/>
-          <w:insideV w:val="single" w:sz="3" w:space="0" w:color="E8C4C0"/>
-        </w:tblBorders>
-        <w:tblLayout w:type="fixed"/>
-        <w:tblCellMar>
-          <w:left w:w="10" w:type="dxa"/>
-          <w:right w:w="10" w:type="dxa"/>
-        </w:tblCellMar>
-        <w:tblLook w:val="0000" w:firstRow="0" w:lastRow="0" w:firstColumn="0" w:lastColumn="0" w:noHBand="0" w:noVBand="0"/>
-      </w:tblPr>
-      <w:tblGrid>
-        <w:gridCol w:w="10858"/>
-      </w:tblGrid>
-      <w:tr>
-        <w:tc>
-          <w:tcPr>
-            <w:tcW w:w="10858" w:type="dxa"/>
-            <w:shd w:val="clear" w:color="auto" w:fill="FAEAE8"/>
-            <w:tcMar>
-              <w:top w:w="120" w:type="dxa"/>
-              <w:left w:w="160" w:type="dxa"/>
-              <w:bottom w:w="120" w:type="dxa"/>
-              <w:right w:w="160" w:type="dxa"/>
-            </w:tcMar>
-          </w:tcPr>
-          <w:p>
-            <w:pPr>
-              <w:spacing w:after="60" w:line="260" w:lineRule="auto"/>
-            </w:pPr>
-            <w:r>
-              <w:rPr>
-                <w:b/>
-                <w:color w:val="9B3A37"/>
-                <w:sz w:val="19"/>
-                <w:szCs w:val="19"/>
-              </w:rPr>
-              <w:t xml:space="preserve">▸  </w:t>
-            </w:r>
-            <w:r>
-              <w:rPr>
-                <w:b/>
-                <w:caps/>
-                <w:color w:val="9B3A37"/>
-                <w:sz w:val="17"/>
-                <w:szCs w:val="17"/>
-              </w:rPr>
-              <w:t>What P1 does NOT ask for</w:t>
-            </w:r>
-          </w:p>
-          <w:p>
-            <w:pPr>
-              <w:spacing w:after="50" w:line="250" w:lineRule="auto"/>
-            </w:pPr>
-            <w:r>
-              <w:rPr>
-                <w:color w:val="39424E"/>
-                <w:sz w:val="19"/>
-                <w:szCs w:val="19"/>
-              </w:rPr>
-              <w:t>P1 is a baseline, not a finished specification. At this milestone we are NOT asking for:</w:t>
-            </w:r>
-          </w:p>
-          <w:p>
-            <w:pPr>
-              <w:spacing w:after="50" w:line="250" w:lineRule="auto"/>
-            </w:pPr>
-            <w:r>
-              <w:rPr>
-                <w:b/>
-                <w:bCs/>
-                <w:color w:val="39424E"/>
-                <w:sz w:val="19"/>
-                <w:szCs w:val="19"/>
-              </w:rPr>
-              <w:t xml:space="preserve">—  a software architecture or any design decision </w:t>
-            </w:r>
-            <w:r>
-              <w:rPr>
-                <w:color w:val="39424E"/>
-                <w:sz w:val="19"/>
-                <w:szCs w:val="19"/>
-              </w:rPr>
-              <w:t>(that is P2, after Chapter 8)</w:t>
-            </w:r>
-          </w:p>
-          <w:p>
-            <w:pPr>
-              <w:spacing w:after="50" w:line="250" w:lineRule="auto"/>
-            </w:pPr>
-            <w:r>
-              <w:rPr>
-                <w:b/>
-                <w:color w:val="39424E"/>
-                <w:sz w:val="19"/>
-                <w:szCs w:val="19"/>
-              </w:rPr>
-              <w:t xml:space="preserve">—  class diagrams, sequence diagrams or state models </w:t>
-            </w:r>
-            <w:r>
-              <w:rPr>
-                <w:color w:val="39424E"/>
-                <w:sz w:val="19"/>
-                <w:szCs w:val="19"/>
-              </w:rPr>
-              <w:t>(that is P2, after Chapters 7 and 9)</w:t>
-            </w:r>
-          </w:p>
-          <w:p>
-            <w:pPr>
-              <w:spacing w:after="50" w:line="250" w:lineRule="auto"/>
-            </w:pPr>
-            <w:r>
-              <w:rPr>
-                <w:b/>
-                <w:bCs/>
-                <w:color w:val="39424E"/>
-                <w:sz w:val="19"/>
-                <w:szCs w:val="19"/>
-              </w:rPr>
-              <w:t xml:space="preserve">—  a test plan </w:t>
-            </w:r>
-            <w:r>
-              <w:rPr>
-                <w:color w:val="39424E"/>
-                <w:sz w:val="19"/>
-                <w:szCs w:val="19"/>
-              </w:rPr>
-              <w:t>(that is P3, after Chapter 11)</w:t>
-            </w:r>
-          </w:p>
-          <w:p>
-            <w:pPr>
-              <w:spacing w:after="50" w:line="250" w:lineRule="auto"/>
-            </w:pPr>
-            <w:r>
-              <w:rPr>
-                <w:b/>
-                <w:color w:val="39424E"/>
-                <w:sz w:val="19"/>
-                <w:szCs w:val="19"/>
-              </w:rPr>
-              <w:t xml:space="preserve">—  any code, screens or a working prototype </w:t>
-            </w:r>
-            <w:r>
-              <w:rPr>
-                <w:color w:val="39424E"/>
-                <w:sz w:val="19"/>
-                <w:szCs w:val="19"/>
-              </w:rPr>
-              <w:t>(P1 is marked on reasoning, not on implementation)</w:t>
-            </w:r>
-          </w:p>
-          <w:p>
-            <w:pPr>
-              <w:spacing w:after="50" w:line="250" w:lineRule="auto"/>
-            </w:pPr>
-            <w:r>
-              <w:rPr>
-                <w:color w:val="39424E"/>
-                <w:sz w:val="19"/>
-                <w:szCs w:val="19"/>
-              </w:rPr>
-              <w:t>A team that submits an architecture diagram at P1 has spent its effort in the wrong place and will not be credited for it.</w:t>
-            </w:r>
-          </w:p>
-        </w:tc>
-      </w:tr>
-    </w:tbl>
-    <w:p>
-      <w:pPr>
+        <w:pStyle w:val="Normal"/>
         <w:spacing w:line="260" w:lineRule="auto"/>
       </w:pPr>
     </w:p>
     <w:p>
       <w:pPr>
+        <w:spacing w:line="260" w:lineRule="auto"/>
+      </w:pPr>
+    </w:p>
+    <w:p>
+      <w:pPr>
         <w:pageBreakBefore/>
         <w:spacing w:line="260" w:lineRule="auto"/>
       </w:pPr>
@@ -819,13 +522,13 @@
       <w:pPr>
         <w:keepNext/>
         <w:pBdr>
-          <w:bottom w:val="single" w:sz="8" w:space="0" w:color="16324F"/>
+          <w:bottom w:val="single" w:color="16324F" w:sz="8" w:space="0"/>
         </w:pBdr>
         <w:spacing w:before="300" w:after="100" w:line="260" w:lineRule="auto"/>
       </w:pPr>
       <w:r>
         <w:rPr>
-          <w:rFonts w:ascii="Cambria" w:eastAsia="Cambria" w:hAnsi="Cambria" w:cs="Cambria"/>
+          <w:rFonts w:ascii="Cambria" w:hAnsi="Cambria" w:eastAsia="Cambria" w:cs="Cambria"/>
           <w:b/>
           <w:bCs/>
           <w:color w:val="2F5D8A"/>
@@ -836,7 +539,7 @@
       </w:r>
       <w:r>
         <w:rPr>
-          <w:rFonts w:ascii="Cambria" w:eastAsia="Cambria" w:hAnsi="Cambria" w:cs="Cambria"/>
+          <w:rFonts w:ascii="Cambria" w:hAnsi="Cambria" w:eastAsia="Cambria" w:cs="Cambria"/>
           <w:b/>
           <w:bCs/>
           <w:color w:val="16324F"/>
@@ -861,12 +564,12 @@
       <w:tblPr>
         <w:tblW w:w="10858" w:type="dxa"/>
         <w:tblBorders>
-          <w:top w:val="single" w:sz="3" w:space="0" w:color="C6CDD8"/>
-          <w:left w:val="single" w:sz="3" w:space="0" w:color="C6CDD8"/>
-          <w:bottom w:val="single" w:sz="3" w:space="0" w:color="C6CDD8"/>
-          <w:right w:val="single" w:sz="3" w:space="0" w:color="C6CDD8"/>
-          <w:insideH w:val="single" w:sz="3" w:space="0" w:color="C6CDD8"/>
-          <w:insideV w:val="single" w:sz="3" w:space="0" w:color="C6CDD8"/>
+          <w:top w:val="single" w:color="C6CDD8" w:sz="3" w:space="0"/>
+          <w:left w:val="single" w:color="C6CDD8" w:sz="3" w:space="0"/>
+          <w:bottom w:val="single" w:color="C6CDD8" w:sz="3" w:space="0"/>
+          <w:right w:val="single" w:color="C6CDD8" w:sz="3" w:space="0"/>
+          <w:insideH w:val="single" w:color="C6CDD8" w:sz="3" w:space="0"/>
+          <w:insideV w:val="single" w:color="C6CDD8" w:sz="3" w:space="0"/>
         </w:tblBorders>
         <w:tblLayout w:type="fixed"/>
         <w:tblCellMar>
@@ -1455,6 +1158,104 @@
                 <w:szCs w:val="18"/>
               </w:rPr>
               <w:t>, Section 2.2</w:t>
+            </w:r>
+          </w:p>
+        </w:tc>
+      </w:tr>
+      <w:tr>
+        <w:trPr>
+          <w:trHeight w:val="300"/>
+        </w:trPr>
+        <w:tc>
+          <w:tcPr>
+            <w:tcW w:w="1200" w:type="dxa"/>
+            <w:tcMar>
+              <w:top w:w="70" w:type="dxa"/>
+              <w:left w:w="100" w:type="dxa"/>
+              <w:bottom w:w="70" w:type="dxa"/>
+              <w:right w:w="100" w:type="dxa"/>
+            </w:tcMar>
+          </w:tcPr>
+          <w:p>
+            <w:pPr>
+              <w:pStyle w:val="Normal"/>
+            </w:pPr>
+            <w:r>
+              <w:rPr>
+                <w:sz w:val="18"/>
+                <w:szCs w:val="18"/>
+              </w:rPr>
+              <w:t>1.0</w:t>
+            </w:r>
+          </w:p>
+        </w:tc>
+        <w:tc>
+          <w:tcPr>
+            <w:tcW w:w="1600" w:type="dxa"/>
+            <w:tcMar>
+              <w:top w:w="70" w:type="dxa"/>
+              <w:left w:w="100" w:type="dxa"/>
+              <w:bottom w:w="70" w:type="dxa"/>
+              <w:right w:w="100" w:type="dxa"/>
+            </w:tcMar>
+          </w:tcPr>
+          <w:p>
+            <w:pPr>
+              <w:pStyle w:val="Normal"/>
+            </w:pPr>
+            <w:r>
+              <w:rPr>
+                <w:sz w:val="18"/>
+                <w:szCs w:val="18"/>
+              </w:rPr>
+              <w:t>10/18/2026</w:t>
+            </w:r>
+          </w:p>
+        </w:tc>
+        <w:tc>
+          <w:tcPr>
+            <w:tcW w:w="2400" w:type="dxa"/>
+            <w:tcMar>
+              <w:top w:w="70" w:type="dxa"/>
+              <w:left w:w="100" w:type="dxa"/>
+              <w:bottom w:w="70" w:type="dxa"/>
+              <w:right w:w="100" w:type="dxa"/>
+            </w:tcMar>
+          </w:tcPr>
+          <w:p>
+            <w:pPr>
+              <w:pStyle w:val="Normal"/>
+            </w:pPr>
+            <w:r>
+              <w:rPr>
+                <w:sz w:val="18"/>
+                <w:szCs w:val="18"/>
+              </w:rPr>
+              <w:t>All team members</w:t>
+            </w:r>
+          </w:p>
+        </w:tc>
+        <w:tc>
+          <w:tcPr>
+            <w:tcW w:w="5658" w:type="dxa"/>
+            <w:tcMar>
+              <w:top w:w="70" w:type="dxa"/>
+              <w:left w:w="100" w:type="dxa"/>
+              <w:bottom w:w="70" w:type="dxa"/>
+              <w:right w:w="100" w:type="dxa"/>
+            </w:tcMar>
+          </w:tcPr>
+          <w:p>
+            <w:pPr>
+              <w:pStyle w:val="Normal"/>
+              <w:spacing w:line="259" w:lineRule="auto"/>
+            </w:pPr>
+            <w:r>
+              <w:rPr>
+                <w:sz w:val="18"/>
+                <w:szCs w:val="18"/>
+              </w:rPr>
+              <w:t>Finished all proposals and requirements</w:t>
             </w:r>
           </w:p>
         </w:tc>
@@ -1495,12 +1296,12 @@
       <w:tblPr>
         <w:tblW w:w="10858" w:type="dxa"/>
         <w:tblBorders>
-          <w:top w:val="single" w:sz="3" w:space="0" w:color="C6CDD8"/>
-          <w:left w:val="single" w:sz="3" w:space="0" w:color="C6CDD8"/>
-          <w:bottom w:val="single" w:sz="3" w:space="0" w:color="C6CDD8"/>
-          <w:right w:val="single" w:sz="3" w:space="0" w:color="C6CDD8"/>
-          <w:insideH w:val="single" w:sz="3" w:space="0" w:color="C6CDD8"/>
-          <w:insideV w:val="single" w:sz="3" w:space="0" w:color="C6CDD8"/>
+          <w:top w:val="single" w:color="C6CDD8" w:sz="3" w:space="0"/>
+          <w:left w:val="single" w:color="C6CDD8" w:sz="3" w:space="0"/>
+          <w:bottom w:val="single" w:color="C6CDD8" w:sz="3" w:space="0"/>
+          <w:right w:val="single" w:color="C6CDD8" w:sz="3" w:space="0"/>
+          <w:insideH w:val="single" w:color="C6CDD8" w:sz="3" w:space="0"/>
+          <w:insideV w:val="single" w:color="C6CDD8" w:sz="3" w:space="0"/>
         </w:tblBorders>
         <w:tblLayout w:type="fixed"/>
         <w:tblCellMar>
@@ -1754,22 +1555,51 @@
             </w:tcMar>
           </w:tcPr>
           <w:p>
-            <w:hyperlink r:id="rId9">
+            <w:pPr>
+              <w:pStyle w:val="Normal"/>
+              <w:rPr>
+                <w:rFonts w:ascii="Calibri" w:hAnsi="Calibri" w:eastAsia="Calibri" w:cs="Calibri"/>
+                <w:b w:val="0"/>
+                <w:bCs w:val="0"/>
+                <w:i w:val="0"/>
+                <w:iCs w:val="0"/>
+                <w:caps w:val="0"/>
+                <w:smallCaps w:val="0"/>
+                <w:noProof w:val="0"/>
+                <w:sz w:val="21"/>
+                <w:szCs w:val="21"/>
+                <w:lang w:val="en-US"/>
+              </w:rPr>
+            </w:pPr>
+            <w:hyperlink r:id="R3a4286057f34443c">
               <w:r>
+                <w:rPr>
+                  <w:rStyle w:val="Hyperlink"/>
+                  <w:rFonts w:ascii="Calibri" w:hAnsi="Calibri" w:eastAsia="Calibri" w:cs="Calibri"/>
+                  <w:b w:val="0"/>
+                  <w:bCs w:val="0"/>
+                  <w:i w:val="0"/>
+                  <w:iCs w:val="0"/>
+                  <w:caps w:val="0"/>
+                  <w:smallCaps w:val="0"/>
+                  <w:noProof w:val="0"/>
+                  <w:sz w:val="21"/>
+                  <w:szCs w:val="21"/>
+                  <w:lang w:val="en-US"/>
+                </w:rPr>
+                <w:t>Initial upload, Part 1</w:t>
+              </w:r>
+            </w:hyperlink>
+            <w:hyperlink r:id="R4eac1e52984a44d2">
+              <w:r>
+                <w:rPr/>
                 <w:t xml:space="preserve"> </w:t>
               </w:r>
-              <w:hyperlink r:id="rId10">
-                <w:r>
-                  <w:rPr>
-                    <w:rStyle w:val="Hyperlink"/>
-                  </w:rPr>
-                  <w:t>Initial upload</w:t>
-                </w:r>
-              </w:hyperlink>
               <w:r>
-                <w:t xml:space="preserve"> · </w:t>
+                <w:rPr/>
+                <w:t xml:space="preserve">· </w:t>
               </w:r>
-              <w:hyperlink r:id="rId11">
+              <w:hyperlink r:id="R4095f581daf4417d">
                 <w:r>
                   <w:rPr>
                     <w:rStyle w:val="Hyperlink"/>
@@ -1778,9 +1608,10 @@
                 </w:r>
               </w:hyperlink>
               <w:r>
+                <w:rPr/>
                 <w:t xml:space="preserve"> · </w:t>
               </w:r>
-              <w:hyperlink r:id="rId12">
+              <w:hyperlink r:id="Rba92cdc51b4f4ae8">
                 <w:r>
                   <w:rPr>
                     <w:rStyle w:val="Hyperlink"/>
@@ -1789,6 +1620,23 @@
                 </w:r>
               </w:hyperlink>
             </w:hyperlink>
+            <w:r>
+              <w:rPr>
+                <w:rFonts w:ascii="Segoe UI" w:hAnsi="Segoe UI" w:eastAsia="Segoe UI" w:cs="Segoe UI"/>
+                <w:b w:val="0"/>
+                <w:bCs w:val="0"/>
+                <w:i w:val="0"/>
+                <w:iCs w:val="0"/>
+                <w:caps w:val="0"/>
+                <w:smallCaps w:val="0"/>
+                <w:noProof w:val="0"/>
+                <w:color w:val="000000" w:themeColor="text1" w:themeTint="FF" w:themeShade="FF"/>
+                <w:sz w:val="18"/>
+                <w:szCs w:val="18"/>
+                <w:lang w:val="en-US"/>
+              </w:rPr>
+              <w:t xml:space="preserve"> </w:t>
+            </w:r>
           </w:p>
         </w:tc>
       </w:tr>
@@ -1819,7 +1667,12 @@
               <w:right w:w="100" w:type="dxa"/>
             </w:tcMar>
           </w:tcPr>
-          <w:p/>
+          <w:p>
+            <w:r>
+              <w:rPr/>
+              <w:t>Worked on section 2.1 and section 3.4</w:t>
+            </w:r>
+          </w:p>
         </w:tc>
         <w:tc>
           <w:tcPr>
@@ -1831,7 +1684,19 @@
               <w:right w:w="100" w:type="dxa"/>
             </w:tcMar>
           </w:tcPr>
-          <w:p/>
+          <w:p>
+            <w:pPr>
+              <w:pStyle w:val="Normal"/>
+            </w:pPr>
+            <w:hyperlink r:id="Rd31fe4871186459e">
+              <w:r>
+                <w:rPr>
+                  <w:rStyle w:val="Hyperlink"/>
+                </w:rPr>
+                <w:t>Section 2.1 Context Diagram, Section 3.4 Use Case Diagram</w:t>
+              </w:r>
+            </w:hyperlink>
+          </w:p>
         </w:tc>
       </w:tr>
       <w:tr>
@@ -1868,7 +1733,7 @@
             <w:r>
               <w:t xml:space="preserve">part 2 product </w:t>
             </w:r>
-            <w:bookmarkStart w:id="4" w:name="_Int_k8o3kjre"/>
+            <w:bookmarkStart w:name="_Int_k8o3kjre" w:id="4"/>
             <w:r>
               <w:t>perspective(</w:t>
             </w:r>
@@ -1894,7 +1759,7 @@
             <w:r>
               <w:t xml:space="preserve"> and initial use </w:t>
             </w:r>
-            <w:bookmarkStart w:id="5" w:name="_Int_0ekLGNH8"/>
+            <w:bookmarkStart w:name="_Int_0ekLGNH8" w:id="5"/>
             <w:r>
               <w:t>case</w:t>
             </w:r>
@@ -1923,7 +1788,7 @@
             <w:r>
               <w:t xml:space="preserve"> and part 4 </w:t>
             </w:r>
-            <w:bookmarkStart w:id="6" w:name="_Int_U8z4w0Fv"/>
+            <w:bookmarkStart w:name="_Int_U8z4w0Fv" w:id="6"/>
             <w:r>
               <w:t>risks</w:t>
             </w:r>
@@ -2052,6 +1917,14 @@
             <w:r>
               <w:t xml:space="preserve"> · </w:t>
             </w:r>
+            <w:hyperlink r:id="rId18">
+              <w:r>
+                <w:rPr>
+                  <w:rStyle w:val="Hyperlink"/>
+                </w:rPr>
+                <w:t>Section 3.5</w:t>
+              </w:r>
+            </w:hyperlink>
           </w:p>
         </w:tc>
       </w:tr>
@@ -2113,6 +1986,16 @@
               <w:right w:w="100" w:type="dxa"/>
             </w:tcMar>
           </w:tcPr>
+          <w:p>
+            <w:hyperlink r:id="R69973e91ddbb4838">
+              <w:r>
+                <w:rPr>
+                  <w:rStyle w:val="Hyperlink"/>
+                </w:rPr>
+                <w:t>Section 3.4 — Expanded Use Cases UC-02 and UC-05</w:t>
+              </w:r>
+            </w:hyperlink>
+          </w:p>
           <w:p/>
         </w:tc>
       </w:tr>
@@ -2126,13 +2009,13 @@
       <w:pPr>
         <w:keepNext/>
         <w:pBdr>
-          <w:bottom w:val="single" w:sz="8" w:space="0" w:color="16324F"/>
+          <w:bottom w:val="single" w:color="16324F" w:sz="8" w:space="0"/>
         </w:pBdr>
         <w:spacing w:before="300" w:after="100" w:line="260" w:lineRule="auto"/>
       </w:pPr>
       <w:r>
         <w:rPr>
-          <w:rFonts w:ascii="Cambria" w:eastAsia="Cambria" w:hAnsi="Cambria" w:cs="Cambria"/>
+          <w:rFonts w:ascii="Cambria" w:hAnsi="Cambria" w:eastAsia="Cambria" w:cs="Cambria"/>
           <w:b/>
           <w:bCs/>
           <w:color w:val="2F5D8A"/>
@@ -2143,7 +2026,7 @@
       </w:r>
       <w:r>
         <w:rPr>
-          <w:rFonts w:ascii="Cambria" w:eastAsia="Cambria" w:hAnsi="Cambria" w:cs="Cambria"/>
+          <w:rFonts w:ascii="Cambria" w:hAnsi="Cambria" w:eastAsia="Cambria" w:cs="Cambria"/>
           <w:b/>
           <w:bCs/>
           <w:color w:val="16324F"/>
@@ -2183,12 +2066,12 @@
       <w:tblPr>
         <w:tblW w:w="10858" w:type="dxa"/>
         <w:tblBorders>
-          <w:top w:val="single" w:sz="3" w:space="0" w:color="C6CDD8"/>
-          <w:left w:val="single" w:sz="3" w:space="0" w:color="C6CDD8"/>
-          <w:bottom w:val="single" w:sz="3" w:space="0" w:color="C6CDD8"/>
-          <w:right w:val="single" w:sz="3" w:space="0" w:color="C6CDD8"/>
-          <w:insideH w:val="single" w:sz="3" w:space="0" w:color="C6CDD8"/>
-          <w:insideV w:val="single" w:sz="3" w:space="0" w:color="C6CDD8"/>
+          <w:top w:val="single" w:color="C6CDD8" w:sz="3" w:space="0"/>
+          <w:left w:val="single" w:color="C6CDD8" w:sz="3" w:space="0"/>
+          <w:bottom w:val="single" w:color="C6CDD8" w:sz="3" w:space="0"/>
+          <w:right w:val="single" w:color="C6CDD8" w:sz="3" w:space="0"/>
+          <w:insideH w:val="single" w:color="C6CDD8" w:sz="3" w:space="0"/>
+          <w:insideV w:val="single" w:color="C6CDD8" w:sz="3" w:space="0"/>
         </w:tblBorders>
         <w:tblLayout w:type="fixed"/>
         <w:tblCellMar>
@@ -2312,12 +2195,12 @@
       <w:tblPr>
         <w:tblW w:w="10858" w:type="dxa"/>
         <w:tblBorders>
-          <w:top w:val="single" w:sz="3" w:space="0" w:color="C6CDD8"/>
-          <w:left w:val="single" w:sz="3" w:space="0" w:color="C6CDD8"/>
-          <w:bottom w:val="single" w:sz="3" w:space="0" w:color="C6CDD8"/>
-          <w:right w:val="single" w:sz="3" w:space="0" w:color="C6CDD8"/>
-          <w:insideH w:val="single" w:sz="3" w:space="0" w:color="C6CDD8"/>
-          <w:insideV w:val="single" w:sz="3" w:space="0" w:color="C6CDD8"/>
+          <w:top w:val="single" w:color="C6CDD8" w:sz="3" w:space="0"/>
+          <w:left w:val="single" w:color="C6CDD8" w:sz="3" w:space="0"/>
+          <w:bottom w:val="single" w:color="C6CDD8" w:sz="3" w:space="0"/>
+          <w:right w:val="single" w:color="C6CDD8" w:sz="3" w:space="0"/>
+          <w:insideH w:val="single" w:color="C6CDD8" w:sz="3" w:space="0"/>
+          <w:insideV w:val="single" w:color="C6CDD8" w:sz="3" w:space="0"/>
         </w:tblBorders>
         <w:tblLayout w:type="fixed"/>
         <w:tblCellMar>
@@ -2642,7 +2525,24 @@
           </w:tcPr>
           <w:p>
             <w:r>
-              <w:t>Send email notifications regarding status of the room reservation (confirmation/cancellation).</w:t>
+              <w:rPr/>
+              <w:t xml:space="preserve">Send email notifications </w:t>
+            </w:r>
+            <w:r>
+              <w:rPr/>
+              <w:t>regarding</w:t>
+            </w:r>
+            <w:r>
+              <w:rPr/>
+              <w:t xml:space="preserve"> </w:t>
+            </w:r>
+            <w:r>
+              <w:rPr/>
+              <w:t>the status</w:t>
+            </w:r>
+            <w:r>
+              <w:rPr/>
+              <w:t xml:space="preserve"> of the room reservation (confirmation/cancellation).</w:t>
             </w:r>
           </w:p>
         </w:tc>
@@ -2682,12 +2582,12 @@
       <w:tblPr>
         <w:tblW w:w="10858" w:type="dxa"/>
         <w:tblBorders>
-          <w:top w:val="single" w:sz="3" w:space="0" w:color="C6CDD8"/>
-          <w:left w:val="single" w:sz="3" w:space="0" w:color="C6CDD8"/>
-          <w:bottom w:val="single" w:sz="3" w:space="0" w:color="C6CDD8"/>
-          <w:right w:val="single" w:sz="3" w:space="0" w:color="C6CDD8"/>
-          <w:insideH w:val="single" w:sz="3" w:space="0" w:color="C6CDD8"/>
-          <w:insideV w:val="single" w:sz="3" w:space="0" w:color="C6CDD8"/>
+          <w:top w:val="single" w:color="C6CDD8" w:sz="3" w:space="0"/>
+          <w:left w:val="single" w:color="C6CDD8" w:sz="3" w:space="0"/>
+          <w:bottom w:val="single" w:color="C6CDD8" w:sz="3" w:space="0"/>
+          <w:right w:val="single" w:color="C6CDD8" w:sz="3" w:space="0"/>
+          <w:insideH w:val="single" w:color="C6CDD8" w:sz="3" w:space="0"/>
+          <w:insideV w:val="single" w:color="C6CDD8" w:sz="3" w:space="0"/>
         </w:tblBorders>
         <w:tblLayout w:type="fixed"/>
         <w:tblCellMar>
@@ -2783,12 +2683,12 @@
       <w:tblPr>
         <w:tblW w:w="10858" w:type="dxa"/>
         <w:tblBorders>
-          <w:top w:val="single" w:sz="3" w:space="0" w:color="C6CDD8"/>
-          <w:left w:val="single" w:sz="3" w:space="0" w:color="C6CDD8"/>
-          <w:bottom w:val="single" w:sz="3" w:space="0" w:color="C6CDD8"/>
-          <w:right w:val="single" w:sz="3" w:space="0" w:color="C6CDD8"/>
-          <w:insideH w:val="single" w:sz="3" w:space="0" w:color="C6CDD8"/>
-          <w:insideV w:val="single" w:sz="3" w:space="0" w:color="C6CDD8"/>
+          <w:top w:val="single" w:color="C6CDD8" w:sz="3" w:space="0"/>
+          <w:left w:val="single" w:color="C6CDD8" w:sz="3" w:space="0"/>
+          <w:bottom w:val="single" w:color="C6CDD8" w:sz="3" w:space="0"/>
+          <w:right w:val="single" w:color="C6CDD8" w:sz="3" w:space="0"/>
+          <w:insideH w:val="single" w:color="C6CDD8" w:sz="3" w:space="0"/>
+          <w:insideV w:val="single" w:color="C6CDD8" w:sz="3" w:space="0"/>
         </w:tblBorders>
         <w:tblLayout w:type="fixed"/>
         <w:tblCellMar>
@@ -3078,12 +2978,12 @@
       <w:tblPr>
         <w:tblW w:w="10858" w:type="dxa"/>
         <w:tblBorders>
-          <w:top w:val="single" w:sz="3" w:space="0" w:color="C6CDD8"/>
-          <w:left w:val="single" w:sz="3" w:space="0" w:color="C6CDD8"/>
-          <w:bottom w:val="single" w:sz="3" w:space="0" w:color="C6CDD8"/>
-          <w:right w:val="single" w:sz="3" w:space="0" w:color="C6CDD8"/>
-          <w:insideH w:val="single" w:sz="3" w:space="0" w:color="C6CDD8"/>
-          <w:insideV w:val="single" w:sz="3" w:space="0" w:color="C6CDD8"/>
+          <w:top w:val="single" w:color="C6CDD8" w:sz="3" w:space="0"/>
+          <w:left w:val="single" w:color="C6CDD8" w:sz="3" w:space="0"/>
+          <w:bottom w:val="single" w:color="C6CDD8" w:sz="3" w:space="0"/>
+          <w:right w:val="single" w:color="C6CDD8" w:sz="3" w:space="0"/>
+          <w:insideH w:val="single" w:color="C6CDD8" w:sz="3" w:space="0"/>
+          <w:insideV w:val="single" w:color="C6CDD8" w:sz="3" w:space="0"/>
         </w:tblBorders>
         <w:tblLayout w:type="fixed"/>
         <w:tblCellMar>
@@ -3124,7 +3024,7 @@
             <w:r>
               <w:t xml:space="preserve">UTD library policies; </w:t>
             </w:r>
-            <w:hyperlink r:id="rId18">
+            <w:hyperlink r:id="rId19">
               <w:r>
                 <w:rPr>
                   <w:rStyle w:val="Hyperlink"/>
@@ -3146,7 +3046,7 @@
             <w:r>
               <w:t xml:space="preserve">; </w:t>
             </w:r>
-            <w:hyperlink r:id="rId19">
+            <w:hyperlink r:id="rId20">
               <w:r>
                 <w:rPr>
                   <w:rStyle w:val="Hyperlink"/>
@@ -3170,13 +3070,13 @@
       <w:pPr>
         <w:keepNext/>
         <w:pBdr>
-          <w:bottom w:val="single" w:sz="8" w:space="0" w:color="16324F"/>
+          <w:bottom w:val="single" w:color="16324F" w:sz="8" w:space="0"/>
         </w:pBdr>
         <w:spacing w:before="300" w:after="100" w:line="260" w:lineRule="auto"/>
       </w:pPr>
       <w:r>
         <w:rPr>
-          <w:rFonts w:ascii="Cambria" w:eastAsia="Cambria" w:hAnsi="Cambria" w:cs="Cambria"/>
+          <w:rFonts w:ascii="Cambria" w:hAnsi="Cambria" w:eastAsia="Cambria" w:cs="Cambria"/>
           <w:b/>
           <w:bCs/>
           <w:color w:val="2F5D8A"/>
@@ -3187,7 +3087,7 @@
       </w:r>
       <w:r>
         <w:rPr>
-          <w:rFonts w:ascii="Cambria" w:eastAsia="Cambria" w:hAnsi="Cambria" w:cs="Cambria"/>
+          <w:rFonts w:ascii="Cambria" w:hAnsi="Cambria" w:eastAsia="Cambria" w:cs="Cambria"/>
           <w:b/>
           <w:bCs/>
           <w:color w:val="16324F"/>
@@ -3227,12 +3127,12 @@
       <w:tblPr>
         <w:tblW w:w="10858" w:type="dxa"/>
         <w:tblBorders>
-          <w:top w:val="single" w:sz="3" w:space="0" w:color="C6CDD8"/>
-          <w:left w:val="single" w:sz="3" w:space="0" w:color="C6CDD8"/>
-          <w:bottom w:val="single" w:sz="3" w:space="0" w:color="C6CDD8"/>
-          <w:right w:val="single" w:sz="3" w:space="0" w:color="C6CDD8"/>
-          <w:insideH w:val="single" w:sz="3" w:space="0" w:color="C6CDD8"/>
-          <w:insideV w:val="single" w:sz="3" w:space="0" w:color="C6CDD8"/>
+          <w:top w:val="single" w:color="C6CDD8" w:sz="3" w:space="0"/>
+          <w:left w:val="single" w:color="C6CDD8" w:sz="3" w:space="0"/>
+          <w:bottom w:val="single" w:color="C6CDD8" w:sz="3" w:space="0"/>
+          <w:right w:val="single" w:color="C6CDD8" w:sz="3" w:space="0"/>
+          <w:insideH w:val="single" w:color="C6CDD8" w:sz="3" w:space="0"/>
+          <w:insideV w:val="single" w:color="C6CDD8" w:sz="3" w:space="0"/>
         </w:tblBorders>
         <w:tblLayout w:type="fixed"/>
         <w:tblCellMar>
@@ -3279,7 +3179,7 @@
                           <pic:cNvPicPr/>
                         </pic:nvPicPr>
                         <pic:blipFill>
-                          <a:blip r:embed="rId20">
+                          <a:blip r:embed="rId21">
                             <a:extLst>
                               <a:ext uri="{28A0092B-C50C-407E-A947-70E740481C1C}">
                                 <a14:useLocalDpi xmlns:a14="http://schemas.microsoft.com/office/drawing/2010/main"/>
@@ -3353,12 +3253,12 @@
       <w:tblPr>
         <w:tblW w:w="10858" w:type="dxa"/>
         <w:tblBorders>
-          <w:top w:val="single" w:sz="3" w:space="0" w:color="C6CDD8"/>
-          <w:left w:val="single" w:sz="3" w:space="0" w:color="C6CDD8"/>
-          <w:bottom w:val="single" w:sz="3" w:space="0" w:color="C6CDD8"/>
-          <w:right w:val="single" w:sz="3" w:space="0" w:color="C6CDD8"/>
-          <w:insideH w:val="single" w:sz="3" w:space="0" w:color="C6CDD8"/>
-          <w:insideV w:val="single" w:sz="3" w:space="0" w:color="C6CDD8"/>
+          <w:top w:val="single" w:color="C6CDD8" w:sz="3" w:space="0"/>
+          <w:left w:val="single" w:color="C6CDD8" w:sz="3" w:space="0"/>
+          <w:bottom w:val="single" w:color="C6CDD8" w:sz="3" w:space="0"/>
+          <w:right w:val="single" w:color="C6CDD8" w:sz="3" w:space="0"/>
+          <w:insideH w:val="single" w:color="C6CDD8" w:sz="3" w:space="0"/>
+          <w:insideV w:val="single" w:color="C6CDD8" w:sz="3" w:space="0"/>
         </w:tblBorders>
         <w:tblLayout w:type="fixed"/>
         <w:tblCellMar>
@@ -3889,12 +3789,12 @@
       <w:tblPr>
         <w:tblW w:w="10858" w:type="dxa"/>
         <w:tblBorders>
-          <w:top w:val="single" w:sz="3" w:space="0" w:color="C6CDD8"/>
-          <w:left w:val="single" w:sz="3" w:space="0" w:color="C6CDD8"/>
-          <w:bottom w:val="single" w:sz="3" w:space="0" w:color="C6CDD8"/>
-          <w:right w:val="single" w:sz="3" w:space="0" w:color="C6CDD8"/>
-          <w:insideH w:val="single" w:sz="3" w:space="0" w:color="C6CDD8"/>
-          <w:insideV w:val="single" w:sz="3" w:space="0" w:color="C6CDD8"/>
+          <w:top w:val="single" w:color="C6CDD8" w:sz="3" w:space="0"/>
+          <w:left w:val="single" w:color="C6CDD8" w:sz="3" w:space="0"/>
+          <w:bottom w:val="single" w:color="C6CDD8" w:sz="3" w:space="0"/>
+          <w:right w:val="single" w:color="C6CDD8" w:sz="3" w:space="0"/>
+          <w:insideH w:val="single" w:color="C6CDD8" w:sz="3" w:space="0"/>
+          <w:insideV w:val="single" w:color="C6CDD8" w:sz="3" w:space="0"/>
         </w:tblBorders>
         <w:tblLayout w:type="fixed"/>
         <w:tblCellMar>
@@ -4008,12 +3908,12 @@
       <w:tblPr>
         <w:tblW w:w="10858" w:type="dxa"/>
         <w:tblBorders>
-          <w:top w:val="single" w:sz="3" w:space="0" w:color="C6CDD8"/>
-          <w:left w:val="single" w:sz="3" w:space="0" w:color="C6CDD8"/>
-          <w:bottom w:val="single" w:sz="3" w:space="0" w:color="C6CDD8"/>
-          <w:right w:val="single" w:sz="3" w:space="0" w:color="C6CDD8"/>
-          <w:insideH w:val="single" w:sz="3" w:space="0" w:color="C6CDD8"/>
-          <w:insideV w:val="single" w:sz="3" w:space="0" w:color="C6CDD8"/>
+          <w:top w:val="single" w:color="C6CDD8" w:sz="3" w:space="0"/>
+          <w:left w:val="single" w:color="C6CDD8" w:sz="3" w:space="0"/>
+          <w:bottom w:val="single" w:color="C6CDD8" w:sz="3" w:space="0"/>
+          <w:right w:val="single" w:color="C6CDD8" w:sz="3" w:space="0"/>
+          <w:insideH w:val="single" w:color="C6CDD8" w:sz="3" w:space="0"/>
+          <w:insideV w:val="single" w:color="C6CDD8" w:sz="3" w:space="0"/>
         </w:tblBorders>
         <w:tblLayout w:type="fixed"/>
         <w:tblCellMar>
@@ -4113,12 +4013,12 @@
       <w:tblPr>
         <w:tblW w:w="10858" w:type="dxa"/>
         <w:tblBorders>
-          <w:top w:val="single" w:sz="3" w:space="0" w:color="C6CDD8"/>
-          <w:left w:val="single" w:sz="3" w:space="0" w:color="C6CDD8"/>
-          <w:bottom w:val="single" w:sz="3" w:space="0" w:color="C6CDD8"/>
-          <w:right w:val="single" w:sz="3" w:space="0" w:color="C6CDD8"/>
-          <w:insideH w:val="single" w:sz="3" w:space="0" w:color="C6CDD8"/>
-          <w:insideV w:val="single" w:sz="3" w:space="0" w:color="C6CDD8"/>
+          <w:top w:val="single" w:color="C6CDD8" w:sz="3" w:space="0"/>
+          <w:left w:val="single" w:color="C6CDD8" w:sz="3" w:space="0"/>
+          <w:bottom w:val="single" w:color="C6CDD8" w:sz="3" w:space="0"/>
+          <w:right w:val="single" w:color="C6CDD8" w:sz="3" w:space="0"/>
+          <w:insideH w:val="single" w:color="C6CDD8" w:sz="3" w:space="0"/>
+          <w:insideV w:val="single" w:color="C6CDD8" w:sz="3" w:space="0"/>
         </w:tblBorders>
         <w:tblLayout w:type="fixed"/>
         <w:tblCellMar>
@@ -4435,12 +4335,12 @@
       <w:tblPr>
         <w:tblW w:w="10858" w:type="dxa"/>
         <w:tblBorders>
-          <w:top w:val="single" w:sz="3" w:space="0" w:color="C3D2E4"/>
-          <w:left w:val="single" w:sz="3" w:space="0" w:color="C3D2E4"/>
-          <w:bottom w:val="single" w:sz="3" w:space="0" w:color="C3D2E4"/>
-          <w:right w:val="single" w:sz="3" w:space="0" w:color="C3D2E4"/>
-          <w:insideH w:val="single" w:sz="3" w:space="0" w:color="C3D2E4"/>
-          <w:insideV w:val="single" w:sz="3" w:space="0" w:color="C3D2E4"/>
+          <w:top w:val="single" w:color="C3D2E4" w:sz="3" w:space="0"/>
+          <w:left w:val="single" w:color="C3D2E4" w:sz="3" w:space="0"/>
+          <w:bottom w:val="single" w:color="C3D2E4" w:sz="3" w:space="0"/>
+          <w:right w:val="single" w:color="C3D2E4" w:sz="3" w:space="0"/>
+          <w:insideH w:val="single" w:color="C3D2E4" w:sz="3" w:space="0"/>
+          <w:insideV w:val="single" w:color="C3D2E4" w:sz="3" w:space="0"/>
         </w:tblBorders>
         <w:tblLayout w:type="fixed"/>
         <w:tblCellMar>
@@ -4455,88 +4355,14 @@
         <w:gridCol w:w="7158"/>
       </w:tblGrid>
       <w:tr>
-        <w:tc>
-          <w:tcPr>
-            <w:tcW w:w="10858" w:type="dxa"/>
-            <w:gridSpan w:val="3"/>
-            <w:shd w:val="clear" w:color="auto" w:fill="EAF0F8"/>
-            <w:tcMar>
-              <w:top w:w="120" w:type="dxa"/>
-              <w:left w:w="160" w:type="dxa"/>
-              <w:bottom w:w="120" w:type="dxa"/>
-              <w:right w:w="160" w:type="dxa"/>
-            </w:tcMar>
-          </w:tcPr>
-          <w:p>
-            <w:pPr>
-              <w:spacing w:after="60" w:line="260" w:lineRule="auto"/>
-            </w:pPr>
-            <w:r>
-              <w:rPr>
-                <w:b/>
-                <w:color w:val="2F5D8A"/>
-                <w:sz w:val="19"/>
-                <w:szCs w:val="19"/>
-              </w:rPr>
-              <w:t xml:space="preserve">▸  </w:t>
-            </w:r>
-            <w:r>
-              <w:rPr>
-                <w:b/>
-                <w:caps/>
-                <w:color w:val="2F5D8A"/>
-                <w:sz w:val="17"/>
-                <w:szCs w:val="17"/>
-              </w:rPr>
-              <w:t>WHAT GOES HERE</w:t>
-            </w:r>
-          </w:p>
-          <w:p>
-            <w:pPr>
-              <w:spacing w:after="50" w:line="250" w:lineRule="auto"/>
-            </w:pPr>
-            <w:r>
-              <w:rPr>
-                <w:color w:val="39424E"/>
-                <w:sz w:val="19"/>
-                <w:szCs w:val="19"/>
-              </w:rPr>
-              <w:t>Four short verdicts, each with the evidence behind it. This is the Chapter 4 material, applied to your own project.</w:t>
-            </w:r>
-          </w:p>
-          <w:p>
-            <w:pPr>
-              <w:spacing w:after="50" w:line="250" w:lineRule="auto"/>
-            </w:pPr>
-            <w:r>
-              <w:rPr>
-                <w:b/>
-                <w:color w:val="39424E"/>
-                <w:sz w:val="19"/>
-                <w:szCs w:val="19"/>
-              </w:rPr>
-              <w:t xml:space="preserve">A verdict with no evidence is an opinion. </w:t>
-            </w:r>
-            <w:r>
-              <w:rPr>
-                <w:color w:val="39424E"/>
-                <w:sz w:val="19"/>
-                <w:szCs w:val="19"/>
-              </w:rPr>
-              <w:t>“Technically feasible — two team members have used this framework before, see repository /spike-01” is evidence. “We think we can do it” is not.</w:t>
-            </w:r>
-          </w:p>
-        </w:tc>
-      </w:tr>
-      <w:tr>
         <w:tblPrEx>
           <w:tblBorders>
-            <w:top w:val="single" w:sz="3" w:space="0" w:color="C6CDD8"/>
-            <w:left w:val="single" w:sz="3" w:space="0" w:color="C6CDD8"/>
-            <w:bottom w:val="single" w:sz="3" w:space="0" w:color="C6CDD8"/>
-            <w:right w:val="single" w:sz="3" w:space="0" w:color="C6CDD8"/>
-            <w:insideH w:val="single" w:sz="3" w:space="0" w:color="C6CDD8"/>
-            <w:insideV w:val="single" w:sz="3" w:space="0" w:color="C6CDD8"/>
+            <w:top w:val="single" w:color="C6CDD8" w:sz="3" w:space="0"/>
+            <w:left w:val="single" w:color="C6CDD8" w:sz="3" w:space="0"/>
+            <w:bottom w:val="single" w:color="C6CDD8" w:sz="3" w:space="0"/>
+            <w:right w:val="single" w:color="C6CDD8" w:sz="3" w:space="0"/>
+            <w:insideH w:val="single" w:color="C6CDD8" w:sz="3" w:space="0"/>
+            <w:insideV w:val="single" w:color="C6CDD8" w:sz="3" w:space="0"/>
           </w:tblBorders>
         </w:tblPrEx>
         <w:trPr>
@@ -4545,6 +4371,12 @@
         <w:tc>
           <w:tcPr>
             <w:tcW w:w="2200" w:type="dxa"/>
+            <w:tcBorders>
+              <w:top w:val="single" w:color="C6CDD8" w:sz="3"/>
+              <w:left w:val="single" w:color="C6CDD8" w:sz="3"/>
+              <w:bottom w:val="single" w:color="C6CDD8" w:sz="3"/>
+              <w:right w:val="single" w:color="C6CDD8" w:sz="3"/>
+            </w:tcBorders>
             <w:shd w:val="clear" w:color="auto" w:fill="EAF0F8"/>
             <w:tcMar>
               <w:top w:w="70" w:type="dxa"/>
@@ -4572,6 +4404,12 @@
         <w:tc>
           <w:tcPr>
             <w:tcW w:w="1500" w:type="dxa"/>
+            <w:tcBorders>
+              <w:top w:val="single" w:color="C6CDD8" w:sz="3"/>
+              <w:left w:val="single" w:color="C6CDD8" w:sz="3"/>
+              <w:bottom w:val="single" w:color="C6CDD8" w:sz="3"/>
+              <w:right w:val="single" w:color="C6CDD8" w:sz="3"/>
+            </w:tcBorders>
             <w:shd w:val="clear" w:color="auto" w:fill="EAF0F8"/>
             <w:tcMar>
               <w:top w:w="70" w:type="dxa"/>
@@ -4599,6 +4437,12 @@
         <w:tc>
           <w:tcPr>
             <w:tcW w:w="7158" w:type="dxa"/>
+            <w:tcBorders>
+              <w:top w:val="single" w:color="C6CDD8" w:sz="3"/>
+              <w:left w:val="single" w:color="C6CDD8" w:sz="3"/>
+              <w:bottom w:val="single" w:color="C6CDD8" w:sz="3"/>
+              <w:right w:val="single" w:color="C6CDD8" w:sz="3"/>
+            </w:tcBorders>
             <w:shd w:val="clear" w:color="auto" w:fill="EAF0F8"/>
             <w:tcMar>
               <w:top w:w="70" w:type="dxa"/>
@@ -4627,17 +4471,23 @@
       <w:tr>
         <w:tblPrEx>
           <w:tblBorders>
-            <w:top w:val="single" w:sz="3" w:space="0" w:color="C6CDD8"/>
-            <w:left w:val="single" w:sz="3" w:space="0" w:color="C6CDD8"/>
-            <w:bottom w:val="single" w:sz="3" w:space="0" w:color="C6CDD8"/>
-            <w:right w:val="single" w:sz="3" w:space="0" w:color="C6CDD8"/>
-            <w:insideH w:val="single" w:sz="3" w:space="0" w:color="C6CDD8"/>
-            <w:insideV w:val="single" w:sz="3" w:space="0" w:color="C6CDD8"/>
+            <w:top w:val="single" w:color="C6CDD8" w:sz="3" w:space="0"/>
+            <w:left w:val="single" w:color="C6CDD8" w:sz="3" w:space="0"/>
+            <w:bottom w:val="single" w:color="C6CDD8" w:sz="3" w:space="0"/>
+            <w:right w:val="single" w:color="C6CDD8" w:sz="3" w:space="0"/>
+            <w:insideH w:val="single" w:color="C6CDD8" w:sz="3" w:space="0"/>
+            <w:insideV w:val="single" w:color="C6CDD8" w:sz="3" w:space="0"/>
           </w:tblBorders>
         </w:tblPrEx>
         <w:tc>
           <w:tcPr>
             <w:tcW w:w="2200" w:type="dxa"/>
+            <w:tcBorders>
+              <w:top w:val="single" w:color="C6CDD8" w:sz="3"/>
+              <w:left w:val="single" w:color="C6CDD8" w:sz="3"/>
+              <w:bottom w:val="single" w:color="C6CDD8" w:sz="3"/>
+              <w:right w:val="single" w:color="C6CDD8" w:sz="3"/>
+            </w:tcBorders>
             <w:tcMar>
               <w:top w:w="70" w:type="dxa"/>
               <w:left w:w="100" w:type="dxa"/>
@@ -4659,6 +4509,12 @@
         <w:tc>
           <w:tcPr>
             <w:tcW w:w="1500" w:type="dxa"/>
+            <w:tcBorders>
+              <w:top w:val="single" w:color="C6CDD8" w:sz="3"/>
+              <w:left w:val="single" w:color="C6CDD8" w:sz="3"/>
+              <w:bottom w:val="single" w:color="C6CDD8" w:sz="3"/>
+              <w:right w:val="single" w:color="C6CDD8" w:sz="3"/>
+            </w:tcBorders>
             <w:tcMar>
               <w:top w:w="70" w:type="dxa"/>
               <w:left w:w="100" w:type="dxa"/>
@@ -4675,6 +4531,12 @@
         <w:tc>
           <w:tcPr>
             <w:tcW w:w="7158" w:type="dxa"/>
+            <w:tcBorders>
+              <w:top w:val="single" w:color="C6CDD8" w:sz="3"/>
+              <w:left w:val="single" w:color="C6CDD8" w:sz="3"/>
+              <w:bottom w:val="single" w:color="C6CDD8" w:sz="3"/>
+              <w:right w:val="single" w:color="C6CDD8" w:sz="3"/>
+            </w:tcBorders>
             <w:tcMar>
               <w:top w:w="70" w:type="dxa"/>
               <w:left w:w="100" w:type="dxa"/>
@@ -4687,31 +4549,52 @@
               <w:spacing w:line="259" w:lineRule="auto"/>
             </w:pPr>
             <w:r>
+              <w:rPr/>
               <w:t>The functions that the project needs involve room listings, time-slot searches, reservation records, and conflict checks.</w:t>
             </w:r>
             <w:r>
+              <w:rPr/>
               <w:t xml:space="preserve"> </w:t>
             </w:r>
             <w:r>
+              <w:rPr/>
               <w:t>To</w:t>
             </w:r>
             <w:r>
+              <w:rPr/>
               <w:t xml:space="preserve"> </w:t>
             </w:r>
             <w:r>
+              <w:rPr/>
               <w:t>tell</w:t>
             </w:r>
             <w:r>
-              <w:t xml:space="preserve"> if this is technically feasible we will need to include a working proof of concept, repository code, and tes</w:t>
-            </w:r>
-            <w:r>
+              <w:rPr/>
+              <w:t xml:space="preserve"> if this is technically </w:t>
+            </w:r>
+            <w:r>
+              <w:rPr/>
+              <w:t>feasible,</w:t>
+            </w:r>
+            <w:r>
+              <w:rPr/>
+              <w:t xml:space="preserve"> we will need to include a working proof of concept, repository code, and tes</w:t>
+            </w:r>
+            <w:r>
+              <w:rPr/>
               <w:t xml:space="preserve">ts to check if the </w:t>
             </w:r>
             <w:r>
+              <w:rPr/>
               <w:t>requirements</w:t>
             </w:r>
             <w:r>
-              <w:t xml:space="preserve"> can be met. Until then this will remain potentially feasible</w:t>
+              <w:rPr/>
+              <w:t xml:space="preserve"> can be met. Until then this will remain potentially </w:t>
+            </w:r>
+            <w:r>
+              <w:rPr/>
+              <w:t>feasible</w:t>
             </w:r>
           </w:p>
         </w:tc>
@@ -4719,17 +4602,23 @@
       <w:tr>
         <w:tblPrEx>
           <w:tblBorders>
-            <w:top w:val="single" w:sz="3" w:space="0" w:color="C6CDD8"/>
-            <w:left w:val="single" w:sz="3" w:space="0" w:color="C6CDD8"/>
-            <w:bottom w:val="single" w:sz="3" w:space="0" w:color="C6CDD8"/>
-            <w:right w:val="single" w:sz="3" w:space="0" w:color="C6CDD8"/>
-            <w:insideH w:val="single" w:sz="3" w:space="0" w:color="C6CDD8"/>
-            <w:insideV w:val="single" w:sz="3" w:space="0" w:color="C6CDD8"/>
+            <w:top w:val="single" w:color="C6CDD8" w:sz="3" w:space="0"/>
+            <w:left w:val="single" w:color="C6CDD8" w:sz="3" w:space="0"/>
+            <w:bottom w:val="single" w:color="C6CDD8" w:sz="3" w:space="0"/>
+            <w:right w:val="single" w:color="C6CDD8" w:sz="3" w:space="0"/>
+            <w:insideH w:val="single" w:color="C6CDD8" w:sz="3" w:space="0"/>
+            <w:insideV w:val="single" w:color="C6CDD8" w:sz="3" w:space="0"/>
           </w:tblBorders>
         </w:tblPrEx>
         <w:tc>
           <w:tcPr>
             <w:tcW w:w="2200" w:type="dxa"/>
+            <w:tcBorders>
+              <w:top w:val="single" w:color="C6CDD8" w:sz="3"/>
+              <w:left w:val="single" w:color="C6CDD8" w:sz="3"/>
+              <w:bottom w:val="single" w:color="C6CDD8" w:sz="3"/>
+              <w:right w:val="single" w:color="C6CDD8" w:sz="3"/>
+            </w:tcBorders>
             <w:tcMar>
               <w:top w:w="70" w:type="dxa"/>
               <w:left w:w="100" w:type="dxa"/>
@@ -4751,6 +4640,12 @@
         <w:tc>
           <w:tcPr>
             <w:tcW w:w="1500" w:type="dxa"/>
+            <w:tcBorders>
+              <w:top w:val="single" w:color="C6CDD8" w:sz="3"/>
+              <w:left w:val="single" w:color="C6CDD8" w:sz="3"/>
+              <w:bottom w:val="single" w:color="C6CDD8" w:sz="3"/>
+              <w:right w:val="single" w:color="C6CDD8" w:sz="3"/>
+            </w:tcBorders>
             <w:tcMar>
               <w:top w:w="70" w:type="dxa"/>
               <w:left w:w="100" w:type="dxa"/>
@@ -4767,6 +4662,12 @@
         <w:tc>
           <w:tcPr>
             <w:tcW w:w="7158" w:type="dxa"/>
+            <w:tcBorders>
+              <w:top w:val="single" w:color="C6CDD8" w:sz="3"/>
+              <w:left w:val="single" w:color="C6CDD8" w:sz="3"/>
+              <w:bottom w:val="single" w:color="C6CDD8" w:sz="3"/>
+              <w:right w:val="single" w:color="C6CDD8" w:sz="3"/>
+            </w:tcBorders>
             <w:tcMar>
               <w:top w:w="70" w:type="dxa"/>
               <w:left w:w="100" w:type="dxa"/>
@@ -4805,17 +4706,23 @@
       <w:tr>
         <w:tblPrEx>
           <w:tblBorders>
-            <w:top w:val="single" w:sz="3" w:space="0" w:color="C6CDD8"/>
-            <w:left w:val="single" w:sz="3" w:space="0" w:color="C6CDD8"/>
-            <w:bottom w:val="single" w:sz="3" w:space="0" w:color="C6CDD8"/>
-            <w:right w:val="single" w:sz="3" w:space="0" w:color="C6CDD8"/>
-            <w:insideH w:val="single" w:sz="3" w:space="0" w:color="C6CDD8"/>
-            <w:insideV w:val="single" w:sz="3" w:space="0" w:color="C6CDD8"/>
+            <w:top w:val="single" w:color="C6CDD8" w:sz="3" w:space="0"/>
+            <w:left w:val="single" w:color="C6CDD8" w:sz="3" w:space="0"/>
+            <w:bottom w:val="single" w:color="C6CDD8" w:sz="3" w:space="0"/>
+            <w:right w:val="single" w:color="C6CDD8" w:sz="3" w:space="0"/>
+            <w:insideH w:val="single" w:color="C6CDD8" w:sz="3" w:space="0"/>
+            <w:insideV w:val="single" w:color="C6CDD8" w:sz="3" w:space="0"/>
           </w:tblBorders>
         </w:tblPrEx>
         <w:tc>
           <w:tcPr>
             <w:tcW w:w="2200" w:type="dxa"/>
+            <w:tcBorders>
+              <w:top w:val="single" w:color="C6CDD8" w:sz="3"/>
+              <w:left w:val="single" w:color="C6CDD8" w:sz="3"/>
+              <w:bottom w:val="single" w:color="C6CDD8" w:sz="3"/>
+              <w:right w:val="single" w:color="C6CDD8" w:sz="3"/>
+            </w:tcBorders>
             <w:tcMar>
               <w:top w:w="70" w:type="dxa"/>
               <w:left w:w="100" w:type="dxa"/>
@@ -4837,6 +4744,12 @@
         <w:tc>
           <w:tcPr>
             <w:tcW w:w="1500" w:type="dxa"/>
+            <w:tcBorders>
+              <w:top w:val="single" w:color="C6CDD8" w:sz="3"/>
+              <w:left w:val="single" w:color="C6CDD8" w:sz="3"/>
+              <w:bottom w:val="single" w:color="C6CDD8" w:sz="3"/>
+              <w:right w:val="single" w:color="C6CDD8" w:sz="3"/>
+            </w:tcBorders>
             <w:tcMar>
               <w:top w:w="70" w:type="dxa"/>
               <w:left w:w="100" w:type="dxa"/>
@@ -4853,6 +4766,12 @@
         <w:tc>
           <w:tcPr>
             <w:tcW w:w="7158" w:type="dxa"/>
+            <w:tcBorders>
+              <w:top w:val="single" w:color="C6CDD8" w:sz="3"/>
+              <w:left w:val="single" w:color="C6CDD8" w:sz="3"/>
+              <w:bottom w:val="single" w:color="C6CDD8" w:sz="3"/>
+              <w:right w:val="single" w:color="C6CDD8" w:sz="3"/>
+            </w:tcBorders>
             <w:tcMar>
               <w:top w:w="70" w:type="dxa"/>
               <w:left w:w="100" w:type="dxa"/>
@@ -4873,17 +4792,23 @@
       <w:tr>
         <w:tblPrEx>
           <w:tblBorders>
-            <w:top w:val="single" w:sz="3" w:space="0" w:color="C6CDD8"/>
-            <w:left w:val="single" w:sz="3" w:space="0" w:color="C6CDD8"/>
-            <w:bottom w:val="single" w:sz="3" w:space="0" w:color="C6CDD8"/>
-            <w:right w:val="single" w:sz="3" w:space="0" w:color="C6CDD8"/>
-            <w:insideH w:val="single" w:sz="3" w:space="0" w:color="C6CDD8"/>
-            <w:insideV w:val="single" w:sz="3" w:space="0" w:color="C6CDD8"/>
+            <w:top w:val="single" w:color="C6CDD8" w:sz="3" w:space="0"/>
+            <w:left w:val="single" w:color="C6CDD8" w:sz="3" w:space="0"/>
+            <w:bottom w:val="single" w:color="C6CDD8" w:sz="3" w:space="0"/>
+            <w:right w:val="single" w:color="C6CDD8" w:sz="3" w:space="0"/>
+            <w:insideH w:val="single" w:color="C6CDD8" w:sz="3" w:space="0"/>
+            <w:insideV w:val="single" w:color="C6CDD8" w:sz="3" w:space="0"/>
           </w:tblBorders>
         </w:tblPrEx>
         <w:tc>
           <w:tcPr>
             <w:tcW w:w="2200" w:type="dxa"/>
+            <w:tcBorders>
+              <w:top w:val="single" w:color="C6CDD8" w:sz="3"/>
+              <w:left w:val="single" w:color="C6CDD8" w:sz="3"/>
+              <w:bottom w:val="single" w:color="C6CDD8" w:sz="3"/>
+              <w:right w:val="single" w:color="C6CDD8" w:sz="3"/>
+            </w:tcBorders>
             <w:tcMar>
               <w:top w:w="70" w:type="dxa"/>
               <w:left w:w="100" w:type="dxa"/>
@@ -4905,6 +4830,12 @@
         <w:tc>
           <w:tcPr>
             <w:tcW w:w="1500" w:type="dxa"/>
+            <w:tcBorders>
+              <w:top w:val="single" w:color="C6CDD8" w:sz="3"/>
+              <w:left w:val="single" w:color="C6CDD8" w:sz="3"/>
+              <w:bottom w:val="single" w:color="C6CDD8" w:sz="3"/>
+              <w:right w:val="single" w:color="C6CDD8" w:sz="3"/>
+            </w:tcBorders>
             <w:tcMar>
               <w:top w:w="70" w:type="dxa"/>
               <w:left w:w="100" w:type="dxa"/>
@@ -4921,6 +4852,12 @@
         <w:tc>
           <w:tcPr>
             <w:tcW w:w="7158" w:type="dxa"/>
+            <w:tcBorders>
+              <w:top w:val="single" w:color="C6CDD8" w:sz="3"/>
+              <w:left w:val="single" w:color="C6CDD8" w:sz="3"/>
+              <w:bottom w:val="single" w:color="C6CDD8" w:sz="3"/>
+              <w:right w:val="single" w:color="C6CDD8" w:sz="3"/>
+            </w:tcBorders>
             <w:tcMar>
               <w:top w:w="70" w:type="dxa"/>
               <w:left w:w="100" w:type="dxa"/>
@@ -4966,13 +4903,13 @@
       <w:pPr>
         <w:keepNext/>
         <w:pBdr>
-          <w:bottom w:val="single" w:sz="8" w:space="0" w:color="16324F"/>
+          <w:bottom w:val="single" w:color="16324F" w:sz="8" w:space="0"/>
         </w:pBdr>
         <w:spacing w:before="300" w:after="100" w:line="260" w:lineRule="auto"/>
       </w:pPr>
       <w:r>
         <w:rPr>
-          <w:rFonts w:ascii="Cambria" w:eastAsia="Cambria" w:hAnsi="Cambria" w:cs="Cambria"/>
+          <w:rFonts w:ascii="Cambria" w:hAnsi="Cambria" w:eastAsia="Cambria" w:cs="Cambria"/>
           <w:b/>
           <w:bCs/>
           <w:color w:val="2F5D8A"/>
@@ -4983,7 +4920,7 @@
       </w:r>
       <w:r>
         <w:rPr>
-          <w:rFonts w:ascii="Cambria" w:eastAsia="Cambria" w:hAnsi="Cambria" w:cs="Cambria"/>
+          <w:rFonts w:ascii="Cambria" w:hAnsi="Cambria" w:eastAsia="Cambria" w:cs="Cambria"/>
           <w:b/>
           <w:bCs/>
           <w:color w:val="16324F"/>
@@ -5023,12 +4960,12 @@
       <w:tblPr>
         <w:tblW w:w="10858" w:type="dxa"/>
         <w:tblBorders>
-          <w:top w:val="single" w:sz="3" w:space="0" w:color="C6CDD8"/>
-          <w:left w:val="single" w:sz="3" w:space="0" w:color="C6CDD8"/>
-          <w:bottom w:val="single" w:sz="3" w:space="0" w:color="C6CDD8"/>
-          <w:right w:val="single" w:sz="3" w:space="0" w:color="C6CDD8"/>
-          <w:insideH w:val="single" w:sz="3" w:space="0" w:color="C6CDD8"/>
-          <w:insideV w:val="single" w:sz="3" w:space="0" w:color="C6CDD8"/>
+          <w:top w:val="single" w:color="C6CDD8" w:sz="3" w:space="0"/>
+          <w:left w:val="single" w:color="C6CDD8" w:sz="3" w:space="0"/>
+          <w:bottom w:val="single" w:color="C6CDD8" w:sz="3" w:space="0"/>
+          <w:right w:val="single" w:color="C6CDD8" w:sz="3" w:space="0"/>
+          <w:insideH w:val="single" w:color="C6CDD8" w:sz="3" w:space="0"/>
+          <w:insideV w:val="single" w:color="C6CDD8" w:sz="3" w:space="0"/>
         </w:tblBorders>
         <w:tblLayout w:type="fixed"/>
         <w:tblCellMar>
@@ -6355,12 +6292,12 @@
       <w:tblPr>
         <w:tblW w:w="10858" w:type="dxa"/>
         <w:tblBorders>
-          <w:top w:val="single" w:sz="3" w:space="0" w:color="C6CDD8"/>
-          <w:left w:val="single" w:sz="3" w:space="0" w:color="C6CDD8"/>
-          <w:bottom w:val="single" w:sz="3" w:space="0" w:color="C6CDD8"/>
-          <w:right w:val="single" w:sz="3" w:space="0" w:color="C6CDD8"/>
-          <w:insideH w:val="single" w:sz="3" w:space="0" w:color="C6CDD8"/>
-          <w:insideV w:val="single" w:sz="3" w:space="0" w:color="C6CDD8"/>
+          <w:top w:val="single" w:color="C6CDD8" w:sz="3" w:space="0"/>
+          <w:left w:val="single" w:color="C6CDD8" w:sz="3" w:space="0"/>
+          <w:bottom w:val="single" w:color="C6CDD8" w:sz="3" w:space="0"/>
+          <w:right w:val="single" w:color="C6CDD8" w:sz="3" w:space="0"/>
+          <w:insideH w:val="single" w:color="C6CDD8" w:sz="3" w:space="0"/>
+          <w:insideV w:val="single" w:color="C6CDD8" w:sz="3" w:space="0"/>
         </w:tblBorders>
         <w:tblLayout w:type="fixed"/>
         <w:tblCellMar>
@@ -6906,12 +6843,12 @@
       <w:tblPr>
         <w:tblW w:w="10858" w:type="dxa"/>
         <w:tblBorders>
-          <w:top w:val="single" w:sz="3" w:space="0" w:color="C6CDD8"/>
-          <w:left w:val="single" w:sz="3" w:space="0" w:color="C6CDD8"/>
-          <w:bottom w:val="single" w:sz="3" w:space="0" w:color="C6CDD8"/>
-          <w:right w:val="single" w:sz="3" w:space="0" w:color="C6CDD8"/>
-          <w:insideH w:val="single" w:sz="3" w:space="0" w:color="C6CDD8"/>
-          <w:insideV w:val="single" w:sz="3" w:space="0" w:color="C6CDD8"/>
+          <w:top w:val="single" w:color="C6CDD8" w:sz="3" w:space="0"/>
+          <w:left w:val="single" w:color="C6CDD8" w:sz="3" w:space="0"/>
+          <w:bottom w:val="single" w:color="C6CDD8" w:sz="3" w:space="0"/>
+          <w:right w:val="single" w:color="C6CDD8" w:sz="3" w:space="0"/>
+          <w:insideH w:val="single" w:color="C6CDD8" w:sz="3" w:space="0"/>
+          <w:insideV w:val="single" w:color="C6CDD8" w:sz="3" w:space="0"/>
         </w:tblBorders>
         <w:tblLayout w:type="fixed"/>
         <w:tblCellMar>
@@ -7176,7 +7113,16 @@
           </w:tcPr>
           <w:p>
             <w:r>
-              <w:t>A university rule is not the team's to waive.</w:t>
+              <w:rPr/>
+              <w:t xml:space="preserve">A university rule is not the </w:t>
+            </w:r>
+            <w:r>
+              <w:rPr/>
+              <w:t>teams</w:t>
+            </w:r>
+            <w:r>
+              <w:rPr/>
+              <w:t xml:space="preserve"> to waive.</w:t>
             </w:r>
           </w:p>
         </w:tc>
@@ -7217,12 +7163,12 @@
       <w:tblPr>
         <w:tblW w:w="10858" w:type="dxa"/>
         <w:tblBorders>
-          <w:top w:val="single" w:sz="3" w:space="0" w:color="C6CDD8"/>
-          <w:left w:val="single" w:sz="3" w:space="0" w:color="C6CDD8"/>
-          <w:bottom w:val="single" w:sz="3" w:space="0" w:color="C6CDD8"/>
-          <w:right w:val="single" w:sz="3" w:space="0" w:color="C6CDD8"/>
-          <w:insideH w:val="single" w:sz="3" w:space="0" w:color="C6CDD8"/>
-          <w:insideV w:val="single" w:sz="3" w:space="0" w:color="C6CDD8"/>
+          <w:top w:val="single" w:color="C6CDD8" w:sz="3" w:space="0"/>
+          <w:left w:val="single" w:color="C6CDD8" w:sz="3" w:space="0"/>
+          <w:bottom w:val="single" w:color="C6CDD8" w:sz="3" w:space="0"/>
+          <w:right w:val="single" w:color="C6CDD8" w:sz="3" w:space="0"/>
+          <w:insideH w:val="single" w:color="C6CDD8" w:sz="3" w:space="0"/>
+          <w:insideV w:val="single" w:color="C6CDD8" w:sz="3" w:space="0"/>
         </w:tblBorders>
         <w:tblLayout w:type="fixed"/>
         <w:tblCellMar>
@@ -7269,7 +7215,7 @@
                           <pic:cNvPicPr/>
                         </pic:nvPicPr>
                         <pic:blipFill>
-                          <a:blip r:embed="rId21">
+                          <a:blip r:embed="rId22">
                             <a:extLst>
                               <a:ext uri="{28A0092B-C50C-407E-A947-70E740481C1C}">
                                 <a14:useLocalDpi xmlns:a14="http://schemas.microsoft.com/office/drawing/2010/main"/>
@@ -7395,12 +7341,12 @@
       <w:tblPr>
         <w:tblW w:w="10858" w:type="dxa"/>
         <w:tblBorders>
-          <w:top w:val="single" w:sz="3" w:space="0" w:color="C6CDD8"/>
-          <w:left w:val="single" w:sz="3" w:space="0" w:color="C6CDD8"/>
-          <w:bottom w:val="single" w:sz="3" w:space="0" w:color="C6CDD8"/>
-          <w:right w:val="single" w:sz="3" w:space="0" w:color="C6CDD8"/>
-          <w:insideH w:val="single" w:sz="3" w:space="0" w:color="C6CDD8"/>
-          <w:insideV w:val="single" w:sz="3" w:space="0" w:color="C6CDD8"/>
+          <w:top w:val="single" w:color="C6CDD8" w:sz="3" w:space="0"/>
+          <w:left w:val="single" w:color="C6CDD8" w:sz="3" w:space="0"/>
+          <w:bottom w:val="single" w:color="C6CDD8" w:sz="3" w:space="0"/>
+          <w:right w:val="single" w:color="C6CDD8" w:sz="3" w:space="0"/>
+          <w:insideH w:val="single" w:color="C6CDD8" w:sz="3" w:space="0"/>
+          <w:insideV w:val="single" w:color="C6CDD8" w:sz="3" w:space="0"/>
         </w:tblBorders>
         <w:tblLayout w:type="fixed"/>
         <w:tblCellMar>
@@ -8013,12 +7959,12 @@
       <w:tblPr>
         <w:tblW w:w="0" w:type="auto"/>
         <w:tblBorders>
-          <w:top w:val="single" w:sz="3" w:space="0" w:color="C6CDD8"/>
-          <w:left w:val="single" w:sz="3" w:space="0" w:color="C6CDD8"/>
-          <w:bottom w:val="single" w:sz="3" w:space="0" w:color="C6CDD8"/>
-          <w:right w:val="single" w:sz="3" w:space="0" w:color="C6CDD8"/>
-          <w:insideH w:val="single" w:sz="3" w:space="0" w:color="C6CDD8"/>
-          <w:insideV w:val="single" w:sz="3" w:space="0" w:color="C6CDD8"/>
+          <w:top w:val="single" w:color="C6CDD8" w:sz="3" w:space="0"/>
+          <w:left w:val="single" w:color="C6CDD8" w:sz="3" w:space="0"/>
+          <w:bottom w:val="single" w:color="C6CDD8" w:sz="3" w:space="0"/>
+          <w:right w:val="single" w:color="C6CDD8" w:sz="3" w:space="0"/>
+          <w:insideH w:val="single" w:color="C6CDD8" w:sz="3" w:space="0"/>
+          <w:insideV w:val="single" w:color="C6CDD8" w:sz="3" w:space="0"/>
         </w:tblBorders>
         <w:tblLook w:val="0000" w:firstRow="0" w:lastRow="0" w:firstColumn="0" w:lastColumn="0" w:noHBand="0" w:noVBand="0"/>
       </w:tblPr>
@@ -8358,12 +8304,10 @@
           </w:tcPr>
           <w:p>
             <w:pPr>
-              <w:numPr>
-                <w:ilvl w:val="0"/>
-                <w:numId w:val="3"/>
-              </w:numPr>
-            </w:pPr>
-            <w:r>
+              <w:ind w:left="0"/>
+            </w:pPr>
+            <w:r>
+              <w:rPr/>
               <w:t>1. The administrator opens the room management section.</w:t>
             </w:r>
           </w:p>
@@ -8576,23 +8520,23 @@
             <w:pPr>
               <w:rPr>
                 <w:color w:val="1A1A1A"/>
-                <w:sz w:val="18"/>
-                <w:szCs w:val="18"/>
+                <w:sz w:val="21"/>
+                <w:szCs w:val="21"/>
               </w:rPr>
             </w:pPr>
             <w:r>
               <w:rPr>
                 <w:color w:val="1A1A1A"/>
-                <w:sz w:val="18"/>
-                <w:szCs w:val="18"/>
+                <w:sz w:val="21"/>
+                <w:szCs w:val="21"/>
               </w:rPr>
               <w:t xml:space="preserve">FR- </w:t>
             </w:r>
             <w:r>
               <w:rPr>
                 <w:color w:val="1A1A1A"/>
-                <w:sz w:val="18"/>
-                <w:szCs w:val="18"/>
+                <w:sz w:val="21"/>
+                <w:szCs w:val="21"/>
               </w:rPr>
               <w:t>10</w:t>
             </w:r>
@@ -8635,12 +8579,12 @@
       <w:tblPr>
         <w:tblW w:w="10858" w:type="dxa"/>
         <w:tblBorders>
-          <w:top w:val="single" w:sz="3" w:space="0" w:color="C6CDD8"/>
-          <w:left w:val="single" w:sz="3" w:space="0" w:color="C6CDD8"/>
-          <w:bottom w:val="single" w:sz="3" w:space="0" w:color="C6CDD8"/>
-          <w:right w:val="single" w:sz="3" w:space="0" w:color="C6CDD8"/>
-          <w:insideH w:val="single" w:sz="3" w:space="0" w:color="C6CDD8"/>
-          <w:insideV w:val="single" w:sz="3" w:space="0" w:color="C6CDD8"/>
+          <w:top w:val="single" w:color="C6CDD8" w:sz="3" w:space="0"/>
+          <w:left w:val="single" w:color="C6CDD8" w:sz="3" w:space="0"/>
+          <w:bottom w:val="single" w:color="C6CDD8" w:sz="3" w:space="0"/>
+          <w:right w:val="single" w:color="C6CDD8" w:sz="3" w:space="0"/>
+          <w:insideH w:val="single" w:color="C6CDD8" w:sz="3" w:space="0"/>
+          <w:insideV w:val="single" w:color="C6CDD8" w:sz="3" w:space="0"/>
         </w:tblBorders>
         <w:tblLayout w:type="fixed"/>
         <w:tblCellMar>
@@ -9426,12 +9370,12 @@
       <w:tblPr>
         <w:tblW w:w="10858" w:type="dxa"/>
         <w:tblBorders>
-          <w:top w:val="single" w:sz="3" w:space="0" w:color="C6CDD8"/>
-          <w:left w:val="single" w:sz="3" w:space="0" w:color="C6CDD8"/>
-          <w:bottom w:val="single" w:sz="3" w:space="0" w:color="C6CDD8"/>
-          <w:right w:val="single" w:sz="3" w:space="0" w:color="C6CDD8"/>
-          <w:insideH w:val="single" w:sz="3" w:space="0" w:color="C6CDD8"/>
-          <w:insideV w:val="single" w:sz="3" w:space="0" w:color="C6CDD8"/>
+          <w:top w:val="single" w:color="C6CDD8" w:sz="3" w:space="0"/>
+          <w:left w:val="single" w:color="C6CDD8" w:sz="3" w:space="0"/>
+          <w:bottom w:val="single" w:color="C6CDD8" w:sz="3" w:space="0"/>
+          <w:right w:val="single" w:color="C6CDD8" w:sz="3" w:space="0"/>
+          <w:insideH w:val="single" w:color="C6CDD8" w:sz="3" w:space="0"/>
+          <w:insideV w:val="single" w:color="C6CDD8" w:sz="3" w:space="0"/>
         </w:tblBorders>
         <w:tblLayout w:type="fixed"/>
         <w:tblCellMar>
@@ -9489,13 +9433,13 @@
       <w:pPr>
         <w:keepNext/>
         <w:pBdr>
-          <w:bottom w:val="single" w:sz="8" w:space="0" w:color="16324F"/>
+          <w:bottom w:val="single" w:color="16324F" w:sz="8" w:space="0"/>
         </w:pBdr>
         <w:spacing w:before="300" w:after="100" w:line="260" w:lineRule="auto"/>
       </w:pPr>
       <w:r>
         <w:rPr>
-          <w:rFonts w:ascii="Cambria" w:eastAsia="Cambria" w:hAnsi="Cambria" w:cs="Cambria"/>
+          <w:rFonts w:ascii="Cambria" w:hAnsi="Cambria" w:eastAsia="Cambria" w:cs="Cambria"/>
           <w:b/>
           <w:bCs/>
           <w:color w:val="2F5D8A"/>
@@ -9506,7 +9450,7 @@
       </w:r>
       <w:r>
         <w:rPr>
-          <w:rFonts w:ascii="Cambria" w:eastAsia="Cambria" w:hAnsi="Cambria" w:cs="Cambria"/>
+          <w:rFonts w:ascii="Cambria" w:hAnsi="Cambria" w:eastAsia="Cambria" w:cs="Cambria"/>
           <w:b/>
           <w:bCs/>
           <w:color w:val="16324F"/>
@@ -9546,12 +9490,12 @@
       <w:tblPr>
         <w:tblW w:w="10858" w:type="dxa"/>
         <w:tblBorders>
-          <w:top w:val="single" w:sz="3" w:space="0" w:color="C6CDD8"/>
-          <w:left w:val="single" w:sz="3" w:space="0" w:color="C6CDD8"/>
-          <w:bottom w:val="single" w:sz="3" w:space="0" w:color="C6CDD8"/>
-          <w:right w:val="single" w:sz="3" w:space="0" w:color="C6CDD8"/>
-          <w:insideH w:val="single" w:sz="3" w:space="0" w:color="C6CDD8"/>
-          <w:insideV w:val="single" w:sz="3" w:space="0" w:color="C6CDD8"/>
+          <w:top w:val="single" w:color="C6CDD8" w:sz="3" w:space="0"/>
+          <w:left w:val="single" w:color="C6CDD8" w:sz="3" w:space="0"/>
+          <w:bottom w:val="single" w:color="C6CDD8" w:sz="3" w:space="0"/>
+          <w:right w:val="single" w:color="C6CDD8" w:sz="3" w:space="0"/>
+          <w:insideH w:val="single" w:color="C6CDD8" w:sz="3" w:space="0"/>
+          <w:insideV w:val="single" w:color="C6CDD8" w:sz="3" w:space="0"/>
         </w:tblBorders>
         <w:tblLayout w:type="fixed"/>
         <w:tblCellMar>
@@ -9648,7 +9592,7 @@
               </w:rPr>
               <w:t xml:space="preserve">How the team </w:t>
             </w:r>
-            <w:bookmarkStart w:id="7" w:name="_Int_O0GdZf00"/>
+            <w:bookmarkStart w:name="_Int_O0GdZf00" w:id="7"/>
             <w:r>
               <w:rPr>
                 <w:b/>
@@ -9915,7 +9859,35 @@
               <w:right w:w="100" w:type="dxa"/>
             </w:tcMar>
           </w:tcPr>
-          <w:p/>
+          <w:p>
+            <w:pPr>
+              <w:pStyle w:val="Normal"/>
+            </w:pPr>
+            <w:r>
+              <w:rPr/>
+              <w:t xml:space="preserve">Verification and </w:t>
+            </w:r>
+            <w:r>
+              <w:rPr/>
+              <w:t>q</w:t>
+            </w:r>
+            <w:r>
+              <w:rPr/>
+              <w:t xml:space="preserve">uality </w:t>
+            </w:r>
+            <w:r>
+              <w:rPr/>
+              <w:t>r</w:t>
+            </w:r>
+            <w:r>
+              <w:rPr/>
+              <w:t>equirements analys</w:t>
+            </w:r>
+            <w:r>
+              <w:rPr/>
+              <w:t>t</w:t>
+            </w:r>
+          </w:p>
         </w:tc>
         <w:tc>
           <w:tcPr>
@@ -9927,7 +9899,28 @@
               <w:right w:w="100" w:type="dxa"/>
             </w:tcMar>
           </w:tcPr>
-          <w:p/>
+          <w:p>
+            <w:r>
+              <w:rPr/>
+              <w:t>Discuss disagreements with the team, compare</w:t>
+            </w:r>
+            <w:r>
+              <w:rPr/>
+              <w:t xml:space="preserve"> and analyze</w:t>
+            </w:r>
+            <w:r>
+              <w:rPr/>
+              <w:t xml:space="preserve"> </w:t>
+            </w:r>
+            <w:r>
+              <w:rPr/>
+              <w:t>options for reaching quality requirements</w:t>
+            </w:r>
+            <w:r>
+              <w:rPr/>
+              <w:t>, and document the decision</w:t>
+            </w:r>
+          </w:p>
         </w:tc>
       </w:tr>
       <w:tr>
@@ -9962,7 +9955,24 @@
           </w:tcPr>
           <w:p>
             <w:r>
-              <w:t>Use Case Analyst</w:t>
+              <w:rPr/>
+              <w:t xml:space="preserve">Use </w:t>
+            </w:r>
+            <w:r>
+              <w:rPr/>
+              <w:t>c</w:t>
+            </w:r>
+            <w:r>
+              <w:rPr/>
+              <w:t xml:space="preserve">ase </w:t>
+            </w:r>
+            <w:r>
+              <w:rPr/>
+              <w:t>a</w:t>
+            </w:r>
+            <w:r>
+              <w:rPr/>
+              <w:t>nalyst</w:t>
             </w:r>
           </w:p>
         </w:tc>
@@ -10019,12 +10029,12 @@
       <w:tblPr>
         <w:tblW w:w="10858" w:type="dxa"/>
         <w:tblBorders>
-          <w:top w:val="single" w:sz="3" w:space="0" w:color="C6CDD8"/>
-          <w:left w:val="single" w:sz="3" w:space="0" w:color="C6CDD8"/>
-          <w:bottom w:val="single" w:sz="3" w:space="0" w:color="C6CDD8"/>
-          <w:right w:val="single" w:sz="3" w:space="0" w:color="C6CDD8"/>
-          <w:insideH w:val="single" w:sz="3" w:space="0" w:color="C6CDD8"/>
-          <w:insideV w:val="single" w:sz="3" w:space="0" w:color="C6CDD8"/>
+          <w:top w:val="single" w:color="C6CDD8" w:sz="3" w:space="0"/>
+          <w:left w:val="single" w:color="C6CDD8" w:sz="3" w:space="0"/>
+          <w:bottom w:val="single" w:color="C6CDD8" w:sz="3" w:space="0"/>
+          <w:right w:val="single" w:color="C6CDD8" w:sz="3" w:space="0"/>
+          <w:insideH w:val="single" w:color="C6CDD8" w:sz="3" w:space="0"/>
+          <w:insideV w:val="single" w:color="C6CDD8" w:sz="3" w:space="0"/>
         </w:tblBorders>
         <w:tblLayout w:type="fixed"/>
         <w:tblCellMar>
@@ -10516,12 +10526,12 @@
       <w:tblPr>
         <w:tblW w:w="10858" w:type="dxa"/>
         <w:tblBorders>
-          <w:top w:val="single" w:sz="3" w:space="0" w:color="C6CDD8"/>
-          <w:left w:val="single" w:sz="3" w:space="0" w:color="C6CDD8"/>
-          <w:bottom w:val="single" w:sz="3" w:space="0" w:color="C6CDD8"/>
-          <w:right w:val="single" w:sz="3" w:space="0" w:color="C6CDD8"/>
-          <w:insideH w:val="single" w:sz="3" w:space="0" w:color="C6CDD8"/>
-          <w:insideV w:val="single" w:sz="3" w:space="0" w:color="C6CDD8"/>
+          <w:top w:val="single" w:color="C6CDD8" w:sz="3" w:space="0"/>
+          <w:left w:val="single" w:color="C6CDD8" w:sz="3" w:space="0"/>
+          <w:bottom w:val="single" w:color="C6CDD8" w:sz="3" w:space="0"/>
+          <w:right w:val="single" w:color="C6CDD8" w:sz="3" w:space="0"/>
+          <w:insideH w:val="single" w:color="C6CDD8" w:sz="3" w:space="0"/>
+          <w:insideV w:val="single" w:color="C6CDD8" w:sz="3" w:space="0"/>
         </w:tblBorders>
         <w:tblLayout w:type="fixed"/>
         <w:tblCellMar>
@@ -11193,12 +11203,12 @@
       <w:tblPr>
         <w:tblW w:w="10858" w:type="dxa"/>
         <w:tblBorders>
-          <w:top w:val="single" w:sz="3" w:space="0" w:color="C6CDD8"/>
-          <w:left w:val="single" w:sz="3" w:space="0" w:color="C6CDD8"/>
-          <w:bottom w:val="single" w:sz="3" w:space="0" w:color="C6CDD8"/>
-          <w:right w:val="single" w:sz="3" w:space="0" w:color="C6CDD8"/>
-          <w:insideH w:val="single" w:sz="3" w:space="0" w:color="C6CDD8"/>
-          <w:insideV w:val="single" w:sz="3" w:space="0" w:color="C6CDD8"/>
+          <w:top w:val="single" w:color="C6CDD8" w:sz="3" w:space="0"/>
+          <w:left w:val="single" w:color="C6CDD8" w:sz="3" w:space="0"/>
+          <w:bottom w:val="single" w:color="C6CDD8" w:sz="3" w:space="0"/>
+          <w:right w:val="single" w:color="C6CDD8" w:sz="3" w:space="0"/>
+          <w:insideH w:val="single" w:color="C6CDD8" w:sz="3" w:space="0"/>
+          <w:insideV w:val="single" w:color="C6CDD8" w:sz="3" w:space="0"/>
         </w:tblBorders>
         <w:tblLayout w:type="fixed"/>
         <w:tblCellMar>
@@ -11225,11 +11235,11 @@
             <w:pPr>
               <w:spacing w:after="60" w:line="260" w:lineRule="auto"/>
             </w:pPr>
-            <w:hyperlink r:id="rId22">
+            <w:hyperlink r:id="rId23">
               <w:r>
                 <w:rPr>
                   <w:rStyle w:val="Hyperlink"/>
-                  <w:rFonts w:ascii="Segoe UI" w:eastAsia="Segoe UI" w:hAnsi="Segoe UI" w:cs="Segoe UI"/>
+                  <w:rFonts w:ascii="Segoe UI" w:hAnsi="Segoe UI" w:eastAsia="Segoe UI" w:cs="Segoe UI"/>
                   <w:sz w:val="18"/>
                   <w:szCs w:val="18"/>
                 </w:rPr>
@@ -11238,7 +11248,7 @@
             </w:hyperlink>
             <w:r>
               <w:rPr>
-                <w:rFonts w:ascii="Segoe UI" w:eastAsia="Segoe UI" w:hAnsi="Segoe UI" w:cs="Segoe UI"/>
+                <w:rFonts w:ascii="Segoe UI" w:hAnsi="Segoe UI" w:eastAsia="Segoe UI" w:cs="Segoe UI"/>
                 <w:color w:val="000000" w:themeColor="text1"/>
                 <w:sz w:val="18"/>
                 <w:szCs w:val="18"/>
@@ -11368,12 +11378,12 @@
       <w:tblPr>
         <w:tblW w:w="10858" w:type="dxa"/>
         <w:tblBorders>
-          <w:top w:val="single" w:sz="3" w:space="0" w:color="C6CDD8"/>
-          <w:left w:val="single" w:sz="3" w:space="0" w:color="C6CDD8"/>
-          <w:bottom w:val="single" w:sz="3" w:space="0" w:color="C6CDD8"/>
-          <w:right w:val="single" w:sz="3" w:space="0" w:color="C6CDD8"/>
-          <w:insideH w:val="single" w:sz="3" w:space="0" w:color="C6CDD8"/>
-          <w:insideV w:val="single" w:sz="3" w:space="0" w:color="C6CDD8"/>
+          <w:top w:val="single" w:color="C6CDD8" w:sz="3" w:space="0"/>
+          <w:left w:val="single" w:color="C6CDD8" w:sz="3" w:space="0"/>
+          <w:bottom w:val="single" w:color="C6CDD8" w:sz="3" w:space="0"/>
+          <w:right w:val="single" w:color="C6CDD8" w:sz="3" w:space="0"/>
+          <w:insideH w:val="single" w:color="C6CDD8" w:sz="3" w:space="0"/>
+          <w:insideV w:val="single" w:color="C6CDD8" w:sz="3" w:space="0"/>
         </w:tblBorders>
         <w:tblLayout w:type="fixed"/>
         <w:tblCellMar>
@@ -11665,13 +11675,13 @@
       <w:pPr>
         <w:keepNext/>
         <w:pBdr>
-          <w:bottom w:val="single" w:sz="8" w:space="0" w:color="16324F"/>
+          <w:bottom w:val="single" w:color="16324F" w:sz="8" w:space="0"/>
         </w:pBdr>
         <w:spacing w:before="300" w:after="100" w:line="260" w:lineRule="auto"/>
       </w:pPr>
       <w:r>
         <w:rPr>
-          <w:rFonts w:ascii="Cambria" w:eastAsia="Cambria" w:hAnsi="Cambria" w:cs="Cambria"/>
+          <w:rFonts w:ascii="Cambria" w:hAnsi="Cambria" w:eastAsia="Cambria" w:cs="Cambria"/>
           <w:b/>
           <w:bCs/>
           <w:color w:val="2F5D8A"/>
@@ -11682,7 +11692,7 @@
       </w:r>
       <w:r>
         <w:rPr>
-          <w:rFonts w:ascii="Cambria" w:eastAsia="Cambria" w:hAnsi="Cambria" w:cs="Cambria"/>
+          <w:rFonts w:ascii="Cambria" w:hAnsi="Cambria" w:eastAsia="Cambria" w:cs="Cambria"/>
           <w:b/>
           <w:bCs/>
           <w:color w:val="16324F"/>
@@ -11696,12 +11706,12 @@
       <w:tblPr>
         <w:tblW w:w="10858" w:type="dxa"/>
         <w:tblBorders>
-          <w:top w:val="single" w:sz="3" w:space="0" w:color="C6CDD8"/>
-          <w:left w:val="single" w:sz="3" w:space="0" w:color="C6CDD8"/>
-          <w:bottom w:val="single" w:sz="3" w:space="0" w:color="C6CDD8"/>
-          <w:right w:val="single" w:sz="3" w:space="0" w:color="C6CDD8"/>
-          <w:insideH w:val="single" w:sz="3" w:space="0" w:color="C6CDD8"/>
-          <w:insideV w:val="single" w:sz="3" w:space="0" w:color="C6CDD8"/>
+          <w:top w:val="single" w:color="C6CDD8" w:sz="3" w:space="0"/>
+          <w:left w:val="single" w:color="C6CDD8" w:sz="3" w:space="0"/>
+          <w:bottom w:val="single" w:color="C6CDD8" w:sz="3" w:space="0"/>
+          <w:right w:val="single" w:color="C6CDD8" w:sz="3" w:space="0"/>
+          <w:insideH w:val="single" w:color="C6CDD8" w:sz="3" w:space="0"/>
+          <w:insideV w:val="single" w:color="C6CDD8" w:sz="3" w:space="0"/>
         </w:tblBorders>
         <w:tblLayout w:type="fixed"/>
         <w:tblCellMar>
@@ -12152,13 +12162,13 @@
       <w:pPr>
         <w:keepNext/>
         <w:pBdr>
-          <w:bottom w:val="single" w:sz="8" w:space="0" w:color="16324F"/>
+          <w:bottom w:val="single" w:color="16324F" w:sz="8" w:space="0"/>
         </w:pBdr>
         <w:spacing w:before="300" w:after="100" w:line="260" w:lineRule="auto"/>
       </w:pPr>
       <w:r>
         <w:rPr>
-          <w:rFonts w:ascii="Cambria" w:eastAsia="Cambria" w:hAnsi="Cambria" w:cs="Cambria"/>
+          <w:rFonts w:ascii="Cambria" w:hAnsi="Cambria" w:eastAsia="Cambria" w:cs="Cambria"/>
           <w:b/>
           <w:bCs/>
           <w:color w:val="2F5D8A"/>
@@ -12169,7 +12179,7 @@
       </w:r>
       <w:r>
         <w:rPr>
-          <w:rFonts w:ascii="Cambria" w:eastAsia="Cambria" w:hAnsi="Cambria" w:cs="Cambria"/>
+          <w:rFonts w:ascii="Cambria" w:hAnsi="Cambria" w:eastAsia="Cambria" w:cs="Cambria"/>
           <w:b/>
           <w:bCs/>
           <w:color w:val="16324F"/>
@@ -12196,12 +12206,12 @@
       <w:tblPr>
         <w:tblW w:w="10858" w:type="dxa"/>
         <w:tblBorders>
-          <w:top w:val="single" w:sz="3" w:space="0" w:color="C6CDD8"/>
-          <w:left w:val="single" w:sz="3" w:space="0" w:color="C6CDD8"/>
-          <w:bottom w:val="single" w:sz="3" w:space="0" w:color="C6CDD8"/>
-          <w:right w:val="single" w:sz="3" w:space="0" w:color="C6CDD8"/>
-          <w:insideH w:val="single" w:sz="3" w:space="0" w:color="C6CDD8"/>
-          <w:insideV w:val="single" w:sz="3" w:space="0" w:color="C6CDD8"/>
+          <w:top w:val="single" w:color="C6CDD8" w:sz="3" w:space="0"/>
+          <w:left w:val="single" w:color="C6CDD8" w:sz="3" w:space="0"/>
+          <w:bottom w:val="single" w:color="C6CDD8" w:sz="3" w:space="0"/>
+          <w:right w:val="single" w:color="C6CDD8" w:sz="3" w:space="0"/>
+          <w:insideH w:val="single" w:color="C6CDD8" w:sz="3" w:space="0"/>
+          <w:insideV w:val="single" w:color="C6CDD8" w:sz="3" w:space="0"/>
         </w:tblBorders>
         <w:tblLayout w:type="fixed"/>
         <w:tblCellMar>
@@ -12616,14 +12626,14 @@
     </w:tbl>
     <w:p>
       <w:pPr>
-        <w:pageBreakBefore/>
+        <w:pageBreakBefore w:val="1"/>
         <w:spacing w:line="260" w:lineRule="auto"/>
       </w:pPr>
     </w:p>
     <w:sectPr>
-      <w:headerReference w:type="default" r:id="rId23"/>
-      <w:footerReference w:type="default" r:id="rId24"/>
-      <w:pgSz w:w="12240" w:h="15840"/>
+      <w:headerReference w:type="default" r:id="rId24"/>
+      <w:footerReference w:type="default" r:id="rId25"/>
+      <w:pgSz w:w="12240" w:h="15840" w:orient="portrait"/>
       <w:pgMar w:top="900" w:right="900" w:bottom="900" w:left="900" w:header="500" w:footer="450" w:gutter="0"/>
       <w:cols w:space="720"/>
       <w:docGrid w:linePitch="360"/>
@@ -12699,19 +12709,8 @@
         <w:sz w:val="16"/>
         <w:szCs w:val="16"/>
       </w:rPr>
-      <w:t xml:space="preserve"> of 14</w:t>
+      <w:t xml:space="preserve"> of 13</w:t>
     </w:r>
-  </w:p>
-  <w:p>
-    <w:pPr>
-      <w:spacing w:before="58"/>
-      <w:rPr>
-        <w:noProof/>
-        <w:color w:val="5A6472"/>
-        <w:sz w:val="16"/>
-        <w:szCs w:val="16"/>
-      </w:rPr>
-    </w:pPr>
   </w:p>
 </w:ftr>
 </file>
@@ -12740,7 +12739,7 @@
   <w:p>
     <w:pPr>
       <w:pBdr>
-        <w:bottom w:val="single" w:sz="6" w:space="0" w:color="C6CDD8"/>
+        <w:bottom w:val="single" w:color="C6CDD8" w:sz="6" w:space="0"/>
       </w:pBdr>
       <w:spacing w:line="262" w:lineRule="auto"/>
     </w:pPr>
@@ -13243,7 +13242,7 @@
         <w:ind w:left="720" w:hanging="360"/>
       </w:pPr>
       <w:rPr>
-        <w:rFonts w:ascii="Aptos" w:hAnsi="Aptos" w:hint="default"/>
+        <w:rFonts w:hint="default" w:ascii="Aptos" w:hAnsi="Aptos"/>
       </w:rPr>
     </w:lvl>
     <w:lvl w:ilvl="1" w:tplc="BFF6DBA0">
@@ -13255,7 +13254,7 @@
         <w:ind w:left="1440" w:hanging="360"/>
       </w:pPr>
       <w:rPr>
-        <w:rFonts w:ascii="Courier New" w:hAnsi="Courier New" w:hint="default"/>
+        <w:rFonts w:hint="default" w:ascii="Courier New" w:hAnsi="Courier New"/>
       </w:rPr>
     </w:lvl>
     <w:lvl w:ilvl="2" w:tplc="33441928">
@@ -13267,7 +13266,7 @@
         <w:ind w:left="2160" w:hanging="360"/>
       </w:pPr>
       <w:rPr>
-        <w:rFonts w:ascii="Wingdings" w:hAnsi="Wingdings" w:hint="default"/>
+        <w:rFonts w:hint="default" w:ascii="Wingdings" w:hAnsi="Wingdings"/>
       </w:rPr>
     </w:lvl>
     <w:lvl w:ilvl="3" w:tplc="8752E530">
@@ -13279,7 +13278,7 @@
         <w:ind w:left="2880" w:hanging="360"/>
       </w:pPr>
       <w:rPr>
-        <w:rFonts w:ascii="Symbol" w:hAnsi="Symbol" w:hint="default"/>
+        <w:rFonts w:hint="default" w:ascii="Symbol" w:hAnsi="Symbol"/>
       </w:rPr>
     </w:lvl>
     <w:lvl w:ilvl="4" w:tplc="F83CCAF4">
@@ -13291,7 +13290,7 @@
         <w:ind w:left="3600" w:hanging="360"/>
       </w:pPr>
       <w:rPr>
-        <w:rFonts w:ascii="Courier New" w:hAnsi="Courier New" w:hint="default"/>
+        <w:rFonts w:hint="default" w:ascii="Courier New" w:hAnsi="Courier New"/>
       </w:rPr>
     </w:lvl>
     <w:lvl w:ilvl="5" w:tplc="6EC87EF4">
@@ -13303,7 +13302,7 @@
         <w:ind w:left="4320" w:hanging="360"/>
       </w:pPr>
       <w:rPr>
-        <w:rFonts w:ascii="Wingdings" w:hAnsi="Wingdings" w:hint="default"/>
+        <w:rFonts w:hint="default" w:ascii="Wingdings" w:hAnsi="Wingdings"/>
       </w:rPr>
     </w:lvl>
     <w:lvl w:ilvl="6" w:tplc="B5D8B16A">
@@ -13315,7 +13314,7 @@
         <w:ind w:left="5040" w:hanging="360"/>
       </w:pPr>
       <w:rPr>
-        <w:rFonts w:ascii="Symbol" w:hAnsi="Symbol" w:hint="default"/>
+        <w:rFonts w:hint="default" w:ascii="Symbol" w:hAnsi="Symbol"/>
       </w:rPr>
     </w:lvl>
     <w:lvl w:ilvl="7" w:tplc="CC0C8884">
@@ -13327,7 +13326,7 @@
         <w:ind w:left="5760" w:hanging="360"/>
       </w:pPr>
       <w:rPr>
-        <w:rFonts w:ascii="Courier New" w:hAnsi="Courier New" w:hint="default"/>
+        <w:rFonts w:hint="default" w:ascii="Courier New" w:hAnsi="Courier New"/>
       </w:rPr>
     </w:lvl>
     <w:lvl w:ilvl="8" w:tplc="B0F65CF2">
@@ -13339,7 +13338,7 @@
         <w:ind w:left="6480" w:hanging="360"/>
       </w:pPr>
       <w:rPr>
-        <w:rFonts w:ascii="Wingdings" w:hAnsi="Wingdings" w:hint="default"/>
+        <w:rFonts w:hint="default" w:ascii="Wingdings" w:hAnsi="Wingdings"/>
       </w:rPr>
     </w:lvl>
   </w:abstractNum>
@@ -13528,7 +13527,7 @@
         <w:ind w:left="720" w:hanging="360"/>
       </w:pPr>
       <w:rPr>
-        <w:rFonts w:ascii="Aptos" w:hAnsi="Aptos" w:hint="default"/>
+        <w:rFonts w:hint="default" w:ascii="Aptos" w:hAnsi="Aptos"/>
       </w:rPr>
     </w:lvl>
     <w:lvl w:ilvl="1" w:tplc="F9527BDC">
@@ -13540,7 +13539,7 @@
         <w:ind w:left="1440" w:hanging="360"/>
       </w:pPr>
       <w:rPr>
-        <w:rFonts w:ascii="Courier New" w:hAnsi="Courier New" w:hint="default"/>
+        <w:rFonts w:hint="default" w:ascii="Courier New" w:hAnsi="Courier New"/>
       </w:rPr>
     </w:lvl>
     <w:lvl w:ilvl="2" w:tplc="2EF24ADA">
@@ -13552,7 +13551,7 @@
         <w:ind w:left="2160" w:hanging="360"/>
       </w:pPr>
       <w:rPr>
-        <w:rFonts w:ascii="Wingdings" w:hAnsi="Wingdings" w:hint="default"/>
+        <w:rFonts w:hint="default" w:ascii="Wingdings" w:hAnsi="Wingdings"/>
       </w:rPr>
     </w:lvl>
     <w:lvl w:ilvl="3" w:tplc="2110B294">
@@ -13564,7 +13563,7 @@
         <w:ind w:left="2880" w:hanging="360"/>
       </w:pPr>
       <w:rPr>
-        <w:rFonts w:ascii="Symbol" w:hAnsi="Symbol" w:hint="default"/>
+        <w:rFonts w:hint="default" w:ascii="Symbol" w:hAnsi="Symbol"/>
       </w:rPr>
     </w:lvl>
     <w:lvl w:ilvl="4" w:tplc="787A4BBC">
@@ -13576,7 +13575,7 @@
         <w:ind w:left="3600" w:hanging="360"/>
       </w:pPr>
       <w:rPr>
-        <w:rFonts w:ascii="Courier New" w:hAnsi="Courier New" w:hint="default"/>
+        <w:rFonts w:hint="default" w:ascii="Courier New" w:hAnsi="Courier New"/>
       </w:rPr>
     </w:lvl>
     <w:lvl w:ilvl="5" w:tplc="ECAE9368">
@@ -13588,7 +13587,7 @@
         <w:ind w:left="4320" w:hanging="360"/>
       </w:pPr>
       <w:rPr>
-        <w:rFonts w:ascii="Wingdings" w:hAnsi="Wingdings" w:hint="default"/>
+        <w:rFonts w:hint="default" w:ascii="Wingdings" w:hAnsi="Wingdings"/>
       </w:rPr>
     </w:lvl>
     <w:lvl w:ilvl="6" w:tplc="7DB650C0">
@@ -13600,7 +13599,7 @@
         <w:ind w:left="5040" w:hanging="360"/>
       </w:pPr>
       <w:rPr>
-        <w:rFonts w:ascii="Symbol" w:hAnsi="Symbol" w:hint="default"/>
+        <w:rFonts w:hint="default" w:ascii="Symbol" w:hAnsi="Symbol"/>
       </w:rPr>
     </w:lvl>
     <w:lvl w:ilvl="7" w:tplc="3AB46E52">
@@ -13612,7 +13611,7 @@
         <w:ind w:left="5760" w:hanging="360"/>
       </w:pPr>
       <w:rPr>
-        <w:rFonts w:ascii="Courier New" w:hAnsi="Courier New" w:hint="default"/>
+        <w:rFonts w:hint="default" w:ascii="Courier New" w:hAnsi="Courier New"/>
       </w:rPr>
     </w:lvl>
     <w:lvl w:ilvl="8" w:tplc="A0E294D4">
@@ -13624,7 +13623,7 @@
         <w:ind w:left="6480" w:hanging="360"/>
       </w:pPr>
       <w:rPr>
-        <w:rFonts w:ascii="Wingdings" w:hAnsi="Wingdings" w:hint="default"/>
+        <w:rFonts w:hint="default" w:ascii="Wingdings" w:hAnsi="Wingdings"/>
       </w:rPr>
     </w:lvl>
   </w:abstractNum>
@@ -13755,7 +13754,7 @@
   <w:docDefaults>
     <w:rPrDefault>
       <w:rPr>
-        <w:rFonts w:ascii="Calibri" w:eastAsia="Calibri" w:hAnsi="Calibri" w:cs="Calibri"/>
+        <w:rFonts w:ascii="Calibri" w:hAnsi="Calibri" w:eastAsia="Calibri" w:cs="Calibri"/>
         <w:sz w:val="21"/>
         <w:szCs w:val="21"/>
         <w:lang w:val="en-US" w:eastAsia="en-US" w:bidi="ar-SA"/>
@@ -13766,14 +13765,14 @@
   <w:latentStyles w:defLockedState="0" w:defUIPriority="99" w:defSemiHidden="0" w:defUnhideWhenUsed="0" w:defQFormat="0" w:count="376">
     <w:lsdException w:name="Normal" w:uiPriority="0" w:qFormat="1"/>
     <w:lsdException w:name="heading 1" w:uiPriority="9" w:qFormat="1"/>
-    <w:lsdException w:name="heading 2" w:semiHidden="1" w:uiPriority="9" w:unhideWhenUsed="1" w:qFormat="1"/>
-    <w:lsdException w:name="heading 3" w:semiHidden="1" w:uiPriority="9" w:unhideWhenUsed="1" w:qFormat="1"/>
-    <w:lsdException w:name="heading 4" w:semiHidden="1" w:uiPriority="9" w:unhideWhenUsed="1" w:qFormat="1"/>
-    <w:lsdException w:name="heading 5" w:semiHidden="1" w:uiPriority="9" w:unhideWhenUsed="1" w:qFormat="1"/>
-    <w:lsdException w:name="heading 6" w:semiHidden="1" w:uiPriority="9" w:unhideWhenUsed="1" w:qFormat="1"/>
-    <w:lsdException w:name="heading 7" w:semiHidden="1" w:uiPriority="9" w:unhideWhenUsed="1" w:qFormat="1"/>
-    <w:lsdException w:name="heading 8" w:semiHidden="1" w:uiPriority="9" w:unhideWhenUsed="1" w:qFormat="1"/>
-    <w:lsdException w:name="heading 9" w:semiHidden="1" w:uiPriority="9" w:unhideWhenUsed="1" w:qFormat="1"/>
+    <w:lsdException w:name="heading 2" w:uiPriority="9" w:semiHidden="1" w:unhideWhenUsed="1" w:qFormat="1"/>
+    <w:lsdException w:name="heading 3" w:uiPriority="9" w:semiHidden="1" w:unhideWhenUsed="1" w:qFormat="1"/>
+    <w:lsdException w:name="heading 4" w:uiPriority="9" w:semiHidden="1" w:unhideWhenUsed="1" w:qFormat="1"/>
+    <w:lsdException w:name="heading 5" w:uiPriority="9" w:semiHidden="1" w:unhideWhenUsed="1" w:qFormat="1"/>
+    <w:lsdException w:name="heading 6" w:uiPriority="9" w:semiHidden="1" w:unhideWhenUsed="1" w:qFormat="1"/>
+    <w:lsdException w:name="heading 7" w:uiPriority="9" w:semiHidden="1" w:unhideWhenUsed="1" w:qFormat="1"/>
+    <w:lsdException w:name="heading 8" w:uiPriority="9" w:semiHidden="1" w:unhideWhenUsed="1" w:qFormat="1"/>
+    <w:lsdException w:name="heading 9" w:uiPriority="9" w:semiHidden="1" w:unhideWhenUsed="1" w:qFormat="1"/>
     <w:lsdException w:name="index 1" w:semiHidden="1" w:unhideWhenUsed="1"/>
     <w:lsdException w:name="index 2" w:semiHidden="1" w:unhideWhenUsed="1"/>
     <w:lsdException w:name="index 3" w:semiHidden="1" w:unhideWhenUsed="1"/>
@@ -13783,22 +13782,22 @@
     <w:lsdException w:name="index 7" w:semiHidden="1" w:unhideWhenUsed="1"/>
     <w:lsdException w:name="index 8" w:semiHidden="1" w:unhideWhenUsed="1"/>
     <w:lsdException w:name="index 9" w:semiHidden="1" w:unhideWhenUsed="1"/>
-    <w:lsdException w:name="toc 1" w:semiHidden="1" w:uiPriority="39" w:unhideWhenUsed="1"/>
-    <w:lsdException w:name="toc 2" w:semiHidden="1" w:uiPriority="39" w:unhideWhenUsed="1"/>
-    <w:lsdException w:name="toc 3" w:semiHidden="1" w:uiPriority="39" w:unhideWhenUsed="1"/>
-    <w:lsdException w:name="toc 4" w:semiHidden="1" w:uiPriority="39" w:unhideWhenUsed="1"/>
-    <w:lsdException w:name="toc 5" w:semiHidden="1" w:uiPriority="39" w:unhideWhenUsed="1"/>
-    <w:lsdException w:name="toc 6" w:semiHidden="1" w:uiPriority="39" w:unhideWhenUsed="1"/>
-    <w:lsdException w:name="toc 7" w:semiHidden="1" w:uiPriority="39" w:unhideWhenUsed="1"/>
-    <w:lsdException w:name="toc 8" w:semiHidden="1" w:uiPriority="39" w:unhideWhenUsed="1"/>
-    <w:lsdException w:name="toc 9" w:semiHidden="1" w:uiPriority="39" w:unhideWhenUsed="1"/>
+    <w:lsdException w:name="toc 1" w:uiPriority="39" w:semiHidden="1" w:unhideWhenUsed="1"/>
+    <w:lsdException w:name="toc 2" w:uiPriority="39" w:semiHidden="1" w:unhideWhenUsed="1"/>
+    <w:lsdException w:name="toc 3" w:uiPriority="39" w:semiHidden="1" w:unhideWhenUsed="1"/>
+    <w:lsdException w:name="toc 4" w:uiPriority="39" w:semiHidden="1" w:unhideWhenUsed="1"/>
+    <w:lsdException w:name="toc 5" w:uiPriority="39" w:semiHidden="1" w:unhideWhenUsed="1"/>
+    <w:lsdException w:name="toc 6" w:uiPriority="39" w:semiHidden="1" w:unhideWhenUsed="1"/>
+    <w:lsdException w:name="toc 7" w:uiPriority="39" w:semiHidden="1" w:unhideWhenUsed="1"/>
+    <w:lsdException w:name="toc 8" w:uiPriority="39" w:semiHidden="1" w:unhideWhenUsed="1"/>
+    <w:lsdException w:name="toc 9" w:uiPriority="39" w:semiHidden="1" w:unhideWhenUsed="1"/>
     <w:lsdException w:name="Normal Indent" w:semiHidden="1" w:unhideWhenUsed="1"/>
     <w:lsdException w:name="footnote text" w:semiHidden="1" w:unhideWhenUsed="1"/>
     <w:lsdException w:name="annotation text" w:semiHidden="1" w:unhideWhenUsed="1"/>
     <w:lsdException w:name="header" w:semiHidden="1" w:unhideWhenUsed="1"/>
     <w:lsdException w:name="footer" w:semiHidden="1" w:unhideWhenUsed="1"/>
     <w:lsdException w:name="index heading" w:semiHidden="1" w:unhideWhenUsed="1"/>
-    <w:lsdException w:name="caption" w:semiHidden="1" w:uiPriority="35" w:unhideWhenUsed="1" w:qFormat="1"/>
+    <w:lsdException w:name="caption" w:uiPriority="35" w:semiHidden="1" w:unhideWhenUsed="1" w:qFormat="1"/>
     <w:lsdException w:name="table of figures" w:semiHidden="1" w:unhideWhenUsed="1"/>
     <w:lsdException w:name="envelope address" w:semiHidden="1" w:unhideWhenUsed="1"/>
     <w:lsdException w:name="envelope return" w:semiHidden="1" w:unhideWhenUsed="1"/>
@@ -13829,7 +13828,7 @@
     <w:lsdException w:name="Title" w:uiPriority="10" w:qFormat="1"/>
     <w:lsdException w:name="Closing" w:semiHidden="1" w:unhideWhenUsed="1"/>
     <w:lsdException w:name="Signature" w:semiHidden="1" w:unhideWhenUsed="1"/>
-    <w:lsdException w:name="Default Paragraph Font" w:semiHidden="1" w:uiPriority="1" w:unhideWhenUsed="1"/>
+    <w:lsdException w:name="Default Paragraph Font" w:uiPriority="1" w:semiHidden="1" w:unhideWhenUsed="1"/>
     <w:lsdException w:name="Body Text" w:semiHidden="1" w:unhideWhenUsed="1"/>
     <w:lsdException w:name="Body Text Indent" w:semiHidden="1" w:unhideWhenUsed="1"/>
     <w:lsdException w:name="List Continue" w:semiHidden="1" w:unhideWhenUsed="1"/>
@@ -14029,8 +14028,8 @@
     <w:lsdException w:name="Subtle Reference" w:uiPriority="31" w:qFormat="1"/>
     <w:lsdException w:name="Intense Reference" w:uiPriority="32" w:qFormat="1"/>
     <w:lsdException w:name="Book Title" w:uiPriority="33" w:qFormat="1"/>
-    <w:lsdException w:name="Bibliography" w:semiHidden="1" w:uiPriority="37" w:unhideWhenUsed="1"/>
-    <w:lsdException w:name="TOC Heading" w:semiHidden="1" w:uiPriority="39" w:unhideWhenUsed="1" w:qFormat="1"/>
+    <w:lsdException w:name="Bibliography" w:uiPriority="37" w:semiHidden="1" w:unhideWhenUsed="1"/>
+    <w:lsdException w:name="TOC Heading" w:uiPriority="39" w:semiHidden="1" w:unhideWhenUsed="1" w:qFormat="1"/>
     <w:lsdException w:name="Plain Table 1" w:uiPriority="41"/>
     <w:lsdException w:name="Plain Table 2" w:uiPriority="42"/>
     <w:lsdException w:name="Plain Table 3" w:uiPriority="43"/>
@@ -14141,7 +14140,7 @@
     <w:lsdException w:name="Unresolved Mention" w:semiHidden="1" w:unhideWhenUsed="1"/>
     <w:lsdException w:name="Smart Link" w:semiHidden="1" w:unhideWhenUsed="1"/>
   </w:latentStyles>
-  <w:style w:type="paragraph" w:default="1" w:styleId="Normal">
+  <w:style w:type="paragraph" w:styleId="Normal" w:default="1">
     <w:name w:val="Normal"/>
     <w:qFormat/>
   </w:style>
@@ -14229,13 +14228,13 @@
       <w:color w:val="1F4D78"/>
     </w:rPr>
   </w:style>
-  <w:style w:type="character" w:default="1" w:styleId="DefaultParagraphFont">
+  <w:style w:type="character" w:styleId="DefaultParagraphFont" w:default="1">
     <w:name w:val="Default Paragraph Font"/>
     <w:uiPriority w:val="1"/>
     <w:semiHidden/>
     <w:unhideWhenUsed/>
   </w:style>
-  <w:style w:type="table" w:default="1" w:styleId="TableNormal">
+  <w:style w:type="table" w:styleId="TableNormal" w:default="1">
     <w:name w:val="Normal Table"/>
     <w:uiPriority w:val="99"/>
     <w:semiHidden/>
@@ -14250,7 +14249,7 @@
       </w:tblCellMar>
     </w:tblPr>
   </w:style>
-  <w:style w:type="numbering" w:default="1" w:styleId="NoList">
+  <w:style w:type="numbering" w:styleId="NoList" w:default="1">
     <w:name w:val="No List"/>
     <w:uiPriority w:val="99"/>
     <w:semiHidden/>
@@ -14265,7 +14264,7 @@
       <w:szCs w:val="56"/>
     </w:rPr>
   </w:style>
-  <w:style w:type="paragraph" w:customStyle="1" w:styleId="Strong1">
+  <w:style w:type="paragraph" w:styleId="Strong1" w:customStyle="1">
     <w:name w:val="Strong1"/>
     <w:qFormat/>
     <w:rPr>
@@ -14306,7 +14305,7 @@
       <w:szCs w:val="20"/>
     </w:rPr>
   </w:style>
-  <w:style w:type="character" w:customStyle="1" w:styleId="FootnoteTextChar">
+  <w:style w:type="character" w:styleId="FootnoteTextChar" w:customStyle="1">
     <w:name w:val="Footnote Text Char"/>
     <w:link w:val="FootnoteText"/>
     <w:uiPriority w:val="99"/>
@@ -14337,7 +14336,7 @@
       <w:szCs w:val="20"/>
     </w:rPr>
   </w:style>
-  <w:style w:type="character" w:customStyle="1" w:styleId="EndnoteTextChar">
+  <w:style w:type="character" w:styleId="EndnoteTextChar" w:customStyle="1">
     <w:name w:val="Endnote Text Char"/>
     <w:link w:val="EndnoteText"/>
     <w:uiPriority w:val="99"/>
@@ -14363,7 +14362,7 @@
       </w:tabs>
     </w:pPr>
   </w:style>
-  <w:style w:type="character" w:customStyle="1" w:styleId="HeaderChar">
+  <w:style w:type="character" w:styleId="HeaderChar" w:customStyle="1">
     <w:name w:val="Header Char"/>
     <w:basedOn w:val="DefaultParagraphFont"/>
     <w:link w:val="Header"/>
@@ -14386,7 +14385,7 @@
       </w:tabs>
     </w:pPr>
   </w:style>
-  <w:style w:type="character" w:customStyle="1" w:styleId="FooterChar">
+  <w:style w:type="character" w:styleId="FooterChar" w:customStyle="1">
     <w:name w:val="Footer Char"/>
     <w:basedOn w:val="DefaultParagraphFont"/>
     <w:link w:val="Footer"/>
@@ -14413,12 +14412,12 @@
     <w:rsid w:val="00FB4123"/>
     <w:tblPr>
       <w:tblBorders>
-        <w:top w:val="single" w:sz="4" w:space="0" w:color="000000" w:themeColor="text1"/>
-        <w:left w:val="single" w:sz="4" w:space="0" w:color="000000" w:themeColor="text1"/>
-        <w:bottom w:val="single" w:sz="4" w:space="0" w:color="000000" w:themeColor="text1"/>
-        <w:right w:val="single" w:sz="4" w:space="0" w:color="000000" w:themeColor="text1"/>
-        <w:insideH w:val="single" w:sz="4" w:space="0" w:color="000000" w:themeColor="text1"/>
-        <w:insideV w:val="single" w:sz="4" w:space="0" w:color="000000" w:themeColor="text1"/>
+        <w:top w:val="single" w:color="000000" w:themeColor="text1" w:sz="4" w:space="0"/>
+        <w:left w:val="single" w:color="000000" w:themeColor="text1" w:sz="4" w:space="0"/>
+        <w:bottom w:val="single" w:color="000000" w:themeColor="text1" w:sz="4" w:space="0"/>
+        <w:right w:val="single" w:color="000000" w:themeColor="text1" w:sz="4" w:space="0"/>
+        <w:insideH w:val="single" w:color="000000" w:themeColor="text1" w:sz="4" w:space="0"/>
+        <w:insideV w:val="single" w:color="000000" w:themeColor="text1" w:sz="4" w:space="0"/>
       </w:tblBorders>
     </w:tblPr>
   </w:style>
@@ -14426,7 +14425,7 @@
 </file>
 
 <file path=word/theme/theme1.xml><?xml version="1.0" encoding="utf-8"?>
-<a:theme xmlns:a="http://schemas.openxmlformats.org/drawingml/2006/main" name="Office Theme">
+<a:theme xmlns:a="http://schemas.openxmlformats.org/drawingml/2006/main" xmlns:thm15="http://schemas.microsoft.com/office/thememl/2012/main" name="Office Theme">
   <a:themeElements>
     <a:clrScheme name="Office">
       <a:dk1>

</xml_diff>